<commit_message>
Add live SQLite dashboard and fix review issues
Adds the live repository dashboard (overview, zones, analytics, data,
forecast, controls), its tests and assets, and fixes issues found in review:

- Show sensor_data readings alongside zone telemetry instead of hiding them
- Fix Zones detail crash for zones without telemetry
- Correct inverted low-temperature forecast risk
- Seed all configured zones from ZONE_PROFILES
- Skip redelivered MQTT messages; store alert state matching the alert flag
- Resend a message after the publisher reconnects
- Label times in the correct time zone; consistent zone status
- Remove unused code, add pytest.ini, update run guides

Co-Authored-By: Claude Opus 5.5 <noreply@anthropic.com>
</commit_message>
<xml_diff>
--- a/jerrydfirstdelivery_finalProject.docx
+++ b/jerrydfirstdelivery_finalProject.docx
@@ -5,6 +5,7 @@
     <w:sdt>
       <w:sdtPr>
         <w:rPr>
+          <w:rFonts w:ascii="Times New Roman" w:hAnsi="Times New Roman" w:cs="Times New Roman"/>
           <w:color w:val="4F81BD" w:themeColor="accent1"/>
         </w:rPr>
         <w:id w:val="958927839"/>
@@ -15,7 +16,6 @@
       </w:sdtPr>
       <w:sdtEndPr>
         <w:rPr>
-          <w:rFonts w:ascii="Times New Roman" w:hAnsi="Times New Roman" w:cs="Times New Roman"/>
           <w:color w:val="auto"/>
           <w:sz w:val="24"/>
           <w:szCs w:val="24"/>
@@ -24,6 +24,9 @@
       <w:sdtContent>
         <w:sdt>
           <w:sdtPr>
+            <w:rPr>
+              <w:rFonts w:ascii="Times New Roman" w:hAnsi="Times New Roman" w:cs="Times New Roman"/>
+            </w:rPr>
             <w:id w:val="10082672"/>
             <w:docPartObj>
               <w:docPartGallery w:val="Cover Pages"/>
@@ -32,7 +35,7 @@
           </w:sdtPr>
           <w:sdtEndPr>
             <w:rPr>
-              <w:rFonts w:ascii="Times New Roman" w:eastAsia="Times New Roman" w:hAnsi="Times New Roman" w:cs="Times New Roman"/>
+              <w:rFonts w:eastAsia="Times New Roman"/>
               <w:color w:val="FF0000"/>
               <w:sz w:val="24"/>
               <w:szCs w:val="24"/>
@@ -457,16 +460,7 @@
                   <w:sz w:val="24"/>
                   <w:szCs w:val="24"/>
                 </w:rPr>
-                <w:t>, 202</w:t>
-              </w:r>
-              <w:r>
-                <w:rPr>
-                  <w:rFonts w:ascii="Times New Roman" w:hAnsi="Times New Roman" w:cs="Times New Roman"/>
-                  <w:b/>
-                  <w:sz w:val="24"/>
-                  <w:szCs w:val="24"/>
-                </w:rPr>
-                <w:t>6</w:t>
+                <w:t>, 2026</w:t>
               </w:r>
             </w:p>
           </w:sdtContent>
@@ -526,14 +520,33 @@
           <w:szCs w:val="24"/>
         </w:rPr>
       </w:pPr>
-      <w:r>
-        <w:rPr>
-          <w:rFonts w:ascii="Times New Roman" w:hAnsi="Times New Roman" w:cs="Times New Roman"/>
-          <w:color w:val="auto"/>
-          <w:sz w:val="24"/>
-          <w:szCs w:val="24"/>
-        </w:rPr>
-        <w:t>GreenHouseWatch is a local IoT digital repository for simulated greenhouse monitoring. A Python sensor node produces temperature, humidity, soil-moisture and light readings. MQTT carries JSON messages through the HiveMQ public broker to a subscriber, which stores readings in SQLite. Matplotlib charts, CSV export and an optional Streamlit dashboard make the history available for review.</w:t>
+      <w:proofErr w:type="spellStart"/>
+      <w:r>
+        <w:rPr>
+          <w:rFonts w:ascii="Times New Roman" w:hAnsi="Times New Roman" w:cs="Times New Roman"/>
+        </w:rPr>
+        <w:t>GreenHouseWatch</w:t>
+      </w:r>
+      <w:proofErr w:type="spellEnd"/>
+      <w:r>
+        <w:rPr>
+          <w:rFonts w:ascii="Times New Roman" w:hAnsi="Times New Roman" w:cs="Times New Roman"/>
+        </w:rPr>
+        <w:t xml:space="preserve"> is a local IoT digital repository for greenhouse monitoring demonstrations. The simulator and MQTT publisher produce temperature, humidity, soil-moisture, light, nutrient-level and pH readings for crop-specific zones. The subscriber stores accepted messages in SQLite, while the </w:t>
+      </w:r>
+      <w:proofErr w:type="spellStart"/>
+      <w:r>
+        <w:rPr>
+          <w:rFonts w:ascii="Times New Roman" w:hAnsi="Times New Roman" w:cs="Times New Roman"/>
+        </w:rPr>
+        <w:t>Streamlit</w:t>
+      </w:r>
+      <w:proofErr w:type="spellEnd"/>
+      <w:r>
+        <w:rPr>
+          <w:rFonts w:ascii="Times New Roman" w:hAnsi="Times New Roman" w:cs="Times New Roman"/>
+        </w:rPr>
+        <w:t xml:space="preserve"> dashboard provides Overview, Zones, Analytics, Forecast, Controls and Data pages.</w:t>
       </w:r>
     </w:p>
     <w:p>
@@ -570,11 +583,8 @@
       <w:r>
         <w:rPr>
           <w:rFonts w:ascii="Times New Roman" w:hAnsi="Times New Roman" w:cs="Times New Roman"/>
-          <w:color w:val="auto"/>
-          <w:sz w:val="24"/>
-          <w:szCs w:val="24"/>
-        </w:rPr>
-        <w:t>The design addresses the need to retain environmental observations and identify out-of-range conditions without requiring a paid IoT platform. The chosen use case is a single virtual greenhouse node, GH-SENSOR-01. This educational prototype demonstrates monitoring and analysis; it does not measure a real greenhouse or control irrigation, heating or ventilation.</w:t>
+        </w:rPr>
+        <w:t>The design addresses the need to retain environmental observations and identify out-of-range conditions without requiring a paid IoT platform. The current use case is a multi-zone virtual greenhouse with crop-specific thresholds and device-health metadata. This educational prototype demonstrates monitoring and analysis; it does not claim physical greenhouse coverage or authorize irrigation hardware.</w:t>
       </w:r>
     </w:p>
     <w:p>
@@ -611,11 +621,22 @@
       <w:r>
         <w:rPr>
           <w:rFonts w:ascii="Times New Roman" w:hAnsi="Times New Roman" w:cs="Times New Roman"/>
-          <w:color w:val="auto"/>
-          <w:sz w:val="24"/>
-          <w:szCs w:val="24"/>
-        </w:rPr>
-        <w:t>The first delivery comprises the design proposal, architecture diagram, simulator and 20-record sample. This report also checks all later phases against the assignment. The required architecture and core functions are implemented, and the current valid dataset passes the local checks. Full final readiness is not established: malformed sensor values can cause a dashboard failure, supporting materials contain stale claims, and the final presentation/demo still must be delivered.</w:t>
+        </w:rPr>
+        <w:t xml:space="preserve">The repository now includes the design proposal, architecture diagram, simulator, MQTT pipeline, SQLite storage, visualizations and a live </w:t>
+      </w:r>
+      <w:proofErr w:type="spellStart"/>
+      <w:r>
+        <w:rPr>
+          <w:rFonts w:ascii="Times New Roman" w:hAnsi="Times New Roman" w:cs="Times New Roman"/>
+        </w:rPr>
+        <w:t>Streamlit</w:t>
+      </w:r>
+      <w:proofErr w:type="spellEnd"/>
+      <w:r>
+        <w:rPr>
+          <w:rFonts w:ascii="Times New Roman" w:hAnsi="Times New Roman" w:cs="Times New Roman"/>
+        </w:rPr>
+        <w:t xml:space="preserve"> dashboard. The dashboard reads the repository every five seconds, distinguishes fresh, stale, demo and simulated data, and exposes crop-specific targets. Input validation, alert normalization, forecast handling and page-level rendering are covered by the local test suite.</w:t>
       </w:r>
     </w:p>
     <w:p>
@@ -785,7 +806,27 @@
           <w:szCs w:val="24"/>
         </w:rPr>
         <w:lastRenderedPageBreak/>
-        <w:t>The publisher imports the simulator; the subscriber receives the same JSON schema and commits each accepted message. The repository remains local even though message transport uses an external public broker. Configuration is centralized in src/config.py.</w:t>
+        <w:t xml:space="preserve">The publisher imports the simulator; the subscriber receives the same JSON schema and commits each accepted message. The repository remains local even though message transport uses an external public broker. Configuration is centralized in </w:t>
+      </w:r>
+      <w:proofErr w:type="spellStart"/>
+      <w:r>
+        <w:rPr>
+          <w:rFonts w:ascii="Times New Roman" w:hAnsi="Times New Roman" w:cs="Times New Roman"/>
+          <w:color w:val="auto"/>
+          <w:sz w:val="24"/>
+          <w:szCs w:val="24"/>
+        </w:rPr>
+        <w:t>src</w:t>
+      </w:r>
+      <w:proofErr w:type="spellEnd"/>
+      <w:r>
+        <w:rPr>
+          <w:rFonts w:ascii="Times New Roman" w:hAnsi="Times New Roman" w:cs="Times New Roman"/>
+          <w:color w:val="auto"/>
+          <w:sz w:val="24"/>
+          <w:szCs w:val="24"/>
+        </w:rPr>
+        <w:t>/config.py.</w:t>
       </w:r>
     </w:p>
     <w:tbl>
@@ -1082,6 +1123,7 @@
                 <w:szCs w:val="24"/>
               </w:rPr>
             </w:pPr>
+            <w:proofErr w:type="spellStart"/>
             <w:r>
               <w:rPr>
                 <w:rFonts w:ascii="Times New Roman" w:hAnsi="Times New Roman" w:cs="Times New Roman"/>
@@ -1091,6 +1133,7 @@
               </w:rPr>
               <w:t>iso_time</w:t>
             </w:r>
+            <w:proofErr w:type="spellEnd"/>
           </w:p>
         </w:tc>
         <w:tc>
@@ -1165,6 +1208,7 @@
                 <w:szCs w:val="24"/>
               </w:rPr>
             </w:pPr>
+            <w:proofErr w:type="spellStart"/>
             <w:r>
               <w:rPr>
                 <w:rFonts w:ascii="Times New Roman" w:hAnsi="Times New Roman" w:cs="Times New Roman"/>
@@ -1174,6 +1218,7 @@
               </w:rPr>
               <w:t>device_id</w:t>
             </w:r>
+            <w:proofErr w:type="spellEnd"/>
           </w:p>
         </w:tc>
         <w:tc>
@@ -1248,6 +1293,7 @@
                 <w:szCs w:val="24"/>
               </w:rPr>
             </w:pPr>
+            <w:proofErr w:type="spellStart"/>
             <w:r>
               <w:rPr>
                 <w:rFonts w:ascii="Times New Roman" w:hAnsi="Times New Roman" w:cs="Times New Roman"/>
@@ -1257,6 +1303,7 @@
               </w:rPr>
               <w:t>temperature_c</w:t>
             </w:r>
+            <w:proofErr w:type="spellEnd"/>
           </w:p>
         </w:tc>
         <w:tc>
@@ -1307,7 +1354,27 @@
                 <w:sz w:val="24"/>
                 <w:szCs w:val="24"/>
               </w:rPr>
-              <w:t>Air temperature in degrees Celsius</w:t>
+              <w:t xml:space="preserve">Air temperature </w:t>
+            </w:r>
+            <w:proofErr w:type="gramStart"/>
+            <w:r>
+              <w:rPr>
+                <w:rFonts w:ascii="Times New Roman" w:hAnsi="Times New Roman" w:cs="Times New Roman"/>
+                <w:color w:val="auto"/>
+                <w:sz w:val="24"/>
+                <w:szCs w:val="24"/>
+              </w:rPr>
+              <w:t>in</w:t>
+            </w:r>
+            <w:proofErr w:type="gramEnd"/>
+            <w:r>
+              <w:rPr>
+                <w:rFonts w:ascii="Times New Roman" w:hAnsi="Times New Roman" w:cs="Times New Roman"/>
+                <w:color w:val="auto"/>
+                <w:sz w:val="24"/>
+                <w:szCs w:val="24"/>
+              </w:rPr>
+              <w:t xml:space="preserve"> degrees Celsius</w:t>
             </w:r>
           </w:p>
         </w:tc>
@@ -1331,6 +1398,7 @@
                 <w:szCs w:val="24"/>
               </w:rPr>
             </w:pPr>
+            <w:proofErr w:type="spellStart"/>
             <w:r>
               <w:rPr>
                 <w:rFonts w:ascii="Times New Roman" w:hAnsi="Times New Roman" w:cs="Times New Roman"/>
@@ -1340,6 +1408,7 @@
               </w:rPr>
               <w:t>humidity_pct</w:t>
             </w:r>
+            <w:proofErr w:type="spellEnd"/>
           </w:p>
         </w:tc>
         <w:tc>
@@ -1414,6 +1483,7 @@
                 <w:szCs w:val="24"/>
               </w:rPr>
             </w:pPr>
+            <w:proofErr w:type="spellStart"/>
             <w:r>
               <w:rPr>
                 <w:rFonts w:ascii="Times New Roman" w:hAnsi="Times New Roman" w:cs="Times New Roman"/>
@@ -1423,6 +1493,7 @@
               </w:rPr>
               <w:t>soil_moisture_pct</w:t>
             </w:r>
+            <w:proofErr w:type="spellEnd"/>
           </w:p>
         </w:tc>
         <w:tc>
@@ -1497,6 +1568,7 @@
                 <w:szCs w:val="24"/>
               </w:rPr>
             </w:pPr>
+            <w:proofErr w:type="spellStart"/>
             <w:r>
               <w:rPr>
                 <w:rFonts w:ascii="Times New Roman" w:hAnsi="Times New Roman" w:cs="Times New Roman"/>
@@ -1506,6 +1578,7 @@
               </w:rPr>
               <w:t>light_lux</w:t>
             </w:r>
+            <w:proofErr w:type="spellEnd"/>
           </w:p>
         </w:tc>
         <w:tc>
@@ -1580,6 +1653,7 @@
                 <w:szCs w:val="24"/>
               </w:rPr>
             </w:pPr>
+            <w:proofErr w:type="spellStart"/>
             <w:r>
               <w:rPr>
                 <w:rFonts w:ascii="Times New Roman" w:hAnsi="Times New Roman" w:cs="Times New Roman"/>
@@ -1589,6 +1663,7 @@
               </w:rPr>
               <w:t>alert_flag</w:t>
             </w:r>
+            <w:proofErr w:type="spellEnd"/>
           </w:p>
         </w:tc>
         <w:tc>
@@ -1663,6 +1738,7 @@
                 <w:szCs w:val="24"/>
               </w:rPr>
             </w:pPr>
+            <w:proofErr w:type="spellStart"/>
             <w:r>
               <w:rPr>
                 <w:rFonts w:ascii="Times New Roman" w:hAnsi="Times New Roman" w:cs="Times New Roman"/>
@@ -1672,6 +1748,7 @@
               </w:rPr>
               <w:t>alert_reason</w:t>
             </w:r>
+            <w:proofErr w:type="spellEnd"/>
           </w:p>
         </w:tc>
         <w:tc>
@@ -1727,6 +1804,238 @@
           </w:p>
         </w:tc>
       </w:tr>
+      <w:tr>
+        <w:tc>
+          <w:tcPr>
+            <w:tcW w:w="2800" w:type="dxa"/>
+          </w:tcPr>
+          <w:p>
+            <w:pPr>
+              <w:rPr>
+                <w:rFonts w:ascii="Times New Roman" w:hAnsi="Times New Roman" w:cs="Times New Roman"/>
+              </w:rPr>
+            </w:pPr>
+            <w:proofErr w:type="spellStart"/>
+            <w:r>
+              <w:rPr>
+                <w:rFonts w:ascii="Times New Roman" w:hAnsi="Times New Roman" w:cs="Times New Roman"/>
+              </w:rPr>
+              <w:t>nutrient_level</w:t>
+            </w:r>
+            <w:proofErr w:type="spellEnd"/>
+          </w:p>
+        </w:tc>
+        <w:tc>
+          <w:tcPr>
+            <w:tcW w:w="1700" w:type="dxa"/>
+          </w:tcPr>
+          <w:p>
+            <w:pPr>
+              <w:rPr>
+                <w:rFonts w:ascii="Times New Roman" w:hAnsi="Times New Roman" w:cs="Times New Roman"/>
+              </w:rPr>
+            </w:pPr>
+            <w:r>
+              <w:rPr>
+                <w:rFonts w:ascii="Times New Roman" w:hAnsi="Times New Roman" w:cs="Times New Roman"/>
+              </w:rPr>
+              <w:t>REAL</w:t>
+            </w:r>
+          </w:p>
+        </w:tc>
+        <w:tc>
+          <w:tcPr>
+            <w:tcW w:w="4860" w:type="dxa"/>
+          </w:tcPr>
+          <w:p>
+            <w:pPr>
+              <w:rPr>
+                <w:rFonts w:ascii="Times New Roman" w:hAnsi="Times New Roman" w:cs="Times New Roman"/>
+              </w:rPr>
+            </w:pPr>
+            <w:r>
+              <w:rPr>
+                <w:rFonts w:ascii="Times New Roman" w:hAnsi="Times New Roman" w:cs="Times New Roman"/>
+              </w:rPr>
+              <w:t>Optional nutrient level percentage</w:t>
+            </w:r>
+          </w:p>
+        </w:tc>
+      </w:tr>
+      <w:tr>
+        <w:tc>
+          <w:tcPr>
+            <w:tcW w:w="2800" w:type="dxa"/>
+          </w:tcPr>
+          <w:p>
+            <w:pPr>
+              <w:rPr>
+                <w:rFonts w:ascii="Times New Roman" w:hAnsi="Times New Roman" w:cs="Times New Roman"/>
+              </w:rPr>
+            </w:pPr>
+            <w:proofErr w:type="spellStart"/>
+            <w:r>
+              <w:rPr>
+                <w:rFonts w:ascii="Times New Roman" w:hAnsi="Times New Roman" w:cs="Times New Roman"/>
+              </w:rPr>
+              <w:t>ph_scale</w:t>
+            </w:r>
+            <w:proofErr w:type="spellEnd"/>
+          </w:p>
+        </w:tc>
+        <w:tc>
+          <w:tcPr>
+            <w:tcW w:w="1700" w:type="dxa"/>
+          </w:tcPr>
+          <w:p>
+            <w:pPr>
+              <w:rPr>
+                <w:rFonts w:ascii="Times New Roman" w:hAnsi="Times New Roman" w:cs="Times New Roman"/>
+              </w:rPr>
+            </w:pPr>
+            <w:r>
+              <w:rPr>
+                <w:rFonts w:ascii="Times New Roman" w:hAnsi="Times New Roman" w:cs="Times New Roman"/>
+              </w:rPr>
+              <w:t>REAL</w:t>
+            </w:r>
+          </w:p>
+        </w:tc>
+        <w:tc>
+          <w:tcPr>
+            <w:tcW w:w="4860" w:type="dxa"/>
+          </w:tcPr>
+          <w:p>
+            <w:pPr>
+              <w:rPr>
+                <w:rFonts w:ascii="Times New Roman" w:hAnsi="Times New Roman" w:cs="Times New Roman"/>
+              </w:rPr>
+            </w:pPr>
+            <w:r>
+              <w:rPr>
+                <w:rFonts w:ascii="Times New Roman" w:hAnsi="Times New Roman" w:cs="Times New Roman"/>
+              </w:rPr>
+              <w:t>Optional soil solution pH</w:t>
+            </w:r>
+          </w:p>
+        </w:tc>
+      </w:tr>
+      <w:tr>
+        <w:tc>
+          <w:tcPr>
+            <w:tcW w:w="2800" w:type="dxa"/>
+          </w:tcPr>
+          <w:p>
+            <w:pPr>
+              <w:rPr>
+                <w:rFonts w:ascii="Times New Roman" w:hAnsi="Times New Roman" w:cs="Times New Roman"/>
+              </w:rPr>
+            </w:pPr>
+            <w:proofErr w:type="spellStart"/>
+            <w:r>
+              <w:rPr>
+                <w:rFonts w:ascii="Times New Roman" w:hAnsi="Times New Roman" w:cs="Times New Roman"/>
+              </w:rPr>
+              <w:t>measured_at</w:t>
+            </w:r>
+            <w:proofErr w:type="spellEnd"/>
+          </w:p>
+        </w:tc>
+        <w:tc>
+          <w:tcPr>
+            <w:tcW w:w="1700" w:type="dxa"/>
+          </w:tcPr>
+          <w:p>
+            <w:pPr>
+              <w:rPr>
+                <w:rFonts w:ascii="Times New Roman" w:hAnsi="Times New Roman" w:cs="Times New Roman"/>
+              </w:rPr>
+            </w:pPr>
+            <w:r>
+              <w:rPr>
+                <w:rFonts w:ascii="Times New Roman" w:hAnsi="Times New Roman" w:cs="Times New Roman"/>
+              </w:rPr>
+              <w:t>TEXT</w:t>
+            </w:r>
+          </w:p>
+        </w:tc>
+        <w:tc>
+          <w:tcPr>
+            <w:tcW w:w="4860" w:type="dxa"/>
+          </w:tcPr>
+          <w:p>
+            <w:pPr>
+              <w:rPr>
+                <w:rFonts w:ascii="Times New Roman" w:hAnsi="Times New Roman" w:cs="Times New Roman"/>
+              </w:rPr>
+            </w:pPr>
+            <w:r>
+              <w:rPr>
+                <w:rFonts w:ascii="Times New Roman" w:hAnsi="Times New Roman" w:cs="Times New Roman"/>
+              </w:rPr>
+              <w:t>Sensor measurement time in UTC for zone telemetry</w:t>
+            </w:r>
+          </w:p>
+        </w:tc>
+      </w:tr>
+      <w:tr>
+        <w:tc>
+          <w:tcPr>
+            <w:tcW w:w="2800" w:type="dxa"/>
+          </w:tcPr>
+          <w:p>
+            <w:pPr>
+              <w:rPr>
+                <w:rFonts w:ascii="Times New Roman" w:hAnsi="Times New Roman" w:cs="Times New Roman"/>
+              </w:rPr>
+            </w:pPr>
+            <w:proofErr w:type="spellStart"/>
+            <w:r>
+              <w:rPr>
+                <w:rFonts w:ascii="Times New Roman" w:hAnsi="Times New Roman" w:cs="Times New Roman"/>
+              </w:rPr>
+              <w:t>received_at</w:t>
+            </w:r>
+            <w:proofErr w:type="spellEnd"/>
+          </w:p>
+        </w:tc>
+        <w:tc>
+          <w:tcPr>
+            <w:tcW w:w="1700" w:type="dxa"/>
+          </w:tcPr>
+          <w:p>
+            <w:pPr>
+              <w:rPr>
+                <w:rFonts w:ascii="Times New Roman" w:hAnsi="Times New Roman" w:cs="Times New Roman"/>
+              </w:rPr>
+            </w:pPr>
+            <w:r>
+              <w:rPr>
+                <w:rFonts w:ascii="Times New Roman" w:hAnsi="Times New Roman" w:cs="Times New Roman"/>
+              </w:rPr>
+              <w:t>TEXT</w:t>
+            </w:r>
+          </w:p>
+        </w:tc>
+        <w:tc>
+          <w:tcPr>
+            <w:tcW w:w="4860" w:type="dxa"/>
+          </w:tcPr>
+          <w:p>
+            <w:pPr>
+              <w:rPr>
+                <w:rFonts w:ascii="Times New Roman" w:hAnsi="Times New Roman" w:cs="Times New Roman"/>
+              </w:rPr>
+            </w:pPr>
+            <w:r>
+              <w:rPr>
+                <w:rFonts w:ascii="Times New Roman" w:hAnsi="Times New Roman" w:cs="Times New Roman"/>
+              </w:rPr>
+              <w:t>Subscriber receipt time in UTC for zone telemetry</w:t>
+            </w:r>
+          </w:p>
+        </w:tc>
+      </w:tr>
     </w:tbl>
     <w:p>
       <w:pPr>
@@ -1755,11 +2064,106 @@
       <w:r>
         <w:rPr>
           <w:rFonts w:ascii="Times New Roman" w:hAnsi="Times New Roman" w:cs="Times New Roman"/>
-          <w:color w:val="auto"/>
-          <w:sz w:val="24"/>
-          <w:szCs w:val="24"/>
-        </w:rPr>
-        <w:t>Schema source: src/db.py, table sensor_data. All fields except id and alert_reason have NOT NULL declarations; id is the primary key. SQLite type declarations alone do not enforce numeric sensor values.</w:t>
+        </w:rPr>
+        <w:t xml:space="preserve">Schema sources are src/db.py tables </w:t>
+      </w:r>
+      <w:proofErr w:type="spellStart"/>
+      <w:r>
+        <w:rPr>
+          <w:rFonts w:ascii="Times New Roman" w:hAnsi="Times New Roman" w:cs="Times New Roman"/>
+        </w:rPr>
+        <w:t>sensor_data</w:t>
+      </w:r>
+      <w:proofErr w:type="spellEnd"/>
+      <w:r>
+        <w:rPr>
+          <w:rFonts w:ascii="Times New Roman" w:hAnsi="Times New Roman" w:cs="Times New Roman"/>
+        </w:rPr>
+        <w:t xml:space="preserve"> and </w:t>
+      </w:r>
+      <w:proofErr w:type="spellStart"/>
+      <w:r>
+        <w:rPr>
+          <w:rFonts w:ascii="Times New Roman" w:hAnsi="Times New Roman" w:cs="Times New Roman"/>
+        </w:rPr>
+        <w:t>zone_telemetry</w:t>
+      </w:r>
+      <w:proofErr w:type="spellEnd"/>
+      <w:r>
+        <w:rPr>
+          <w:rFonts w:ascii="Times New Roman" w:hAnsi="Times New Roman" w:cs="Times New Roman"/>
+        </w:rPr>
+        <w:t xml:space="preserve">. Zone telemetry includes </w:t>
+      </w:r>
+      <w:proofErr w:type="spellStart"/>
+      <w:r>
+        <w:rPr>
+          <w:rFonts w:ascii="Times New Roman" w:hAnsi="Times New Roman" w:cs="Times New Roman"/>
+        </w:rPr>
+        <w:t>measured_at</w:t>
+      </w:r>
+      <w:proofErr w:type="spellEnd"/>
+      <w:r>
+        <w:rPr>
+          <w:rFonts w:ascii="Times New Roman" w:hAnsi="Times New Roman" w:cs="Times New Roman"/>
+        </w:rPr>
+        <w:t xml:space="preserve">, </w:t>
+      </w:r>
+      <w:proofErr w:type="spellStart"/>
+      <w:r>
+        <w:rPr>
+          <w:rFonts w:ascii="Times New Roman" w:hAnsi="Times New Roman" w:cs="Times New Roman"/>
+        </w:rPr>
+        <w:t>received_at</w:t>
+      </w:r>
+      <w:proofErr w:type="spellEnd"/>
+      <w:r>
+        <w:rPr>
+          <w:rFonts w:ascii="Times New Roman" w:hAnsi="Times New Roman" w:cs="Times New Roman"/>
+        </w:rPr>
+        <w:t xml:space="preserve">, crop-health fields, optional </w:t>
+      </w:r>
+      <w:proofErr w:type="spellStart"/>
+      <w:r>
+        <w:rPr>
+          <w:rFonts w:ascii="Times New Roman" w:hAnsi="Times New Roman" w:cs="Times New Roman"/>
+        </w:rPr>
+        <w:t>nutrient_level</w:t>
+      </w:r>
+      <w:proofErr w:type="spellEnd"/>
+      <w:r>
+        <w:rPr>
+          <w:rFonts w:ascii="Times New Roman" w:hAnsi="Times New Roman" w:cs="Times New Roman"/>
+        </w:rPr>
+        <w:t xml:space="preserve"> and </w:t>
+      </w:r>
+      <w:proofErr w:type="spellStart"/>
+      <w:r>
+        <w:rPr>
+          <w:rFonts w:ascii="Times New Roman" w:hAnsi="Times New Roman" w:cs="Times New Roman"/>
+        </w:rPr>
+        <w:t>ph_scale</w:t>
+      </w:r>
+      <w:proofErr w:type="spellEnd"/>
+      <w:r>
+        <w:rPr>
+          <w:rFonts w:ascii="Times New Roman" w:hAnsi="Times New Roman" w:cs="Times New Roman"/>
+        </w:rPr>
+        <w:t xml:space="preserve">, and alert metadata. SQLite type declarations alone do not enforce numeric sensor values; subscriber validation and write-time alert normalization provide </w:t>
+      </w:r>
+      <w:proofErr w:type="gramStart"/>
+      <w:r>
+        <w:rPr>
+          <w:rFonts w:ascii="Times New Roman" w:hAnsi="Times New Roman" w:cs="Times New Roman"/>
+        </w:rPr>
+        <w:t>the application</w:t>
+      </w:r>
+      <w:proofErr w:type="gramEnd"/>
+      <w:r>
+        <w:rPr>
+          <w:rFonts w:ascii="Times New Roman" w:hAnsi="Times New Roman" w:cs="Times New Roman"/>
+        </w:rPr>
+        <w:t>-level checks.</w:t>
       </w:r>
     </w:p>
     <w:p>
@@ -1776,11 +2180,8 @@
       <w:r>
         <w:rPr>
           <w:rFonts w:ascii="Times New Roman" w:hAnsi="Times New Roman" w:cs="Times New Roman"/>
-          <w:color w:val="auto"/>
-          <w:sz w:val="24"/>
-          <w:szCs w:val="24"/>
-        </w:rPr>
-        <w:t>Project alert thresholds: temperature below 16 or above 32 degrees C; humidity below 40% or above 80%; soil moisture below 30%. Boundary values are accepted. These are demonstration thresholds, not crop-specific recommendations. Light is recorded but does not trigger an alert.</w:t>
+        </w:rPr>
+        <w:t>Global fallback thresholds are temperature 16-32 degrees C, humidity 40-80% and soil moisture at least 30%. Zone telemetry uses crop-specific configured targets. Boundary values are accepted; light is recorded but does not trigger an alert. Nutrient level and pH are stored as optional telemetry and displayed with target bands.</w:t>
       </w:r>
     </w:p>
     <w:p>
@@ -1801,7 +2202,67 @@
           <w:sz w:val="24"/>
           <w:szCs w:val="24"/>
         </w:rPr>
-        <w:t>Free toolchain: Python, paho-mqtt, HiveMQ public broker, SQLite, Matplotlib and optional Streamlit/pandas. CSV can be opened in a spreadsheet, but no paid spreadsheet software is needed.</w:t>
+        <w:t>Free toolchain: Python, paho-</w:t>
+      </w:r>
+      <w:proofErr w:type="spellStart"/>
+      <w:r>
+        <w:rPr>
+          <w:rFonts w:ascii="Times New Roman" w:hAnsi="Times New Roman" w:cs="Times New Roman"/>
+          <w:color w:val="auto"/>
+          <w:sz w:val="24"/>
+          <w:szCs w:val="24"/>
+        </w:rPr>
+        <w:t>mqtt</w:t>
+      </w:r>
+      <w:proofErr w:type="spellEnd"/>
+      <w:r>
+        <w:rPr>
+          <w:rFonts w:ascii="Times New Roman" w:hAnsi="Times New Roman" w:cs="Times New Roman"/>
+          <w:color w:val="auto"/>
+          <w:sz w:val="24"/>
+          <w:szCs w:val="24"/>
+        </w:rPr>
+        <w:t xml:space="preserve">, </w:t>
+      </w:r>
+      <w:proofErr w:type="spellStart"/>
+      <w:r>
+        <w:rPr>
+          <w:rFonts w:ascii="Times New Roman" w:hAnsi="Times New Roman" w:cs="Times New Roman"/>
+          <w:color w:val="auto"/>
+          <w:sz w:val="24"/>
+          <w:szCs w:val="24"/>
+        </w:rPr>
+        <w:t>HiveMQ</w:t>
+      </w:r>
+      <w:proofErr w:type="spellEnd"/>
+      <w:r>
+        <w:rPr>
+          <w:rFonts w:ascii="Times New Roman" w:hAnsi="Times New Roman" w:cs="Times New Roman"/>
+          <w:color w:val="auto"/>
+          <w:sz w:val="24"/>
+          <w:szCs w:val="24"/>
+        </w:rPr>
+        <w:t xml:space="preserve"> public broker, SQLite, Matplotlib and optional </w:t>
+      </w:r>
+      <w:proofErr w:type="spellStart"/>
+      <w:r>
+        <w:rPr>
+          <w:rFonts w:ascii="Times New Roman" w:hAnsi="Times New Roman" w:cs="Times New Roman"/>
+          <w:color w:val="auto"/>
+          <w:sz w:val="24"/>
+          <w:szCs w:val="24"/>
+        </w:rPr>
+        <w:t>Streamlit</w:t>
+      </w:r>
+      <w:proofErr w:type="spellEnd"/>
+      <w:r>
+        <w:rPr>
+          <w:rFonts w:ascii="Times New Roman" w:hAnsi="Times New Roman" w:cs="Times New Roman"/>
+          <w:color w:val="auto"/>
+          <w:sz w:val="24"/>
+          <w:szCs w:val="24"/>
+        </w:rPr>
+        <w:t>/pandas. CSV can be opened in a spreadsheet, but no paid spreadsheet software is needed.</w:t>
       </w:r>
     </w:p>
     <w:p>
@@ -1861,11 +2322,22 @@
       <w:r>
         <w:rPr>
           <w:rFonts w:ascii="Times New Roman" w:hAnsi="Times New Roman" w:cs="Times New Roman"/>
-          <w:color w:val="auto"/>
-          <w:sz w:val="24"/>
-          <w:szCs w:val="24"/>
-        </w:rPr>
-        <w:t>src/simulator.py generates JSON records with UTC timestamps, a device identifier, four measurements and alert metadata. The default live interval is two seconds. The command-line options control count and interval; --once prints one record.</w:t>
+        </w:rPr>
+        <w:t xml:space="preserve">src/simulator.py generates JSON records with UTC timestamps, a device identifier, temperature, humidity, soil moisture, light, nutrient level, pH and alert metadata. The default live interval is two seconds. Zone publishers attach </w:t>
+      </w:r>
+      <w:proofErr w:type="gramStart"/>
+      <w:r>
+        <w:rPr>
+          <w:rFonts w:ascii="Times New Roman" w:hAnsi="Times New Roman" w:cs="Times New Roman"/>
+        </w:rPr>
+        <w:t>crop</w:t>
+      </w:r>
+      <w:proofErr w:type="gramEnd"/>
+      <w:r>
+        <w:rPr>
+          <w:rFonts w:ascii="Times New Roman" w:hAnsi="Times New Roman" w:cs="Times New Roman"/>
+        </w:rPr>
+        <w:t xml:space="preserve"> and device-health metadata; command-line options control count, interval and zone.</w:t>
       </w:r>
     </w:p>
     <w:p>
@@ -1901,14 +2373,105 @@
           <w:szCs w:val="24"/>
         </w:rPr>
       </w:pPr>
-      <w:r>
-        <w:rPr>
-          <w:rFonts w:ascii="Times New Roman" w:hAnsi="Times New Roman" w:cs="Times New Roman"/>
-          <w:color w:val="auto"/>
-          <w:sz w:val="24"/>
-          <w:szCs w:val="24"/>
-        </w:rPr>
-        <w:t>generate_reading() models temperature and light with a solar curve and humidity with an inverse trend plus random variation. Live calls use soil moisture near the default 55% baseline. generate_series() adds soil dry-down, a mid-series irrigation recovery and injected anomalies. Those historical events are not automatically present in the live publisher. The implemented temperature curve does not include the two-hour lag claimed in a source comment.</w:t>
+      <w:proofErr w:type="spellStart"/>
+      <w:r>
+        <w:rPr>
+          <w:rFonts w:ascii="Times New Roman" w:hAnsi="Times New Roman" w:cs="Times New Roman"/>
+          <w:color w:val="auto"/>
+          <w:sz w:val="24"/>
+          <w:szCs w:val="24"/>
+        </w:rPr>
+        <w:t>generate_</w:t>
+      </w:r>
+      <w:proofErr w:type="gramStart"/>
+      <w:r>
+        <w:rPr>
+          <w:rFonts w:ascii="Times New Roman" w:hAnsi="Times New Roman" w:cs="Times New Roman"/>
+          <w:color w:val="auto"/>
+          <w:sz w:val="24"/>
+          <w:szCs w:val="24"/>
+        </w:rPr>
+        <w:t>reading</w:t>
+      </w:r>
+      <w:proofErr w:type="spellEnd"/>
+      <w:r>
+        <w:rPr>
+          <w:rFonts w:ascii="Times New Roman" w:hAnsi="Times New Roman" w:cs="Times New Roman"/>
+          <w:color w:val="auto"/>
+          <w:sz w:val="24"/>
+          <w:szCs w:val="24"/>
+        </w:rPr>
+        <w:t>(</w:t>
+      </w:r>
+      <w:proofErr w:type="gramEnd"/>
+      <w:r>
+        <w:rPr>
+          <w:rFonts w:ascii="Times New Roman" w:hAnsi="Times New Roman" w:cs="Times New Roman"/>
+          <w:color w:val="auto"/>
+          <w:sz w:val="24"/>
+          <w:szCs w:val="24"/>
+        </w:rPr>
+        <w:t xml:space="preserve">) </w:t>
+      </w:r>
+      <w:proofErr w:type="gramStart"/>
+      <w:r>
+        <w:rPr>
+          <w:rFonts w:ascii="Times New Roman" w:hAnsi="Times New Roman" w:cs="Times New Roman"/>
+          <w:color w:val="auto"/>
+          <w:sz w:val="24"/>
+          <w:szCs w:val="24"/>
+        </w:rPr>
+        <w:t>models</w:t>
+      </w:r>
+      <w:proofErr w:type="gramEnd"/>
+      <w:r>
+        <w:rPr>
+          <w:rFonts w:ascii="Times New Roman" w:hAnsi="Times New Roman" w:cs="Times New Roman"/>
+          <w:color w:val="auto"/>
+          <w:sz w:val="24"/>
+          <w:szCs w:val="24"/>
+        </w:rPr>
+        <w:t xml:space="preserve"> temperature and light with a solar curve and humidity with an inverse trend plus random variation. Live calls use soil moisture near the default 55% baseline. </w:t>
+      </w:r>
+      <w:proofErr w:type="spellStart"/>
+      <w:r>
+        <w:rPr>
+          <w:rFonts w:ascii="Times New Roman" w:hAnsi="Times New Roman" w:cs="Times New Roman"/>
+          <w:color w:val="auto"/>
+          <w:sz w:val="24"/>
+          <w:szCs w:val="24"/>
+        </w:rPr>
+        <w:t>generate_</w:t>
+      </w:r>
+      <w:proofErr w:type="gramStart"/>
+      <w:r>
+        <w:rPr>
+          <w:rFonts w:ascii="Times New Roman" w:hAnsi="Times New Roman" w:cs="Times New Roman"/>
+          <w:color w:val="auto"/>
+          <w:sz w:val="24"/>
+          <w:szCs w:val="24"/>
+        </w:rPr>
+        <w:t>series</w:t>
+      </w:r>
+      <w:proofErr w:type="spellEnd"/>
+      <w:r>
+        <w:rPr>
+          <w:rFonts w:ascii="Times New Roman" w:hAnsi="Times New Roman" w:cs="Times New Roman"/>
+          <w:color w:val="auto"/>
+          <w:sz w:val="24"/>
+          <w:szCs w:val="24"/>
+        </w:rPr>
+        <w:t>(</w:t>
+      </w:r>
+      <w:proofErr w:type="gramEnd"/>
+      <w:r>
+        <w:rPr>
+          <w:rFonts w:ascii="Times New Roman" w:hAnsi="Times New Roman" w:cs="Times New Roman"/>
+          <w:color w:val="auto"/>
+          <w:sz w:val="24"/>
+          <w:szCs w:val="24"/>
+        </w:rPr>
+        <w:t>) adds soil dry-down, a mid-series irrigation recovery and injected anomalies. Those historical events are not automatically present in the live publisher. The implemented temperature curve does not include the two-hour lag claimed in a source comment.</w:t>
       </w:r>
     </w:p>
     <w:p>
@@ -1951,7 +2514,27 @@
           <w:sz w:val="24"/>
           <w:szCs w:val="24"/>
         </w:rPr>
-        <w:t>.venv\Scripts\python.exe src/simulator.py --count 20 --interval 2</w:t>
+        <w:t>.</w:t>
+      </w:r>
+      <w:proofErr w:type="spellStart"/>
+      <w:r>
+        <w:rPr>
+          <w:rFonts w:ascii="Times New Roman" w:hAnsi="Times New Roman" w:cs="Times New Roman"/>
+          <w:color w:val="auto"/>
+          <w:sz w:val="24"/>
+          <w:szCs w:val="24"/>
+        </w:rPr>
+        <w:t>venv</w:t>
+      </w:r>
+      <w:proofErr w:type="spellEnd"/>
+      <w:r>
+        <w:rPr>
+          <w:rFonts w:ascii="Times New Roman" w:hAnsi="Times New Roman" w:cs="Times New Roman"/>
+          <w:color w:val="auto"/>
+          <w:sz w:val="24"/>
+          <w:szCs w:val="24"/>
+        </w:rPr>
+        <w:t>\Scripts\python.exe src/simulator.py --count 20 --interval 2</w:t>
       </w:r>
       <w:r>
         <w:rPr>
@@ -1961,7 +2544,27 @@
           <w:szCs w:val="24"/>
         </w:rPr>
         <w:br/>
-        <w:t>.venv\Scripts\python.exe src/simulator.py --once</w:t>
+        <w:t>.</w:t>
+      </w:r>
+      <w:proofErr w:type="spellStart"/>
+      <w:r>
+        <w:rPr>
+          <w:rFonts w:ascii="Times New Roman" w:hAnsi="Times New Roman" w:cs="Times New Roman"/>
+          <w:color w:val="auto"/>
+          <w:sz w:val="24"/>
+          <w:szCs w:val="24"/>
+        </w:rPr>
+        <w:t>venv</w:t>
+      </w:r>
+      <w:proofErr w:type="spellEnd"/>
+      <w:r>
+        <w:rPr>
+          <w:rFonts w:ascii="Times New Roman" w:hAnsi="Times New Roman" w:cs="Times New Roman"/>
+          <w:color w:val="auto"/>
+          <w:sz w:val="24"/>
+          <w:szCs w:val="24"/>
+        </w:rPr>
+        <w:t>\Scripts\python.exe src/simulator.py --once</w:t>
       </w:r>
     </w:p>
     <w:p>
@@ -2004,7 +2607,27 @@
           <w:sz w:val="24"/>
           <w:szCs w:val="24"/>
         </w:rPr>
-        <w:t>samples/phase2_sample_output.txt contains 20 parseable JSON records, satisfying the requested 10-20 record sample. Its header explicitly uses interval=0.0s, so this artifact demonstrates the output format rather than two-second timing. One actual saved record is reproduced below.</w:t>
+        <w:t xml:space="preserve">samples/phase2_sample_output.txt contains 20 </w:t>
+      </w:r>
+      <w:proofErr w:type="spellStart"/>
+      <w:r>
+        <w:rPr>
+          <w:rFonts w:ascii="Times New Roman" w:hAnsi="Times New Roman" w:cs="Times New Roman"/>
+          <w:color w:val="auto"/>
+          <w:sz w:val="24"/>
+          <w:szCs w:val="24"/>
+        </w:rPr>
+        <w:t>parseable</w:t>
+      </w:r>
+      <w:proofErr w:type="spellEnd"/>
+      <w:r>
+        <w:rPr>
+          <w:rFonts w:ascii="Times New Roman" w:hAnsi="Times New Roman" w:cs="Times New Roman"/>
+          <w:color w:val="auto"/>
+          <w:sz w:val="24"/>
+          <w:szCs w:val="24"/>
+        </w:rPr>
+        <w:t xml:space="preserve"> JSON records, satisfying the requested 10-20 record sample. Its header explicitly uses interval=0.0s, so this artifact demonstrates the output format rather than two-second timing. One actual saved record is reproduced below.</w:t>
       </w:r>
     </w:p>
     <w:p>
@@ -2045,15 +2668,27 @@
           <w:szCs w:val="24"/>
         </w:rPr>
         <w:br/>
-      </w:r>
-      <w:r>
-        <w:rPr>
-          <w:rFonts w:ascii="Times New Roman" w:hAnsi="Times New Roman" w:cs="Times New Roman"/>
-          <w:color w:val="auto"/>
-          <w:sz w:val="24"/>
-          <w:szCs w:val="24"/>
-        </w:rPr>
-        <w:t xml:space="preserve">  "iso_time": "2026-09-07T20:31:26.598819+00:00",</w:t>
+        <w:t xml:space="preserve">  "</w:t>
+      </w:r>
+      <w:proofErr w:type="spellStart"/>
+      <w:r>
+        <w:rPr>
+          <w:rFonts w:ascii="Times New Roman" w:hAnsi="Times New Roman" w:cs="Times New Roman"/>
+          <w:color w:val="auto"/>
+          <w:sz w:val="24"/>
+          <w:szCs w:val="24"/>
+        </w:rPr>
+        <w:t>iso_time</w:t>
+      </w:r>
+      <w:proofErr w:type="spellEnd"/>
+      <w:r>
+        <w:rPr>
+          <w:rFonts w:ascii="Times New Roman" w:hAnsi="Times New Roman" w:cs="Times New Roman"/>
+          <w:color w:val="auto"/>
+          <w:sz w:val="24"/>
+          <w:szCs w:val="24"/>
+        </w:rPr>
+        <w:t>": "2026-09-07T20:31:26.598819+00:00",</w:t>
       </w:r>
       <w:r>
         <w:rPr>
@@ -2063,7 +2698,27 @@
           <w:szCs w:val="24"/>
         </w:rPr>
         <w:br/>
-        <w:t xml:space="preserve">  "device_id": "GH-SENSOR-01",</w:t>
+        <w:t xml:space="preserve">  "</w:t>
+      </w:r>
+      <w:proofErr w:type="spellStart"/>
+      <w:r>
+        <w:rPr>
+          <w:rFonts w:ascii="Times New Roman" w:hAnsi="Times New Roman" w:cs="Times New Roman"/>
+          <w:color w:val="auto"/>
+          <w:sz w:val="24"/>
+          <w:szCs w:val="24"/>
+        </w:rPr>
+        <w:t>device_id</w:t>
+      </w:r>
+      <w:proofErr w:type="spellEnd"/>
+      <w:r>
+        <w:rPr>
+          <w:rFonts w:ascii="Times New Roman" w:hAnsi="Times New Roman" w:cs="Times New Roman"/>
+          <w:color w:val="auto"/>
+          <w:sz w:val="24"/>
+          <w:szCs w:val="24"/>
+        </w:rPr>
+        <w:t>": "GH-SENSOR-01",</w:t>
       </w:r>
       <w:r>
         <w:rPr>
@@ -2073,7 +2728,27 @@
           <w:szCs w:val="24"/>
         </w:rPr>
         <w:br/>
-        <w:t xml:space="preserve">  "temperature_c": 16.85,</w:t>
+        <w:t xml:space="preserve">  "</w:t>
+      </w:r>
+      <w:proofErr w:type="spellStart"/>
+      <w:r>
+        <w:rPr>
+          <w:rFonts w:ascii="Times New Roman" w:hAnsi="Times New Roman" w:cs="Times New Roman"/>
+          <w:color w:val="auto"/>
+          <w:sz w:val="24"/>
+          <w:szCs w:val="24"/>
+        </w:rPr>
+        <w:t>temperature_c</w:t>
+      </w:r>
+      <w:proofErr w:type="spellEnd"/>
+      <w:r>
+        <w:rPr>
+          <w:rFonts w:ascii="Times New Roman" w:hAnsi="Times New Roman" w:cs="Times New Roman"/>
+          <w:color w:val="auto"/>
+          <w:sz w:val="24"/>
+          <w:szCs w:val="24"/>
+        </w:rPr>
+        <w:t>": 16.85,</w:t>
       </w:r>
       <w:r>
         <w:rPr>
@@ -2083,7 +2758,27 @@
           <w:szCs w:val="24"/>
         </w:rPr>
         <w:br/>
-        <w:t xml:space="preserve">  "humidity_pct": 75.82,</w:t>
+        <w:t xml:space="preserve">  "</w:t>
+      </w:r>
+      <w:proofErr w:type="spellStart"/>
+      <w:r>
+        <w:rPr>
+          <w:rFonts w:ascii="Times New Roman" w:hAnsi="Times New Roman" w:cs="Times New Roman"/>
+          <w:color w:val="auto"/>
+          <w:sz w:val="24"/>
+          <w:szCs w:val="24"/>
+        </w:rPr>
+        <w:t>humidity_pct</w:t>
+      </w:r>
+      <w:proofErr w:type="spellEnd"/>
+      <w:r>
+        <w:rPr>
+          <w:rFonts w:ascii="Times New Roman" w:hAnsi="Times New Roman" w:cs="Times New Roman"/>
+          <w:color w:val="auto"/>
+          <w:sz w:val="24"/>
+          <w:szCs w:val="24"/>
+        </w:rPr>
+        <w:t>": 75.82,</w:t>
       </w:r>
       <w:r>
         <w:rPr>
@@ -2093,7 +2788,27 @@
           <w:szCs w:val="24"/>
         </w:rPr>
         <w:br/>
-        <w:t xml:space="preserve">  "soil_moisture_pct": 54.34,</w:t>
+        <w:t xml:space="preserve">  "</w:t>
+      </w:r>
+      <w:proofErr w:type="spellStart"/>
+      <w:r>
+        <w:rPr>
+          <w:rFonts w:ascii="Times New Roman" w:hAnsi="Times New Roman" w:cs="Times New Roman"/>
+          <w:color w:val="auto"/>
+          <w:sz w:val="24"/>
+          <w:szCs w:val="24"/>
+        </w:rPr>
+        <w:t>soil_moisture_pct</w:t>
+      </w:r>
+      <w:proofErr w:type="spellEnd"/>
+      <w:r>
+        <w:rPr>
+          <w:rFonts w:ascii="Times New Roman" w:hAnsi="Times New Roman" w:cs="Times New Roman"/>
+          <w:color w:val="auto"/>
+          <w:sz w:val="24"/>
+          <w:szCs w:val="24"/>
+        </w:rPr>
+        <w:t>": 54.34,</w:t>
       </w:r>
       <w:r>
         <w:rPr>
@@ -2103,7 +2818,27 @@
           <w:szCs w:val="24"/>
         </w:rPr>
         <w:br/>
-        <w:t xml:space="preserve">  "light_lux": 20.9,</w:t>
+        <w:t xml:space="preserve">  "</w:t>
+      </w:r>
+      <w:proofErr w:type="spellStart"/>
+      <w:r>
+        <w:rPr>
+          <w:rFonts w:ascii="Times New Roman" w:hAnsi="Times New Roman" w:cs="Times New Roman"/>
+          <w:color w:val="auto"/>
+          <w:sz w:val="24"/>
+          <w:szCs w:val="24"/>
+        </w:rPr>
+        <w:t>light_lux</w:t>
+      </w:r>
+      <w:proofErr w:type="spellEnd"/>
+      <w:r>
+        <w:rPr>
+          <w:rFonts w:ascii="Times New Roman" w:hAnsi="Times New Roman" w:cs="Times New Roman"/>
+          <w:color w:val="auto"/>
+          <w:sz w:val="24"/>
+          <w:szCs w:val="24"/>
+        </w:rPr>
+        <w:t>": 20.9,</w:t>
       </w:r>
       <w:r>
         <w:rPr>
@@ -2113,7 +2848,27 @@
           <w:szCs w:val="24"/>
         </w:rPr>
         <w:br/>
-        <w:t xml:space="preserve">  "alert_flag": 0,</w:t>
+        <w:t xml:space="preserve">  "</w:t>
+      </w:r>
+      <w:proofErr w:type="spellStart"/>
+      <w:r>
+        <w:rPr>
+          <w:rFonts w:ascii="Times New Roman" w:hAnsi="Times New Roman" w:cs="Times New Roman"/>
+          <w:color w:val="auto"/>
+          <w:sz w:val="24"/>
+          <w:szCs w:val="24"/>
+        </w:rPr>
+        <w:t>alert_flag</w:t>
+      </w:r>
+      <w:proofErr w:type="spellEnd"/>
+      <w:r>
+        <w:rPr>
+          <w:rFonts w:ascii="Times New Roman" w:hAnsi="Times New Roman" w:cs="Times New Roman"/>
+          <w:color w:val="auto"/>
+          <w:sz w:val="24"/>
+          <w:szCs w:val="24"/>
+        </w:rPr>
+        <w:t>": 0,</w:t>
       </w:r>
       <w:r>
         <w:rPr>
@@ -2123,7 +2878,27 @@
           <w:szCs w:val="24"/>
         </w:rPr>
         <w:br/>
-        <w:t xml:space="preserve">  "alert_reason": null</w:t>
+        <w:t xml:space="preserve">  "</w:t>
+      </w:r>
+      <w:proofErr w:type="spellStart"/>
+      <w:r>
+        <w:rPr>
+          <w:rFonts w:ascii="Times New Roman" w:hAnsi="Times New Roman" w:cs="Times New Roman"/>
+          <w:color w:val="auto"/>
+          <w:sz w:val="24"/>
+          <w:szCs w:val="24"/>
+        </w:rPr>
+        <w:t>alert_reason</w:t>
+      </w:r>
+      <w:proofErr w:type="spellEnd"/>
+      <w:r>
+        <w:rPr>
+          <w:rFonts w:ascii="Times New Roman" w:hAnsi="Times New Roman" w:cs="Times New Roman"/>
+          <w:color w:val="auto"/>
+          <w:sz w:val="24"/>
+          <w:szCs w:val="24"/>
+        </w:rPr>
+        <w:t>": null</w:t>
       </w:r>
       <w:r>
         <w:rPr>
@@ -2172,11 +2947,22 @@
       <w:r>
         <w:rPr>
           <w:rFonts w:ascii="Times New Roman" w:hAnsi="Times New Roman" w:cs="Times New Roman"/>
-          <w:color w:val="auto"/>
-          <w:sz w:val="24"/>
-          <w:szCs w:val="24"/>
-        </w:rPr>
-        <w:t>Eleven threshold cases passed, including values exactly on and just outside the configured boundaries. An 80-record historical series had the expected 900-second spacing, and all generated alert flags and reasons matched recomputation. All 12 Python source files parsed successfully. The four measurements are channels from one virtual device, not evidence of four physical nodes.</w:t>
+        </w:rPr>
+        <w:t>Threshold and repository tests pass, including exact boundary cases, multi-zone telemetry, nutrient/</w:t>
+      </w:r>
+      <w:proofErr w:type="gramStart"/>
+      <w:r>
+        <w:rPr>
+          <w:rFonts w:ascii="Times New Roman" w:hAnsi="Times New Roman" w:cs="Times New Roman"/>
+        </w:rPr>
+        <w:t>pH fields and alert normalization</w:t>
+      </w:r>
+      <w:proofErr w:type="gramEnd"/>
+      <w:r>
+        <w:rPr>
+          <w:rFonts w:ascii="Times New Roman" w:hAnsi="Times New Roman" w:cs="Times New Roman"/>
+        </w:rPr>
+        <w:t>. The implementation supports eight configured crop zones; active telemetry is still simulated unless a physical publisher is connected.</w:t>
       </w:r>
     </w:p>
     <w:p>
@@ -2198,8 +2984,27 @@
           <w:sz w:val="24"/>
           <w:szCs w:val="24"/>
         </w:rPr>
-        <w:lastRenderedPageBreak/>
-        <w:t>Phase 1 artifacts: docs/PHASE1_Project_Proposal.docx and diagrams/architecture.png. Phase 2 artifacts: src/simulator.py, src/config.py and samples/phase2_sample_output.txt.</w:t>
+        <w:t xml:space="preserve">Phase 1 artifacts: docs/PHASE1_Project_Proposal.docx and diagrams/architecture.png. Phase 2 artifacts: </w:t>
+      </w:r>
+      <w:proofErr w:type="spellStart"/>
+      <w:r>
+        <w:rPr>
+          <w:rFonts w:ascii="Times New Roman" w:hAnsi="Times New Roman" w:cs="Times New Roman"/>
+          <w:color w:val="auto"/>
+          <w:sz w:val="24"/>
+          <w:szCs w:val="24"/>
+        </w:rPr>
+        <w:t>src</w:t>
+      </w:r>
+      <w:proofErr w:type="spellEnd"/>
+      <w:r>
+        <w:rPr>
+          <w:rFonts w:ascii="Times New Roman" w:hAnsi="Times New Roman" w:cs="Times New Roman"/>
+          <w:color w:val="auto"/>
+          <w:sz w:val="24"/>
+          <w:szCs w:val="24"/>
+        </w:rPr>
+        <w:t>/simulator.py, src/config.py and samples/phase2_sample_output.txt.</w:t>
       </w:r>
     </w:p>
     <w:p>
@@ -2221,6 +3026,7 @@
           <w:sz w:val="24"/>
           <w:szCs w:val="24"/>
         </w:rPr>
+        <w:lastRenderedPageBreak/>
         <w:t>4. MQTT transmission and SQLite storage</w:t>
       </w:r>
     </w:p>
@@ -2260,11 +3066,78 @@
       <w:r>
         <w:rPr>
           <w:rFonts w:ascii="Times New Roman" w:hAnsi="Times New Roman" w:cs="Times New Roman"/>
-          <w:color w:val="auto"/>
-          <w:sz w:val="24"/>
-          <w:szCs w:val="24"/>
-        </w:rPr>
-        <w:t>src/publisher.py sends JSON through broker.hivemq.com:1883 on ctec651/greenhousewatch/ipmcbit. src/subscriber.py subscribes to that topic, decodes incoming messages and inserts readings through src/db.py. mqtt_util.py supports the paho-mqtt client API versions used by the application.</w:t>
+        </w:rPr>
+        <w:t>src/publisher.py sends zone-aware JSON through broker.hivemq.com:1883 on ctec651/</w:t>
+      </w:r>
+      <w:proofErr w:type="spellStart"/>
+      <w:r>
+        <w:rPr>
+          <w:rFonts w:ascii="Times New Roman" w:hAnsi="Times New Roman" w:cs="Times New Roman"/>
+        </w:rPr>
+        <w:t>greenhousewatch</w:t>
+      </w:r>
+      <w:proofErr w:type="spellEnd"/>
+      <w:r>
+        <w:rPr>
+          <w:rFonts w:ascii="Times New Roman" w:hAnsi="Times New Roman" w:cs="Times New Roman"/>
+        </w:rPr>
+        <w:t>/</w:t>
+      </w:r>
+      <w:proofErr w:type="spellStart"/>
+      <w:r>
+        <w:rPr>
+          <w:rFonts w:ascii="Times New Roman" w:hAnsi="Times New Roman" w:cs="Times New Roman"/>
+        </w:rPr>
+        <w:t>ipmcbit</w:t>
+      </w:r>
+      <w:proofErr w:type="spellEnd"/>
+      <w:r>
+        <w:rPr>
+          <w:rFonts w:ascii="Times New Roman" w:hAnsi="Times New Roman" w:cs="Times New Roman"/>
+        </w:rPr>
+        <w:t xml:space="preserve">. src/subscriber.py validates payloads, records </w:t>
+      </w:r>
+      <w:proofErr w:type="spellStart"/>
+      <w:r>
+        <w:rPr>
+          <w:rFonts w:ascii="Times New Roman" w:hAnsi="Times New Roman" w:cs="Times New Roman"/>
+        </w:rPr>
+        <w:t>received_at</w:t>
+      </w:r>
+      <w:proofErr w:type="spellEnd"/>
+      <w:r>
+        <w:rPr>
+          <w:rFonts w:ascii="Times New Roman" w:hAnsi="Times New Roman" w:cs="Times New Roman"/>
+        </w:rPr>
+        <w:t xml:space="preserve">, preserves </w:t>
+      </w:r>
+      <w:proofErr w:type="spellStart"/>
+      <w:r>
+        <w:rPr>
+          <w:rFonts w:ascii="Times New Roman" w:hAnsi="Times New Roman" w:cs="Times New Roman"/>
+        </w:rPr>
+        <w:t>measured_at</w:t>
+      </w:r>
+      <w:proofErr w:type="spellEnd"/>
+      <w:r>
+        <w:rPr>
+          <w:rFonts w:ascii="Times New Roman" w:hAnsi="Times New Roman" w:cs="Times New Roman"/>
+        </w:rPr>
+        <w:t xml:space="preserve">, normalizes crop-specific alert metadata and inserts readings through </w:t>
+      </w:r>
+      <w:proofErr w:type="spellStart"/>
+      <w:r>
+        <w:rPr>
+          <w:rFonts w:ascii="Times New Roman" w:hAnsi="Times New Roman" w:cs="Times New Roman"/>
+        </w:rPr>
+        <w:t>src</w:t>
+      </w:r>
+      <w:proofErr w:type="spellEnd"/>
+      <w:r>
+        <w:rPr>
+          <w:rFonts w:ascii="Times New Roman" w:hAnsi="Times New Roman" w:cs="Times New Roman"/>
+        </w:rPr>
+        <w:t>/db.py. The publisher retries after transient broker disconnects.</w:t>
       </w:r>
     </w:p>
     <w:p>
@@ -2446,7 +3319,47 @@
                 <w:sz w:val="24"/>
                 <w:szCs w:val="24"/>
               </w:rPr>
-              <w:t>data/iot_data.db; PRAGMA integrity_check = ok</w:t>
+              <w:t>data/</w:t>
+            </w:r>
+            <w:proofErr w:type="spellStart"/>
+            <w:r>
+              <w:rPr>
+                <w:rFonts w:ascii="Times New Roman" w:hAnsi="Times New Roman" w:cs="Times New Roman"/>
+                <w:color w:val="auto"/>
+                <w:sz w:val="24"/>
+                <w:szCs w:val="24"/>
+              </w:rPr>
+              <w:t>iot_data.db</w:t>
+            </w:r>
+            <w:proofErr w:type="spellEnd"/>
+            <w:r>
+              <w:rPr>
+                <w:rFonts w:ascii="Times New Roman" w:hAnsi="Times New Roman" w:cs="Times New Roman"/>
+                <w:color w:val="auto"/>
+                <w:sz w:val="24"/>
+                <w:szCs w:val="24"/>
+              </w:rPr>
+              <w:t xml:space="preserve">; PRAGMA </w:t>
+            </w:r>
+            <w:proofErr w:type="spellStart"/>
+            <w:r>
+              <w:rPr>
+                <w:rFonts w:ascii="Times New Roman" w:hAnsi="Times New Roman" w:cs="Times New Roman"/>
+                <w:color w:val="auto"/>
+                <w:sz w:val="24"/>
+                <w:szCs w:val="24"/>
+              </w:rPr>
+              <w:t>integrity_check</w:t>
+            </w:r>
+            <w:proofErr w:type="spellEnd"/>
+            <w:r>
+              <w:rPr>
+                <w:rFonts w:ascii="Times New Roman" w:hAnsi="Times New Roman" w:cs="Times New Roman"/>
+                <w:color w:val="auto"/>
+                <w:sz w:val="24"/>
+                <w:szCs w:val="24"/>
+              </w:rPr>
+              <w:t xml:space="preserve"> = ok</w:t>
             </w:r>
           </w:p>
         </w:tc>
@@ -2488,24 +3401,15 @@
           </w:tcPr>
           <w:p>
             <w:pPr>
-              <w:pStyle w:val="Tabletext"/>
-              <w:spacing w:line="276" w:lineRule="auto"/>
-              <w:jc w:val="both"/>
-              <w:rPr>
-                <w:rFonts w:ascii="Times New Roman" w:hAnsi="Times New Roman" w:cs="Times New Roman"/>
-                <w:color w:val="auto"/>
-                <w:sz w:val="24"/>
-                <w:szCs w:val="24"/>
+              <w:rPr>
+                <w:rFonts w:ascii="Times New Roman" w:hAnsi="Times New Roman" w:cs="Times New Roman"/>
               </w:rPr>
             </w:pPr>
             <w:r>
               <w:rPr>
                 <w:rFonts w:ascii="Times New Roman" w:hAnsi="Times New Roman" w:cs="Times New Roman"/>
-                <w:color w:val="auto"/>
-                <w:sz w:val="24"/>
-                <w:szCs w:val="24"/>
-              </w:rPr>
-              <w:t>100; exceeds the minimum of 50</w:t>
+              </w:rPr>
+              <w:t>Current repository snapshot; verify row count immediately before demonstration</w:t>
             </w:r>
           </w:p>
         </w:tc>
@@ -2547,24 +3451,15 @@
           </w:tcPr>
           <w:p>
             <w:pPr>
-              <w:pStyle w:val="Tabletext"/>
-              <w:spacing w:line="276" w:lineRule="auto"/>
-              <w:jc w:val="both"/>
-              <w:rPr>
-                <w:rFonts w:ascii="Times New Roman" w:hAnsi="Times New Roman" w:cs="Times New Roman"/>
-                <w:color w:val="auto"/>
-                <w:sz w:val="24"/>
-                <w:szCs w:val="24"/>
+              <w:rPr>
+                <w:rFonts w:ascii="Times New Roman" w:hAnsi="Times New Roman" w:cs="Times New Roman"/>
               </w:rPr>
             </w:pPr>
             <w:r>
               <w:rPr>
                 <w:rFonts w:ascii="Times New Roman" w:hAnsi="Times New Roman" w:cs="Times New Roman"/>
-                <w:color w:val="auto"/>
-                <w:sz w:val="24"/>
-                <w:szCs w:val="24"/>
-              </w:rPr>
-              <w:t>80 historical seed records plus 20 records matching the retained MQTT log</w:t>
+              </w:rPr>
+              <w:t>Historical seed records plus live/simulated zone telemetry; composition changes as publishers run</w:t>
             </w:r>
           </w:p>
         </w:tc>
@@ -2842,24 +3737,15 @@
           </w:tcPr>
           <w:p>
             <w:pPr>
-              <w:pStyle w:val="Tabletext"/>
-              <w:spacing w:line="276" w:lineRule="auto"/>
-              <w:jc w:val="both"/>
-              <w:rPr>
-                <w:rFonts w:ascii="Times New Roman" w:hAnsi="Times New Roman" w:cs="Times New Roman"/>
-                <w:color w:val="auto"/>
-                <w:sz w:val="24"/>
-                <w:szCs w:val="24"/>
+              <w:rPr>
+                <w:rFonts w:ascii="Times New Roman" w:hAnsi="Times New Roman" w:cs="Times New Roman"/>
               </w:rPr>
             </w:pPr>
             <w:r>
               <w:rPr>
                 <w:rFonts w:ascii="Times New Roman" w:hAnsi="Times New Roman" w:cs="Times New Roman"/>
-                <w:color w:val="auto"/>
-                <w:sz w:val="24"/>
-                <w:szCs w:val="24"/>
-              </w:rPr>
-              <w:t>100 rows; every exported field matches ordered database rows</w:t>
+              </w:rPr>
+              <w:t>CSV export is generated from the filtered repository snapshot</w:t>
             </w:r>
           </w:p>
         </w:tc>
@@ -2918,7 +3804,27 @@
                 <w:sz w:val="24"/>
                 <w:szCs w:val="24"/>
               </w:rPr>
-              <w:t>All ISO/numeric times agree within 1 ms; all alerts match current threshold logic</w:t>
+              <w:t xml:space="preserve">All ISO/numeric times agree within 1 </w:t>
+            </w:r>
+            <w:proofErr w:type="spellStart"/>
+            <w:r>
+              <w:rPr>
+                <w:rFonts w:ascii="Times New Roman" w:hAnsi="Times New Roman" w:cs="Times New Roman"/>
+                <w:color w:val="auto"/>
+                <w:sz w:val="24"/>
+                <w:szCs w:val="24"/>
+              </w:rPr>
+              <w:t>ms</w:t>
+            </w:r>
+            <w:proofErr w:type="spellEnd"/>
+            <w:r>
+              <w:rPr>
+                <w:rFonts w:ascii="Times New Roman" w:hAnsi="Times New Roman" w:cs="Times New Roman"/>
+                <w:color w:val="auto"/>
+                <w:sz w:val="24"/>
+                <w:szCs w:val="24"/>
+              </w:rPr>
+              <w:t>; all alerts match current threshold logic</w:t>
             </w:r>
           </w:p>
         </w:tc>
@@ -2960,57 +3866,8 @@
       <w:r>
         <w:rPr>
           <w:rFonts w:ascii="Times New Roman" w:hAnsi="Times New Roman" w:cs="Times New Roman"/>
-          <w:color w:val="auto"/>
-          <w:sz w:val="24"/>
-          <w:szCs w:val="24"/>
-        </w:rPr>
-        <w:t xml:space="preserve">The schema has </w:t>
-      </w:r>
-      <w:r>
-        <w:rPr>
-          <w:rFonts w:ascii="Times New Roman" w:hAnsi="Times New Roman" w:cs="Times New Roman"/>
-          <w:color w:val="auto"/>
-          <w:sz w:val="24"/>
-          <w:szCs w:val="24"/>
-        </w:rPr>
-        <w:t>a time-tamp</w:t>
-      </w:r>
-      <w:r>
-        <w:rPr>
-          <w:rFonts w:ascii="Times New Roman" w:hAnsi="Times New Roman" w:cs="Times New Roman"/>
-          <w:color w:val="auto"/>
-          <w:sz w:val="24"/>
-          <w:szCs w:val="24"/>
-        </w:rPr>
-        <w:t xml:space="preserve"> index and parameterized INSERT statements. The offline pipeline initializes a database, seeds 80 historical readings when fewer than 50 exist, exports CSV and </w:t>
-      </w:r>
-      <w:r>
-        <w:rPr>
-          <w:rFonts w:ascii="Times New Roman" w:hAnsi="Times New Roman" w:cs="Times New Roman"/>
-          <w:color w:val="auto"/>
-          <w:sz w:val="24"/>
-          <w:szCs w:val="24"/>
-        </w:rPr>
-        <w:lastRenderedPageBreak/>
-        <w:t xml:space="preserve">creates four charts. Isolated </w:t>
-      </w:r>
-      <w:r>
-        <w:rPr>
-          <w:rFonts w:ascii="Times New Roman" w:hAnsi="Times New Roman" w:cs="Times New Roman"/>
-          <w:color w:val="auto"/>
-          <w:sz w:val="24"/>
-          <w:szCs w:val="24"/>
-        </w:rPr>
-        <w:t>first run</w:t>
-      </w:r>
-      <w:r>
-        <w:rPr>
-          <w:rFonts w:ascii="Times New Roman" w:hAnsi="Times New Roman" w:cs="Times New Roman"/>
-          <w:color w:val="auto"/>
-          <w:sz w:val="24"/>
-          <w:szCs w:val="24"/>
-        </w:rPr>
-        <w:t xml:space="preserve"> and repeat-run checks passed; the repeat run retained its row count. These checks used scratch data and did not change the submitted database.</w:t>
+        </w:rPr>
+        <w:t>The schema has timestamp indexes and parameterized INSERT statements. The offline pipeline initializes a database, seeds historical readings when needed, exports CSV and creates four charts. The current dashboard loads the SQLite repository, applies freshness rules, and preserves UTC storage while presenting user-facing times in Eastern time.</w:t>
       </w:r>
     </w:p>
     <w:p>
@@ -3031,7 +3888,28 @@
           <w:sz w:val="24"/>
           <w:szCs w:val="24"/>
         </w:rPr>
-        <w:t>MQTT QoS 0 and the publisher console counter do not establish subscriber receipt. For this snapshot, the independent subscriber log and database matching provide the stronger evidence. The offline script bypasses MQTT and cannot by itself prove Phase 3 communication.</w:t>
+        <w:lastRenderedPageBreak/>
+        <w:t xml:space="preserve">MQTT QoS 0 and the publisher console counter do not establish subscriber </w:t>
+      </w:r>
+      <w:proofErr w:type="gramStart"/>
+      <w:r>
+        <w:rPr>
+          <w:rFonts w:ascii="Times New Roman" w:hAnsi="Times New Roman" w:cs="Times New Roman"/>
+          <w:color w:val="auto"/>
+          <w:sz w:val="24"/>
+          <w:szCs w:val="24"/>
+        </w:rPr>
+        <w:t>receipt</w:t>
+      </w:r>
+      <w:proofErr w:type="gramEnd"/>
+      <w:r>
+        <w:rPr>
+          <w:rFonts w:ascii="Times New Roman" w:hAnsi="Times New Roman" w:cs="Times New Roman"/>
+          <w:color w:val="auto"/>
+          <w:sz w:val="24"/>
+          <w:szCs w:val="24"/>
+        </w:rPr>
+        <w:t>. For this snapshot, the independent subscriber log and database matching provide the stronger evidence. The offline script bypasses MQTT and cannot by itself prove Phase 3 communication.</w:t>
       </w:r>
     </w:p>
     <w:p>
@@ -3160,11 +4038,22 @@
       <w:r>
         <w:rPr>
           <w:rFonts w:ascii="Times New Roman" w:hAnsi="Times New Roman" w:cs="Times New Roman"/>
-          <w:color w:val="auto"/>
-          <w:sz w:val="24"/>
-          <w:szCs w:val="24"/>
-        </w:rPr>
-        <w:t>The current temperature range is 13.37-28.96 degrees C. No stored value exceeds the 32-degree upper limit. The single low-temperature alert occurs on 7 September at 17:31:21 UTC; it is an injected simulated cold event, not a measured dawn event.</w:t>
+        </w:rPr>
+        <w:t xml:space="preserve">In the retained 100-record </w:t>
+      </w:r>
+      <w:proofErr w:type="spellStart"/>
+      <w:r>
+        <w:rPr>
+          <w:rFonts w:ascii="Times New Roman" w:hAnsi="Times New Roman" w:cs="Times New Roman"/>
+        </w:rPr>
+        <w:t>sensor_data</w:t>
+      </w:r>
+      <w:proofErr w:type="spellEnd"/>
+      <w:r>
+        <w:rPr>
+          <w:rFonts w:ascii="Times New Roman" w:hAnsi="Times New Roman" w:cs="Times New Roman"/>
+        </w:rPr>
+        <w:t xml:space="preserve"> snapshot, the temperature range is 13.37-28.96 degrees C. No stored value exceeds the 32-degree upper limit. The single low-temperature alert occurs on 7 September at 17:31:21 UTC; it is an injected simulated cold event, not a measured dawn event.</w:t>
       </w:r>
     </w:p>
     <w:p>
@@ -3263,8 +4152,77 @@
           <w:sz w:val="24"/>
           <w:szCs w:val="24"/>
         </w:rPr>
+        <w:t xml:space="preserve">Alerts represent 7% of 100 stored readings: three </w:t>
+      </w:r>
+      <w:proofErr w:type="spellStart"/>
+      <w:r>
+        <w:rPr>
+          <w:rFonts w:ascii="Times New Roman" w:hAnsi="Times New Roman" w:cs="Times New Roman"/>
+          <w:color w:val="auto"/>
+          <w:sz w:val="24"/>
+          <w:szCs w:val="24"/>
+        </w:rPr>
+        <w:t>high_humidity</w:t>
+      </w:r>
+      <w:proofErr w:type="spellEnd"/>
+      <w:r>
+        <w:rPr>
+          <w:rFonts w:ascii="Times New Roman" w:hAnsi="Times New Roman" w:cs="Times New Roman"/>
+          <w:color w:val="auto"/>
+          <w:sz w:val="24"/>
+          <w:szCs w:val="24"/>
+        </w:rPr>
+        <w:t xml:space="preserve">, three </w:t>
+      </w:r>
+      <w:proofErr w:type="spellStart"/>
+      <w:r>
+        <w:rPr>
+          <w:rFonts w:ascii="Times New Roman" w:hAnsi="Times New Roman" w:cs="Times New Roman"/>
+          <w:color w:val="auto"/>
+          <w:sz w:val="24"/>
+          <w:szCs w:val="24"/>
+        </w:rPr>
+        <w:t>dry_soil</w:t>
+      </w:r>
+      <w:proofErr w:type="spellEnd"/>
+      <w:r>
+        <w:rPr>
+          <w:rFonts w:ascii="Times New Roman" w:hAnsi="Times New Roman" w:cs="Times New Roman"/>
+          <w:color w:val="auto"/>
+          <w:sz w:val="24"/>
+          <w:szCs w:val="24"/>
+        </w:rPr>
+        <w:t xml:space="preserve"> and one </w:t>
+      </w:r>
+      <w:proofErr w:type="spellStart"/>
+      <w:r>
+        <w:rPr>
+          <w:rFonts w:ascii="Times New Roman" w:hAnsi="Times New Roman" w:cs="Times New Roman"/>
+          <w:color w:val="auto"/>
+          <w:sz w:val="24"/>
+          <w:szCs w:val="24"/>
+        </w:rPr>
+        <w:t>low_temperature</w:t>
+      </w:r>
+      <w:proofErr w:type="spellEnd"/>
+      <w:r>
+        <w:rPr>
+          <w:rFonts w:ascii="Times New Roman" w:hAnsi="Times New Roman" w:cs="Times New Roman"/>
+          <w:color w:val="auto"/>
+          <w:sz w:val="24"/>
+          <w:szCs w:val="24"/>
+        </w:rPr>
+        <w:t xml:space="preserve">. This percentage weights records, not elapsed time, because the historical and </w:t>
+      </w:r>
+      <w:r>
+        <w:rPr>
+          <w:rFonts w:ascii="Times New Roman" w:hAnsi="Times New Roman" w:cs="Times New Roman"/>
+          <w:color w:val="auto"/>
+          <w:sz w:val="24"/>
+          <w:szCs w:val="24"/>
+        </w:rPr>
         <w:lastRenderedPageBreak/>
-        <w:t>Alerts represent 7% of 100 stored readings: three high_humidity, three dry_soil and one low_temperature. This percentage weights records, not elapsed time, because the historical and MQTT batches use different sampling intervals. The scatter reflects the programmed relationship between temperature and humidity.</w:t>
+        <w:t>MQTT batches use different sampling intervals. The scatter reflects the programmed relationship between temperature and humidity.</w:t>
       </w:r>
     </w:p>
     <w:p>
@@ -3286,7 +4244,27 @@
           <w:sz w:val="24"/>
           <w:szCs w:val="24"/>
         </w:rPr>
-        <w:t>Sources: outputs/01_temperature_over_time.png and outputs/04_alert_summary.png; data/iot_data.db. Additional charts: 02_humidity_over_time.png and 03_soil_and_light.png.</w:t>
+        <w:t>Sources: outputs/01_temperature_over_time.png and outputs/04_alert_summary.png; data/</w:t>
+      </w:r>
+      <w:proofErr w:type="spellStart"/>
+      <w:r>
+        <w:rPr>
+          <w:rFonts w:ascii="Times New Roman" w:hAnsi="Times New Roman" w:cs="Times New Roman"/>
+          <w:color w:val="auto"/>
+          <w:sz w:val="24"/>
+          <w:szCs w:val="24"/>
+        </w:rPr>
+        <w:t>iot_data.db</w:t>
+      </w:r>
+      <w:proofErr w:type="spellEnd"/>
+      <w:r>
+        <w:rPr>
+          <w:rFonts w:ascii="Times New Roman" w:hAnsi="Times New Roman" w:cs="Times New Roman"/>
+          <w:color w:val="auto"/>
+          <w:sz w:val="24"/>
+          <w:szCs w:val="24"/>
+        </w:rPr>
+        <w:t>. Additional charts: 02_humidity_over_time.png and 03_soil_and_light.png.</w:t>
       </w:r>
     </w:p>
     <w:p>
@@ -3402,11 +4380,36 @@
       <w:r>
         <w:rPr>
           <w:rFonts w:ascii="Times New Roman" w:hAnsi="Times New Roman" w:cs="Times New Roman"/>
-          <w:color w:val="auto"/>
-          <w:sz w:val="24"/>
-          <w:szCs w:val="24"/>
-        </w:rPr>
-        <w:t>src/dashboard.py displays row count, latest temperature, humidity, soil moisture and total alerts, followed by four charts and the latest 15 readings. Streamlit AppTest completed without an exception on the actual valid dataset: 100 readings, 17.9 degrees C, 77.1% humidity, 55.5% soil moisture and seven alerts. This checks script execution and displayed metrics, not a full browser interaction test.</w:t>
+        </w:rPr>
+        <w:t xml:space="preserve">src/dashboard.py launches a multi-page </w:t>
+      </w:r>
+      <w:proofErr w:type="spellStart"/>
+      <w:r>
+        <w:rPr>
+          <w:rFonts w:ascii="Times New Roman" w:hAnsi="Times New Roman" w:cs="Times New Roman"/>
+        </w:rPr>
+        <w:t>Streamlit</w:t>
+      </w:r>
+      <w:proofErr w:type="spellEnd"/>
+      <w:r>
+        <w:rPr>
+          <w:rFonts w:ascii="Times New Roman" w:hAnsi="Times New Roman" w:cs="Times New Roman"/>
+        </w:rPr>
+        <w:t xml:space="preserve"> application. Overview presents primary zone health, explicit KPI averages, environmental trends and data-quality status. Zones </w:t>
+      </w:r>
+      <w:proofErr w:type="gramStart"/>
+      <w:r>
+        <w:rPr>
+          <w:rFonts w:ascii="Times New Roman" w:hAnsi="Times New Roman" w:cs="Times New Roman"/>
+        </w:rPr>
+        <w:t>provides</w:t>
+      </w:r>
+      <w:proofErr w:type="gramEnd"/>
+      <w:r>
+        <w:rPr>
+          <w:rFonts w:ascii="Times New Roman" w:hAnsi="Times New Roman" w:cs="Times New Roman"/>
+        </w:rPr>
+        <w:t xml:space="preserve"> a searchable crop directory and selected-zone details. Analytics provides compact filters, zone comparison, gaps, alert analysis and summaries. Forecast provides a default Bowie location, current weather, daily summaries, recommendations and indoor/outdoor comparison.</w:t>
       </w:r>
     </w:p>
     <w:p>
@@ -3423,11 +4426,8 @@
       <w:r>
         <w:rPr>
           <w:rFonts w:ascii="Times New Roman" w:hAnsi="Times New Roman" w:cs="Times New Roman"/>
-          <w:color w:val="auto"/>
-          <w:sz w:val="24"/>
-          <w:szCs w:val="24"/>
-        </w:rPr>
-        <w:t>The dashboard plots row positions rather than actual timestamps and has no automatic refresh. It should be rerun after ingestion to show new data. Its humidity caption omits the upper limit although the alert logic includes it. The static time-series charts use clock-time labels and connect across a substantial gap; date labels and explicit gaps would improve interpretation.</w:t>
+        </w:rPr>
+        <w:t>The dashboard stores UTC timestamps. Chart axes and tooltips use UTC; refresh and availability summaries explicitly use Eastern time. Analytics uses zone-specific dash patterns and gap segmentation. Overview marks bins containing recorded alerts. See Section 9 for the current chart assessment and application screenshots.</w:t>
       </w:r>
     </w:p>
     <w:p>
@@ -3548,7 +4548,6 @@
           <w:sz w:val="24"/>
           <w:szCs w:val="24"/>
         </w:rPr>
-        <w:lastRenderedPageBreak/>
         <w:t>Learning-objective assessment</w:t>
       </w:r>
     </w:p>
@@ -3600,6 +4599,7 @@
                 <w:sz w:val="24"/>
                 <w:szCs w:val="24"/>
               </w:rPr>
+              <w:lastRenderedPageBreak/>
               <w:t>Objective (PDF p. 1)</w:t>
             </w:r>
           </w:p>
@@ -3654,6 +4654,7 @@
                 <w:szCs w:val="24"/>
               </w:rPr>
             </w:pPr>
+            <w:proofErr w:type="gramStart"/>
             <w:r>
               <w:rPr>
                 <w:rFonts w:ascii="Times New Roman" w:hAnsi="Times New Roman" w:cs="Times New Roman"/>
@@ -3661,7 +4662,17 @@
                 <w:sz w:val="24"/>
                 <w:szCs w:val="24"/>
               </w:rPr>
-              <w:t>Understand IoT architecture</w:t>
+              <w:t>Understand</w:t>
+            </w:r>
+            <w:proofErr w:type="gramEnd"/>
+            <w:r>
+              <w:rPr>
+                <w:rFonts w:ascii="Times New Roman" w:hAnsi="Times New Roman" w:cs="Times New Roman"/>
+                <w:color w:val="auto"/>
+                <w:sz w:val="24"/>
+                <w:szCs w:val="24"/>
+              </w:rPr>
+              <w:t xml:space="preserve"> IoT architecture</w:t>
             </w:r>
           </w:p>
         </w:tc>
@@ -4280,6 +5291,7 @@
                 <w:szCs w:val="24"/>
               </w:rPr>
             </w:pPr>
+            <w:proofErr w:type="spellStart"/>
             <w:r>
               <w:rPr>
                 <w:rFonts w:ascii="Times New Roman" w:hAnsi="Times New Roman" w:cs="Times New Roman"/>
@@ -4287,7 +5299,17 @@
                 <w:sz w:val="24"/>
                 <w:szCs w:val="24"/>
               </w:rPr>
-              <w:t>src/publisher.py, src/subscriber.py and samples/subscriber_run.log. Retained transmission output matches 20 stored rows; no new network run in this review.</w:t>
+              <w:t>src</w:t>
+            </w:r>
+            <w:proofErr w:type="spellEnd"/>
+            <w:r>
+              <w:rPr>
+                <w:rFonts w:ascii="Times New Roman" w:hAnsi="Times New Roman" w:cs="Times New Roman"/>
+                <w:color w:val="auto"/>
+                <w:sz w:val="24"/>
+                <w:szCs w:val="24"/>
+              </w:rPr>
+              <w:t>/publisher.py, src/subscriber.py and samples/subscriber_run.log. Retained transmission output matches 20 stored rows; no new network run in this review.</w:t>
             </w:r>
           </w:p>
         </w:tc>
@@ -4329,24 +5351,15 @@
           </w:tcPr>
           <w:p>
             <w:pPr>
-              <w:pStyle w:val="Tabletext"/>
-              <w:spacing w:line="276" w:lineRule="auto"/>
-              <w:jc w:val="both"/>
-              <w:rPr>
-                <w:rFonts w:ascii="Times New Roman" w:hAnsi="Times New Roman" w:cs="Times New Roman"/>
-                <w:color w:val="auto"/>
-                <w:sz w:val="24"/>
-                <w:szCs w:val="24"/>
+              <w:rPr>
+                <w:rFonts w:ascii="Times New Roman" w:hAnsi="Times New Roman" w:cs="Times New Roman"/>
               </w:rPr>
             </w:pPr>
             <w:r>
               <w:rPr>
                 <w:rFonts w:ascii="Times New Roman" w:hAnsi="Times New Roman" w:cs="Times New Roman"/>
-                <w:color w:val="auto"/>
-                <w:sz w:val="24"/>
-                <w:szCs w:val="24"/>
-              </w:rPr>
-              <w:t>data/iot_data.db and docs/table_schema.md. 100 valid rows; schema document still describes the original 80-row seed.</w:t>
+              </w:rPr>
+              <w:t>Current repository contains multi-zone telemetry; verify counts before submission</w:t>
             </w:r>
           </w:p>
         </w:tc>
@@ -4437,7 +5450,6 @@
                 <w:sz w:val="24"/>
                 <w:szCs w:val="24"/>
               </w:rPr>
-              <w:lastRenderedPageBreak/>
               <w:t>6. Bonus / optional</w:t>
             </w:r>
           </w:p>
@@ -4497,6 +5509,7 @@
                 <w:sz w:val="24"/>
                 <w:szCs w:val="24"/>
               </w:rPr>
+              <w:lastRenderedPageBreak/>
               <w:t>7. Presentation / 28 Sep</w:t>
             </w:r>
           </w:p>
@@ -4566,29 +5579,36 @@
       <w:r>
         <w:rPr>
           <w:rFonts w:ascii="Times New Roman" w:hAnsi="Times New Roman" w:cs="Times New Roman"/>
-          <w:color w:val="auto"/>
-          <w:sz w:val="24"/>
-          <w:szCs w:val="24"/>
-        </w:rPr>
-        <w:t xml:space="preserve">Input validation: an isolated callback test accepted temperature_c="not-a-number" and humidity_pct=150. The same invalid temperature as the latest row reproduced a dashboard ValueError. Reject </w:t>
-      </w:r>
-      <w:r>
-        <w:rPr>
-          <w:rFonts w:ascii="Times New Roman" w:hAnsi="Times New Roman" w:cs="Times New Roman"/>
-          <w:color w:val="auto"/>
-          <w:sz w:val="24"/>
-          <w:szCs w:val="24"/>
-        </w:rPr>
-        <w:t>non-numeric</w:t>
-      </w:r>
-      <w:r>
-        <w:rPr>
-          <w:rFonts w:ascii="Times New Roman" w:hAnsi="Times New Roman" w:cs="Times New Roman"/>
-          <w:color w:val="auto"/>
-          <w:sz w:val="24"/>
-          <w:szCs w:val="24"/>
-        </w:rPr>
-        <w:t>, nonfinite and physically invalid values before insertion; validate timestamp consistency and recompute alert metadata. The real database was not corrupted by these tests.</w:t>
+        </w:rPr>
+        <w:t xml:space="preserve">Input validation is now enforced before insertion for numeric, finite and physically valid measurements. Zone </w:t>
+      </w:r>
+      <w:proofErr w:type="spellStart"/>
+      <w:r>
+        <w:rPr>
+          <w:rFonts w:ascii="Times New Roman" w:hAnsi="Times New Roman" w:cs="Times New Roman"/>
+        </w:rPr>
+        <w:t>alert_flag</w:t>
+      </w:r>
+      <w:proofErr w:type="spellEnd"/>
+      <w:r>
+        <w:rPr>
+          <w:rFonts w:ascii="Times New Roman" w:hAnsi="Times New Roman" w:cs="Times New Roman"/>
+        </w:rPr>
+        <w:t xml:space="preserve"> and </w:t>
+      </w:r>
+      <w:proofErr w:type="spellStart"/>
+      <w:r>
+        <w:rPr>
+          <w:rFonts w:ascii="Times New Roman" w:hAnsi="Times New Roman" w:cs="Times New Roman"/>
+        </w:rPr>
+        <w:t>alert_reason</w:t>
+      </w:r>
+      <w:proofErr w:type="spellEnd"/>
+      <w:r>
+        <w:rPr>
+          <w:rFonts w:ascii="Times New Roman" w:hAnsi="Times New Roman" w:cs="Times New Roman"/>
+        </w:rPr>
+        <w:t xml:space="preserve"> are recomputed from configured crop thresholds at write time. The active database was normalized and has no inconsistent alert flag/reason pairs.</w:t>
       </w:r>
     </w:p>
     <w:p>
@@ -4605,11 +5625,22 @@
       <w:r>
         <w:rPr>
           <w:rFonts w:ascii="Times New Roman" w:hAnsi="Times New Roman" w:cs="Times New Roman"/>
-          <w:color w:val="auto"/>
-          <w:sz w:val="24"/>
-          <w:szCs w:val="24"/>
-        </w:rPr>
-        <w:t>Consistency: update the interpretation, schema narrative, project report and slides to distinguish 80 historical rows from the full 100-row snapshot. Slides 6, 8 and 10 still use 80-row totals; slide 8 mislabels the cold event as dawn and claims light proves the clock is real. Refresh or label chart snapshots and avoid presenting simulated results as real greenhouse evidence.</w:t>
+        </w:rPr>
+        <w:t xml:space="preserve">Section 9 provides the current application review and screenshots. The earlier </w:t>
+      </w:r>
+      <w:proofErr w:type="gramStart"/>
+      <w:r>
+        <w:rPr>
+          <w:rFonts w:ascii="Times New Roman" w:hAnsi="Times New Roman" w:cs="Times New Roman"/>
+        </w:rPr>
+        <w:t>single-device</w:t>
+      </w:r>
+      <w:proofErr w:type="gramEnd"/>
+      <w:r>
+        <w:rPr>
+          <w:rFonts w:ascii="Times New Roman" w:hAnsi="Times New Roman" w:cs="Times New Roman"/>
+        </w:rPr>
+        <w:t xml:space="preserve"> counts and static figures are retained as historical evidence; they are not the current multi-zone dashboard totals. Supporting slides and interpretation files should identify their dataset and distinguish simulated from physical readings.</w:t>
       </w:r>
     </w:p>
     <w:p>
@@ -4772,7 +5803,6 @@
           <w:sz w:val="24"/>
           <w:szCs w:val="24"/>
         </w:rPr>
-        <w:lastRenderedPageBreak/>
         <w:t>8. Verification record and demonstration guide</w:t>
       </w:r>
     </w:p>
@@ -4944,6 +5974,7 @@
                 <w:sz w:val="24"/>
                 <w:szCs w:val="24"/>
               </w:rPr>
+              <w:lastRenderedPageBreak/>
               <w:t>Data integrity and consistency</w:t>
             </w:r>
           </w:p>
@@ -5266,7 +6297,47 @@
                 <w:sz w:val="24"/>
                 <w:szCs w:val="24"/>
               </w:rPr>
-              <w:t>20 payloads match stored rows. A fresh HiveMQ round trip was not run.</w:t>
+              <w:t xml:space="preserve">20 payloads match stored rows. </w:t>
+            </w:r>
+            <w:proofErr w:type="gramStart"/>
+            <w:r>
+              <w:rPr>
+                <w:rFonts w:ascii="Times New Roman" w:hAnsi="Times New Roman" w:cs="Times New Roman"/>
+                <w:color w:val="auto"/>
+                <w:sz w:val="24"/>
+                <w:szCs w:val="24"/>
+              </w:rPr>
+              <w:t>A fresh</w:t>
+            </w:r>
+            <w:proofErr w:type="gramEnd"/>
+            <w:r>
+              <w:rPr>
+                <w:rFonts w:ascii="Times New Roman" w:hAnsi="Times New Roman" w:cs="Times New Roman"/>
+                <w:color w:val="auto"/>
+                <w:sz w:val="24"/>
+                <w:szCs w:val="24"/>
+              </w:rPr>
+              <w:t xml:space="preserve"> </w:t>
+            </w:r>
+            <w:proofErr w:type="spellStart"/>
+            <w:r>
+              <w:rPr>
+                <w:rFonts w:ascii="Times New Roman" w:hAnsi="Times New Roman" w:cs="Times New Roman"/>
+                <w:color w:val="auto"/>
+                <w:sz w:val="24"/>
+                <w:szCs w:val="24"/>
+              </w:rPr>
+              <w:t>HiveMQ</w:t>
+            </w:r>
+            <w:proofErr w:type="spellEnd"/>
+            <w:r>
+              <w:rPr>
+                <w:rFonts w:ascii="Times New Roman" w:hAnsi="Times New Roman" w:cs="Times New Roman"/>
+                <w:color w:val="auto"/>
+                <w:sz w:val="24"/>
+                <w:szCs w:val="24"/>
+              </w:rPr>
+              <w:t xml:space="preserve"> round trip was not run.</w:t>
             </w:r>
           </w:p>
         </w:tc>
@@ -5308,29 +6379,8 @@
       <w:r>
         <w:rPr>
           <w:rFonts w:ascii="Times New Roman" w:hAnsi="Times New Roman" w:cs="Times New Roman"/>
-          <w:color w:val="auto"/>
-          <w:sz w:val="24"/>
-          <w:szCs w:val="24"/>
-        </w:rPr>
-        <w:t xml:space="preserve">From the repository root, </w:t>
-      </w:r>
-      <w:r>
-        <w:rPr>
-          <w:rFonts w:ascii="Times New Roman" w:hAnsi="Times New Roman" w:cs="Times New Roman"/>
-          <w:color w:val="auto"/>
-          <w:sz w:val="24"/>
-          <w:szCs w:val="24"/>
-        </w:rPr>
-        <w:t xml:space="preserve">we </w:t>
-      </w:r>
-      <w:r>
-        <w:rPr>
-          <w:rFonts w:ascii="Times New Roman" w:hAnsi="Times New Roman" w:cs="Times New Roman"/>
-          <w:color w:val="auto"/>
-          <w:sz w:val="24"/>
-          <w:szCs w:val="24"/>
-        </w:rPr>
-        <w:t>use the existing virtual environment. Start the subscriber in terminal A, then the publisher in terminal B. Compare the database count before and after publishing; the current baseline is 100, but the count should be checked immediately before the demo.</w:t>
+        </w:rPr>
+        <w:t>From the repository root, use the existing virtual environment. Start the subscriber first, then one publisher per demonstration zone. Check the database count immediately before the demo because live publishers may continue adding rows; do not present simulated values as physical observations.</w:t>
       </w:r>
     </w:p>
     <w:p>
@@ -5351,7 +6401,27 @@
           <w:sz w:val="24"/>
           <w:szCs w:val="24"/>
         </w:rPr>
-        <w:t>.venv\Scripts\python.exe src/db.py</w:t>
+        <w:t>.</w:t>
+      </w:r>
+      <w:proofErr w:type="spellStart"/>
+      <w:r>
+        <w:rPr>
+          <w:rFonts w:ascii="Times New Roman" w:hAnsi="Times New Roman" w:cs="Times New Roman"/>
+          <w:color w:val="auto"/>
+          <w:sz w:val="24"/>
+          <w:szCs w:val="24"/>
+        </w:rPr>
+        <w:t>venv</w:t>
+      </w:r>
+      <w:proofErr w:type="spellEnd"/>
+      <w:r>
+        <w:rPr>
+          <w:rFonts w:ascii="Times New Roman" w:hAnsi="Times New Roman" w:cs="Times New Roman"/>
+          <w:color w:val="auto"/>
+          <w:sz w:val="24"/>
+          <w:szCs w:val="24"/>
+        </w:rPr>
+        <w:t>\Scripts\python.exe src/db.py</w:t>
       </w:r>
       <w:r>
         <w:rPr>
@@ -5371,7 +6441,27 @@
           <w:szCs w:val="24"/>
         </w:rPr>
         <w:br/>
-        <w:t>.venv\Scripts\python.exe src/subscriber.py</w:t>
+        <w:t>.</w:t>
+      </w:r>
+      <w:proofErr w:type="spellStart"/>
+      <w:r>
+        <w:rPr>
+          <w:rFonts w:ascii="Times New Roman" w:hAnsi="Times New Roman" w:cs="Times New Roman"/>
+          <w:color w:val="auto"/>
+          <w:sz w:val="24"/>
+          <w:szCs w:val="24"/>
+        </w:rPr>
+        <w:t>venv</w:t>
+      </w:r>
+      <w:proofErr w:type="spellEnd"/>
+      <w:r>
+        <w:rPr>
+          <w:rFonts w:ascii="Times New Roman" w:hAnsi="Times New Roman" w:cs="Times New Roman"/>
+          <w:color w:val="auto"/>
+          <w:sz w:val="24"/>
+          <w:szCs w:val="24"/>
+        </w:rPr>
+        <w:t>\Scripts\python.exe src/subscriber.py</w:t>
       </w:r>
       <w:r>
         <w:rPr>
@@ -5391,7 +6481,27 @@
           <w:szCs w:val="24"/>
         </w:rPr>
         <w:br/>
-        <w:t>.venv\Scripts\python.exe src/publisher.py --count 20 --interval 2</w:t>
+        <w:t>.</w:t>
+      </w:r>
+      <w:proofErr w:type="spellStart"/>
+      <w:r>
+        <w:rPr>
+          <w:rFonts w:ascii="Times New Roman" w:hAnsi="Times New Roman" w:cs="Times New Roman"/>
+          <w:color w:val="auto"/>
+          <w:sz w:val="24"/>
+          <w:szCs w:val="24"/>
+        </w:rPr>
+        <w:t>venv</w:t>
+      </w:r>
+      <w:proofErr w:type="spellEnd"/>
+      <w:r>
+        <w:rPr>
+          <w:rFonts w:ascii="Times New Roman" w:hAnsi="Times New Roman" w:cs="Times New Roman"/>
+          <w:color w:val="auto"/>
+          <w:sz w:val="24"/>
+          <w:szCs w:val="24"/>
+        </w:rPr>
+        <w:t>\Scripts\python.exe src/publisher.py --count 20 --interval 2</w:t>
       </w:r>
       <w:r>
         <w:rPr>
@@ -5401,7 +6511,27 @@
           <w:szCs w:val="24"/>
         </w:rPr>
         <w:br/>
-        <w:t>.venv\Scripts\python.exe src/db.py</w:t>
+        <w:t>.</w:t>
+      </w:r>
+      <w:proofErr w:type="spellStart"/>
+      <w:r>
+        <w:rPr>
+          <w:rFonts w:ascii="Times New Roman" w:hAnsi="Times New Roman" w:cs="Times New Roman"/>
+          <w:color w:val="auto"/>
+          <w:sz w:val="24"/>
+          <w:szCs w:val="24"/>
+        </w:rPr>
+        <w:t>venv</w:t>
+      </w:r>
+      <w:proofErr w:type="spellEnd"/>
+      <w:r>
+        <w:rPr>
+          <w:rFonts w:ascii="Times New Roman" w:hAnsi="Times New Roman" w:cs="Times New Roman"/>
+          <w:color w:val="auto"/>
+          <w:sz w:val="24"/>
+          <w:szCs w:val="24"/>
+        </w:rPr>
+        <w:t>\Scripts\python.exe src/db.py</w:t>
       </w:r>
       <w:r>
         <w:rPr>
@@ -5411,7 +6541,27 @@
           <w:szCs w:val="24"/>
         </w:rPr>
         <w:br/>
-        <w:t>.venv\Scripts\python.exe src/export_csv.py</w:t>
+        <w:t>.</w:t>
+      </w:r>
+      <w:proofErr w:type="spellStart"/>
+      <w:r>
+        <w:rPr>
+          <w:rFonts w:ascii="Times New Roman" w:hAnsi="Times New Roman" w:cs="Times New Roman"/>
+          <w:color w:val="auto"/>
+          <w:sz w:val="24"/>
+          <w:szCs w:val="24"/>
+        </w:rPr>
+        <w:t>venv</w:t>
+      </w:r>
+      <w:proofErr w:type="spellEnd"/>
+      <w:r>
+        <w:rPr>
+          <w:rFonts w:ascii="Times New Roman" w:hAnsi="Times New Roman" w:cs="Times New Roman"/>
+          <w:color w:val="auto"/>
+          <w:sz w:val="24"/>
+          <w:szCs w:val="24"/>
+        </w:rPr>
+        <w:t>\Scripts\python.exe src/export_csv.py</w:t>
       </w:r>
       <w:r>
         <w:rPr>
@@ -5421,7 +6571,27 @@
           <w:szCs w:val="24"/>
         </w:rPr>
         <w:br/>
-        <w:t>.venv\Scripts\python.exe src/visualize.py</w:t>
+        <w:t>.</w:t>
+      </w:r>
+      <w:proofErr w:type="spellStart"/>
+      <w:r>
+        <w:rPr>
+          <w:rFonts w:ascii="Times New Roman" w:hAnsi="Times New Roman" w:cs="Times New Roman"/>
+          <w:color w:val="auto"/>
+          <w:sz w:val="24"/>
+          <w:szCs w:val="24"/>
+        </w:rPr>
+        <w:t>venv</w:t>
+      </w:r>
+      <w:proofErr w:type="spellEnd"/>
+      <w:r>
+        <w:rPr>
+          <w:rFonts w:ascii="Times New Roman" w:hAnsi="Times New Roman" w:cs="Times New Roman"/>
+          <w:color w:val="auto"/>
+          <w:sz w:val="24"/>
+          <w:szCs w:val="24"/>
+        </w:rPr>
+        <w:t>\Scripts\python.exe src/visualize.py</w:t>
       </w:r>
       <w:r>
         <w:rPr>
@@ -5431,7 +6601,47 @@
           <w:szCs w:val="24"/>
         </w:rPr>
         <w:br/>
-        <w:t>.venv\Scripts\python.exe -m streamlit run src/dashboard.py</w:t>
+        <w:t>.</w:t>
+      </w:r>
+      <w:proofErr w:type="spellStart"/>
+      <w:r>
+        <w:rPr>
+          <w:rFonts w:ascii="Times New Roman" w:hAnsi="Times New Roman" w:cs="Times New Roman"/>
+          <w:color w:val="auto"/>
+          <w:sz w:val="24"/>
+          <w:szCs w:val="24"/>
+        </w:rPr>
+        <w:t>venv</w:t>
+      </w:r>
+      <w:proofErr w:type="spellEnd"/>
+      <w:r>
+        <w:rPr>
+          <w:rFonts w:ascii="Times New Roman" w:hAnsi="Times New Roman" w:cs="Times New Roman"/>
+          <w:color w:val="auto"/>
+          <w:sz w:val="24"/>
+          <w:szCs w:val="24"/>
+        </w:rPr>
+        <w:t xml:space="preserve">\Scripts\python.exe -m </w:t>
+      </w:r>
+      <w:proofErr w:type="spellStart"/>
+      <w:r>
+        <w:rPr>
+          <w:rFonts w:ascii="Times New Roman" w:hAnsi="Times New Roman" w:cs="Times New Roman"/>
+          <w:color w:val="auto"/>
+          <w:sz w:val="24"/>
+          <w:szCs w:val="24"/>
+        </w:rPr>
+        <w:t>streamlit</w:t>
+      </w:r>
+      <w:proofErr w:type="spellEnd"/>
+      <w:r>
+        <w:rPr>
+          <w:rFonts w:ascii="Times New Roman" w:hAnsi="Times New Roman" w:cs="Times New Roman"/>
+          <w:color w:val="auto"/>
+          <w:sz w:val="24"/>
+          <w:szCs w:val="24"/>
+        </w:rPr>
+        <w:t xml:space="preserve"> run src/dashboard.py</w:t>
       </w:r>
     </w:p>
     <w:p>
@@ -5474,7 +6684,6 @@
           <w:sz w:val="24"/>
           <w:szCs w:val="24"/>
         </w:rPr>
-        <w:lastRenderedPageBreak/>
         <w:t>Conclusion</w:t>
       </w:r>
     </w:p>
@@ -5489,23 +6698,35 @@
           <w:szCs w:val="24"/>
         </w:rPr>
       </w:pPr>
-      <w:r>
-        <w:rPr>
-          <w:rFonts w:ascii="Times New Roman" w:hAnsi="Times New Roman" w:cs="Times New Roman"/>
-          <w:color w:val="auto"/>
-          <w:sz w:val="24"/>
-          <w:szCs w:val="24"/>
-        </w:rPr>
-        <w:t>GreenHouseWatch satisfies the central educational design: simulated sensor data can be transmitted, stored locally and visualized with free tools. The first-delivery artifacts are present, and the current dataset is internally consistent. The project should be described as implemented with outstanding validation and submission corrections, rather than fully complete or error-free. This report records the checks and remaining work; it does not certify an instructor grade, submission timing or completion of t</w:t>
-      </w:r>
-      <w:r>
-        <w:rPr>
-          <w:rFonts w:ascii="Times New Roman" w:hAnsi="Times New Roman" w:cs="Times New Roman"/>
-          <w:color w:val="auto"/>
-          <w:sz w:val="24"/>
-          <w:szCs w:val="24"/>
-        </w:rPr>
-        <w:t>he final presentation.</w:t>
+      <w:proofErr w:type="spellStart"/>
+      <w:r>
+        <w:rPr>
+          <w:rFonts w:ascii="Times New Roman" w:hAnsi="Times New Roman" w:cs="Times New Roman"/>
+          <w:color w:val="auto"/>
+          <w:sz w:val="24"/>
+          <w:szCs w:val="24"/>
+        </w:rPr>
+        <w:t>GreenHouseWatch</w:t>
+      </w:r>
+      <w:proofErr w:type="spellEnd"/>
+      <w:r>
+        <w:rPr>
+          <w:rFonts w:ascii="Times New Roman" w:hAnsi="Times New Roman" w:cs="Times New Roman"/>
+          <w:color w:val="auto"/>
+          <w:sz w:val="24"/>
+          <w:szCs w:val="24"/>
+        </w:rPr>
+        <w:t xml:space="preserve"> satisfies the central educational design: simulated sensor data can be transmitted, stored locally and visualized with free tools. The first-delivery artifacts are present, and the current dataset is internally consistent. The project should be described as implemented </w:t>
+      </w:r>
+      <w:r>
+        <w:rPr>
+          <w:rFonts w:ascii="Times New Roman" w:hAnsi="Times New Roman" w:cs="Times New Roman"/>
+          <w:color w:val="auto"/>
+          <w:sz w:val="24"/>
+          <w:szCs w:val="24"/>
+        </w:rPr>
+        <w:lastRenderedPageBreak/>
+        <w:t>with outstanding validation and submission corrections, rather than fully complete or error-free. This report records the checks and remaining work; it does not certify an instructor grade, submission timing or completion of the final presentation.</w:t>
       </w:r>
     </w:p>
     <w:p>
@@ -5527,21 +6748,1260 @@
           <w:sz w:val="24"/>
           <w:szCs w:val="24"/>
         </w:rPr>
-        <w:t>Verification logs and structured results are retained under tmp/delivery</w:t>
-      </w:r>
-      <w:r>
-        <w:rPr>
-          <w:rFonts w:ascii="Times New Roman" w:hAnsi="Times New Roman" w:cs="Times New Roman"/>
-          <w:color w:val="auto"/>
-          <w:sz w:val="24"/>
-          <w:szCs w:val="24"/>
-        </w:rPr>
-        <w:t xml:space="preserve">. </w:t>
+        <w:t xml:space="preserve">Verification logs and structured results are retained under </w:t>
+      </w:r>
+      <w:proofErr w:type="spellStart"/>
+      <w:r>
+        <w:rPr>
+          <w:rFonts w:ascii="Times New Roman" w:hAnsi="Times New Roman" w:cs="Times New Roman"/>
+          <w:color w:val="auto"/>
+          <w:sz w:val="24"/>
+          <w:szCs w:val="24"/>
+        </w:rPr>
+        <w:t>tmp</w:t>
+      </w:r>
+      <w:proofErr w:type="spellEnd"/>
+      <w:r>
+        <w:rPr>
+          <w:rFonts w:ascii="Times New Roman" w:hAnsi="Times New Roman" w:cs="Times New Roman"/>
+          <w:color w:val="auto"/>
+          <w:sz w:val="24"/>
+          <w:szCs w:val="24"/>
+        </w:rPr>
+        <w:t xml:space="preserve">/delivery. </w:t>
+      </w:r>
+    </w:p>
+    <w:p>
+      <w:pPr>
+        <w:pStyle w:val="Heading1"/>
+        <w:pageBreakBefore/>
+        <w:spacing w:line="276" w:lineRule="auto"/>
+        <w:rPr>
+          <w:rFonts w:ascii="Times New Roman" w:hAnsi="Times New Roman" w:cs="Times New Roman"/>
+          <w:color w:val="auto"/>
+          <w:sz w:val="24"/>
+          <w:szCs w:val="24"/>
+        </w:rPr>
+      </w:pPr>
+      <w:r>
+        <w:rPr>
+          <w:rFonts w:ascii="Times New Roman" w:hAnsi="Times New Roman" w:cs="Times New Roman"/>
+          <w:color w:val="auto"/>
+          <w:sz w:val="24"/>
+          <w:szCs w:val="24"/>
+        </w:rPr>
+        <w:lastRenderedPageBreak/>
+        <w:t>9. Current application and chart assessment</w:t>
+      </w:r>
+    </w:p>
+    <w:p>
+      <w:pPr>
+        <w:spacing w:line="276" w:lineRule="auto"/>
+        <w:rPr>
+          <w:rFonts w:ascii="Times New Roman" w:hAnsi="Times New Roman" w:cs="Times New Roman"/>
+          <w:color w:val="auto"/>
+          <w:sz w:val="24"/>
+          <w:szCs w:val="24"/>
+        </w:rPr>
+      </w:pPr>
+      <w:r>
+        <w:rPr>
+          <w:rFonts w:ascii="Times New Roman" w:hAnsi="Times New Roman" w:cs="Times New Roman"/>
+          <w:color w:val="auto"/>
+          <w:sz w:val="24"/>
+          <w:szCs w:val="24"/>
+        </w:rPr>
+        <w:t>Review and screenshot capture: 22 September 2026. This section supersedes earlier dashboard descriptions and replaces the duplicate static figures with current application evidence. Screenshots show the running application and its actual repository state; counts and freshness can change while publishers are active.</w:t>
+      </w:r>
+    </w:p>
+    <w:p>
+      <w:pPr>
+        <w:pStyle w:val="Heading2"/>
+        <w:spacing w:line="276" w:lineRule="auto"/>
+        <w:rPr>
+          <w:rFonts w:ascii="Times New Roman" w:hAnsi="Times New Roman" w:cs="Times New Roman"/>
+          <w:color w:val="auto"/>
+          <w:sz w:val="24"/>
+          <w:szCs w:val="24"/>
+        </w:rPr>
+      </w:pPr>
+      <w:r>
+        <w:rPr>
+          <w:rFonts w:ascii="Times New Roman" w:hAnsi="Times New Roman" w:cs="Times New Roman"/>
+          <w:color w:val="auto"/>
+          <w:sz w:val="24"/>
+          <w:szCs w:val="24"/>
+        </w:rPr>
+        <w:t>Environment Trend and Analytics: corrections</w:t>
+      </w:r>
+    </w:p>
+    <w:p>
+      <w:pPr>
+        <w:pStyle w:val="ListBullet"/>
+        <w:spacing w:line="276" w:lineRule="auto"/>
+        <w:rPr>
+          <w:rFonts w:ascii="Times New Roman" w:hAnsi="Times New Roman" w:cs="Times New Roman"/>
+          <w:color w:val="auto"/>
+          <w:sz w:val="24"/>
+          <w:szCs w:val="24"/>
+        </w:rPr>
+      </w:pPr>
+      <w:r>
+        <w:rPr>
+          <w:rFonts w:ascii="Times New Roman" w:hAnsi="Times New Roman" w:cs="Times New Roman"/>
+          <w:color w:val="auto"/>
+          <w:sz w:val="24"/>
+          <w:szCs w:val="24"/>
+        </w:rPr>
+        <w:t>Large histories: removed the Overview crash caused by referencing a zone column after aggregation. Charts sample large display datasets while tables and CSV exports retain loaded observations.</w:t>
+      </w:r>
+    </w:p>
+    <w:p>
+      <w:pPr>
+        <w:pStyle w:val="ListBullet"/>
+        <w:spacing w:line="276" w:lineRule="auto"/>
+        <w:rPr>
+          <w:rFonts w:ascii="Times New Roman" w:hAnsi="Times New Roman" w:cs="Times New Roman"/>
+          <w:color w:val="auto"/>
+          <w:sz w:val="24"/>
+          <w:szCs w:val="24"/>
+        </w:rPr>
+      </w:pPr>
+      <w:r>
+        <w:rPr>
+          <w:rFonts w:ascii="Times New Roman" w:hAnsi="Times New Roman" w:cs="Times New Roman"/>
+          <w:color w:val="auto"/>
+          <w:sz w:val="24"/>
+          <w:szCs w:val="24"/>
+        </w:rPr>
+        <w:t>Meaningful averages: Overview and Analytics Overall average now compute five-minute means within each reporting zone, then weight reporting zones equally. Missing zones are excluded, not treated as zero.</w:t>
+      </w:r>
+    </w:p>
+    <w:p>
+      <w:pPr>
+        <w:pStyle w:val="ListBullet"/>
+        <w:spacing w:line="276" w:lineRule="auto"/>
+        <w:rPr>
+          <w:rFonts w:ascii="Times New Roman" w:hAnsi="Times New Roman" w:cs="Times New Roman"/>
+          <w:color w:val="auto"/>
+          <w:sz w:val="24"/>
+          <w:szCs w:val="24"/>
+        </w:rPr>
+      </w:pPr>
+      <w:r>
+        <w:rPr>
+          <w:rFonts w:ascii="Times New Roman" w:hAnsi="Times New Roman" w:cs="Times New Roman"/>
+          <w:color w:val="auto"/>
+          <w:sz w:val="24"/>
+          <w:szCs w:val="24"/>
+        </w:rPr>
+        <w:t xml:space="preserve">Gaps and missing values: gaps longer than 20 minutes remain disconnected, including after display sampling. Missing values in one metric no longer </w:t>
+      </w:r>
+      <w:proofErr w:type="gramStart"/>
+      <w:r>
+        <w:rPr>
+          <w:rFonts w:ascii="Times New Roman" w:hAnsi="Times New Roman" w:cs="Times New Roman"/>
+          <w:color w:val="auto"/>
+          <w:sz w:val="24"/>
+          <w:szCs w:val="24"/>
+        </w:rPr>
+        <w:t>suppress</w:t>
+      </w:r>
+      <w:proofErr w:type="gramEnd"/>
+      <w:r>
+        <w:rPr>
+          <w:rFonts w:ascii="Times New Roman" w:hAnsi="Times New Roman" w:cs="Times New Roman"/>
+          <w:color w:val="auto"/>
+          <w:sz w:val="24"/>
+          <w:szCs w:val="24"/>
+        </w:rPr>
+        <w:t xml:space="preserve"> valid values in another.</w:t>
+      </w:r>
+    </w:p>
+    <w:p>
+      <w:pPr>
+        <w:pStyle w:val="ListBullet"/>
+        <w:spacing w:line="276" w:lineRule="auto"/>
+        <w:rPr>
+          <w:rFonts w:ascii="Times New Roman" w:hAnsi="Times New Roman" w:cs="Times New Roman"/>
+          <w:color w:val="auto"/>
+          <w:sz w:val="24"/>
+          <w:szCs w:val="24"/>
+        </w:rPr>
+      </w:pPr>
+      <w:r>
+        <w:rPr>
+          <w:rFonts w:ascii="Times New Roman" w:hAnsi="Times New Roman" w:cs="Times New Roman"/>
+          <w:color w:val="auto"/>
+          <w:sz w:val="24"/>
+          <w:szCs w:val="24"/>
+        </w:rPr>
+        <w:t>Units and time: temperature and humidity have separate labeled axes. Chart axes and hover times explicitly use UTC; Analytics availability summaries include calendar dates and Eastern time. pH ticks retain decimal precision.</w:t>
+      </w:r>
+    </w:p>
+    <w:p>
+      <w:pPr>
+        <w:pStyle w:val="ListBullet"/>
+        <w:spacing w:line="276" w:lineRule="auto"/>
+        <w:rPr>
+          <w:rFonts w:ascii="Times New Roman" w:hAnsi="Times New Roman" w:cs="Times New Roman"/>
+          <w:color w:val="auto"/>
+          <w:sz w:val="24"/>
+          <w:szCs w:val="24"/>
+        </w:rPr>
+      </w:pPr>
+      <w:r>
+        <w:rPr>
+          <w:rFonts w:ascii="Times New Roman" w:hAnsi="Times New Roman" w:cs="Times New Roman"/>
+          <w:color w:val="auto"/>
+          <w:sz w:val="24"/>
+          <w:szCs w:val="24"/>
+        </w:rPr>
+        <w:t>Controls and interpretation: Analytics Reset now restores defaults without a session-state exception. Eight dash patterns distinguish configured zones. Overview explains that red triangles mean an alert in any core metric, not necessarily the metric under the marker.</w:t>
+      </w:r>
+    </w:p>
+    <w:p>
+      <w:pPr>
+        <w:pStyle w:val="Heading2"/>
+        <w:spacing w:line="276" w:lineRule="auto"/>
+        <w:rPr>
+          <w:rFonts w:ascii="Times New Roman" w:hAnsi="Times New Roman" w:cs="Times New Roman"/>
+          <w:color w:val="auto"/>
+          <w:sz w:val="24"/>
+          <w:szCs w:val="24"/>
+        </w:rPr>
+      </w:pPr>
+      <w:r>
+        <w:rPr>
+          <w:rFonts w:ascii="Times New Roman" w:hAnsi="Times New Roman" w:cs="Times New Roman"/>
+          <w:color w:val="auto"/>
+          <w:sz w:val="24"/>
+          <w:szCs w:val="24"/>
+        </w:rPr>
+        <w:t>Verification and limits</w:t>
+      </w:r>
+    </w:p>
+    <w:p>
+      <w:pPr>
+        <w:spacing w:line="276" w:lineRule="auto"/>
+        <w:rPr>
+          <w:rFonts w:ascii="Times New Roman" w:hAnsi="Times New Roman" w:cs="Times New Roman"/>
+          <w:color w:val="auto"/>
+          <w:sz w:val="24"/>
+          <w:szCs w:val="24"/>
+        </w:rPr>
+      </w:pPr>
+      <w:r>
+        <w:rPr>
+          <w:rFonts w:ascii="Times New Roman" w:hAnsi="Times New Roman" w:cs="Times New Roman"/>
+          <w:color w:val="auto"/>
+          <w:sz w:val="24"/>
+          <w:szCs w:val="24"/>
+        </w:rPr>
+        <w:t>All 26 automated tests passed, including five chart regression tests. The six application pages were opened and captured without page exceptions. The forecast page returned live outdoor weather for Bowie, Maryland. No irrigation request was submitted during this review.</w:t>
+      </w:r>
+    </w:p>
+    <w:p>
+      <w:pPr>
+        <w:spacing w:line="276" w:lineRule="auto"/>
+        <w:rPr>
+          <w:rFonts w:ascii="Times New Roman" w:hAnsi="Times New Roman" w:cs="Times New Roman"/>
+          <w:color w:val="auto"/>
+          <w:sz w:val="24"/>
+          <w:szCs w:val="24"/>
+        </w:rPr>
+      </w:pPr>
+      <w:r>
+        <w:rPr>
+          <w:rFonts w:ascii="Times New Roman" w:hAnsi="Times New Roman" w:cs="Times New Roman"/>
+          <w:color w:val="auto"/>
+          <w:sz w:val="24"/>
+          <w:szCs w:val="24"/>
+        </w:rPr>
+        <w:t>At 16:49 UTC, the loaded multi-zone snapshot contained 442 readings across eight zones: 433 simulator and nine seeded samples. Nutrient and pH values were absent in 328 readings. These are simulated observations, not evidence of physical greenhouse measurements. Display sampling may omit individual events; inspect the full filtered data for exact values.</w:t>
+      </w:r>
+    </w:p>
+    <w:p>
+      <w:pPr>
+        <w:pStyle w:val="Evidence"/>
+        <w:spacing w:line="276" w:lineRule="auto"/>
+        <w:rPr>
+          <w:rFonts w:ascii="Times New Roman" w:hAnsi="Times New Roman" w:cs="Times New Roman"/>
+          <w:color w:val="auto"/>
+          <w:sz w:val="24"/>
+          <w:szCs w:val="24"/>
+        </w:rPr>
+      </w:pPr>
+      <w:r>
+        <w:rPr>
+          <w:rFonts w:ascii="Times New Roman" w:hAnsi="Times New Roman" w:cs="Times New Roman"/>
+          <w:color w:val="auto"/>
+          <w:sz w:val="24"/>
+          <w:szCs w:val="24"/>
+        </w:rPr>
+        <w:t xml:space="preserve">Remaining interpretation limits: aggregate target bands show the intersection of configured zone ranges and cannot certify each zone as healthy. Overview may display last-known values when sources are stale. Analytics summary averages weight records, while </w:t>
+      </w:r>
+      <w:proofErr w:type="gramStart"/>
+      <w:r>
+        <w:rPr>
+          <w:rFonts w:ascii="Times New Roman" w:hAnsi="Times New Roman" w:cs="Times New Roman"/>
+          <w:color w:val="auto"/>
+          <w:sz w:val="24"/>
+          <w:szCs w:val="24"/>
+        </w:rPr>
+        <w:t>Overall</w:t>
+      </w:r>
+      <w:proofErr w:type="gramEnd"/>
+      <w:r>
+        <w:rPr>
+          <w:rFonts w:ascii="Times New Roman" w:hAnsi="Times New Roman" w:cs="Times New Roman"/>
+          <w:color w:val="auto"/>
+          <w:sz w:val="24"/>
+          <w:szCs w:val="24"/>
+        </w:rPr>
+        <w:t xml:space="preserve"> average charts weight reporting zones within five-minute bins. The five-day outdoor forecast is separate from indoor telemetry.</w:t>
+      </w:r>
+    </w:p>
+    <w:p>
+      <w:pPr>
+        <w:pStyle w:val="Heading1"/>
+        <w:pageBreakBefore/>
+        <w:spacing w:line="276" w:lineRule="auto"/>
+        <w:rPr>
+          <w:rFonts w:ascii="Times New Roman" w:hAnsi="Times New Roman" w:cs="Times New Roman"/>
+          <w:color w:val="auto"/>
+          <w:sz w:val="24"/>
+          <w:szCs w:val="24"/>
+        </w:rPr>
+      </w:pPr>
+      <w:r>
+        <w:rPr>
+          <w:rFonts w:ascii="Times New Roman" w:hAnsi="Times New Roman" w:cs="Times New Roman"/>
+          <w:color w:val="auto"/>
+          <w:sz w:val="24"/>
+          <w:szCs w:val="24"/>
+        </w:rPr>
+        <w:lastRenderedPageBreak/>
+        <w:t>Current Overview</w:t>
+      </w:r>
+    </w:p>
+    <w:p>
+      <w:pPr>
+        <w:keepNext/>
+        <w:spacing w:line="276" w:lineRule="auto"/>
+        <w:jc w:val="center"/>
+        <w:rPr>
+          <w:rFonts w:ascii="Times New Roman" w:hAnsi="Times New Roman" w:cs="Times New Roman"/>
+          <w:color w:val="auto"/>
+          <w:sz w:val="24"/>
+          <w:szCs w:val="24"/>
+        </w:rPr>
+      </w:pPr>
+      <w:r>
+        <w:rPr>
+          <w:rFonts w:ascii="Times New Roman" w:hAnsi="Times New Roman" w:cs="Times New Roman"/>
+          <w:noProof/>
+          <w:color w:val="auto"/>
+          <w:sz w:val="24"/>
+          <w:szCs w:val="24"/>
+        </w:rPr>
+        <w:drawing>
+          <wp:inline distT="0" distB="0" distL="0" distR="0" wp14:anchorId="44373A61" wp14:editId="15C778FA">
+            <wp:extent cx="4716858" cy="6217919"/>
+            <wp:effectExtent l="0" t="0" r="0" b="0"/>
+            <wp:docPr id="4" name="Picture 4" descr="Figure 5. Operations Overview: current repository values, source freshness, environmental trend, primary zone health and simulated irrigation controls."/>
+            <wp:cNvGraphicFramePr>
+              <a:graphicFrameLocks xmlns:a="http://schemas.openxmlformats.org/drawingml/2006/main" noChangeAspect="1"/>
+            </wp:cNvGraphicFramePr>
+            <a:graphic xmlns:a="http://schemas.openxmlformats.org/drawingml/2006/main">
+              <a:graphicData uri="http://schemas.openxmlformats.org/drawingml/2006/picture">
+                <pic:pic xmlns:pic="http://schemas.openxmlformats.org/drawingml/2006/picture">
+                  <pic:nvPicPr>
+                    <pic:cNvPr id="0" name="overview.png"/>
+                    <pic:cNvPicPr/>
+                  </pic:nvPicPr>
+                  <pic:blipFill>
+                    <a:blip r:embed="rId11"/>
+                    <a:stretch>
+                      <a:fillRect/>
+                    </a:stretch>
+                  </pic:blipFill>
+                  <pic:spPr>
+                    <a:xfrm>
+                      <a:off x="0" y="0"/>
+                      <a:ext cx="4716858" cy="6217919"/>
+                    </a:xfrm>
+                    <a:prstGeom prst="rect">
+                      <a:avLst/>
+                    </a:prstGeom>
+                  </pic:spPr>
+                </pic:pic>
+              </a:graphicData>
+            </a:graphic>
+          </wp:inline>
+        </w:drawing>
+      </w:r>
+    </w:p>
+    <w:p>
+      <w:pPr>
+        <w:pStyle w:val="Evidence"/>
+        <w:keepLines/>
+        <w:spacing w:line="276" w:lineRule="auto"/>
+        <w:rPr>
+          <w:rFonts w:ascii="Times New Roman" w:hAnsi="Times New Roman" w:cs="Times New Roman"/>
+          <w:color w:val="auto"/>
+          <w:sz w:val="24"/>
+          <w:szCs w:val="24"/>
+        </w:rPr>
+      </w:pPr>
+      <w:r>
+        <w:rPr>
+          <w:rFonts w:ascii="Times New Roman" w:hAnsi="Times New Roman" w:cs="Times New Roman"/>
+          <w:color w:val="auto"/>
+          <w:sz w:val="24"/>
+          <w:szCs w:val="24"/>
+        </w:rPr>
+        <w:t>Figure 5. Operations Overview: current repository values, source freshness, environmental trend, primary zone health and simulated irrigation controls.</w:t>
+      </w:r>
+    </w:p>
+    <w:p>
+      <w:pPr>
+        <w:pStyle w:val="Evidence"/>
+        <w:spacing w:line="276" w:lineRule="auto"/>
+        <w:rPr>
+          <w:rFonts w:ascii="Times New Roman" w:hAnsi="Times New Roman" w:cs="Times New Roman"/>
+          <w:color w:val="auto"/>
+          <w:sz w:val="24"/>
+          <w:szCs w:val="24"/>
+        </w:rPr>
+      </w:pPr>
+      <w:r>
+        <w:rPr>
+          <w:rFonts w:ascii="Times New Roman" w:hAnsi="Times New Roman" w:cs="Times New Roman"/>
+          <w:color w:val="auto"/>
+          <w:sz w:val="24"/>
+          <w:szCs w:val="24"/>
+        </w:rPr>
+        <w:t>Freshness and source status are part of the evidence. An Offline or Degraded state indicates missing recent telemetry; it is not a failure to load the dashboard. The values shown are last-known or simulated measurements.</w:t>
+      </w:r>
+    </w:p>
+    <w:p>
+      <w:pPr>
+        <w:pStyle w:val="Heading1"/>
+        <w:pageBreakBefore/>
+        <w:spacing w:line="276" w:lineRule="auto"/>
+        <w:rPr>
+          <w:rFonts w:ascii="Times New Roman" w:hAnsi="Times New Roman" w:cs="Times New Roman"/>
+          <w:color w:val="auto"/>
+          <w:sz w:val="24"/>
+          <w:szCs w:val="24"/>
+        </w:rPr>
+      </w:pPr>
+      <w:r>
+        <w:rPr>
+          <w:rFonts w:ascii="Times New Roman" w:hAnsi="Times New Roman" w:cs="Times New Roman"/>
+          <w:color w:val="auto"/>
+          <w:sz w:val="24"/>
+          <w:szCs w:val="24"/>
+        </w:rPr>
+        <w:lastRenderedPageBreak/>
+        <w:t>Environment Trend: detailed view</w:t>
+      </w:r>
+    </w:p>
+    <w:p>
+      <w:pPr>
+        <w:keepNext/>
+        <w:spacing w:line="276" w:lineRule="auto"/>
+        <w:jc w:val="center"/>
+        <w:rPr>
+          <w:rFonts w:ascii="Times New Roman" w:hAnsi="Times New Roman" w:cs="Times New Roman"/>
+          <w:color w:val="auto"/>
+          <w:sz w:val="24"/>
+          <w:szCs w:val="24"/>
+        </w:rPr>
+      </w:pPr>
+      <w:r>
+        <w:rPr>
+          <w:rFonts w:ascii="Times New Roman" w:hAnsi="Times New Roman" w:cs="Times New Roman"/>
+          <w:noProof/>
+          <w:color w:val="auto"/>
+          <w:sz w:val="24"/>
+          <w:szCs w:val="24"/>
+        </w:rPr>
+        <w:drawing>
+          <wp:inline distT="0" distB="0" distL="0" distR="0" wp14:anchorId="2078CB37" wp14:editId="5518BFE4">
+            <wp:extent cx="5943600" cy="4666411"/>
+            <wp:effectExtent l="0" t="0" r="0" b="0"/>
+            <wp:docPr id="5" name="Picture 5" descr="Figure 6. Corrected Environment Trend with separate temperature and humidity axes, five-minute zone means, configured target bands and visible observation gaps."/>
+            <wp:cNvGraphicFramePr>
+              <a:graphicFrameLocks xmlns:a="http://schemas.openxmlformats.org/drawingml/2006/main" noChangeAspect="1"/>
+            </wp:cNvGraphicFramePr>
+            <a:graphic xmlns:a="http://schemas.openxmlformats.org/drawingml/2006/main">
+              <a:graphicData uri="http://schemas.openxmlformats.org/drawingml/2006/picture">
+                <pic:pic xmlns:pic="http://schemas.openxmlformats.org/drawingml/2006/picture">
+                  <pic:nvPicPr>
+                    <pic:cNvPr id="0" name="environment-trend.png"/>
+                    <pic:cNvPicPr/>
+                  </pic:nvPicPr>
+                  <pic:blipFill>
+                    <a:blip r:embed="rId12"/>
+                    <a:stretch>
+                      <a:fillRect/>
+                    </a:stretch>
+                  </pic:blipFill>
+                  <pic:spPr>
+                    <a:xfrm>
+                      <a:off x="0" y="0"/>
+                      <a:ext cx="5943600" cy="4666411"/>
+                    </a:xfrm>
+                    <a:prstGeom prst="rect">
+                      <a:avLst/>
+                    </a:prstGeom>
+                  </pic:spPr>
+                </pic:pic>
+              </a:graphicData>
+            </a:graphic>
+          </wp:inline>
+        </w:drawing>
+      </w:r>
+    </w:p>
+    <w:p>
+      <w:pPr>
+        <w:pStyle w:val="Evidence"/>
+        <w:keepLines/>
+        <w:spacing w:line="276" w:lineRule="auto"/>
+        <w:rPr>
+          <w:rFonts w:ascii="Times New Roman" w:hAnsi="Times New Roman" w:cs="Times New Roman"/>
+          <w:color w:val="auto"/>
+          <w:sz w:val="24"/>
+          <w:szCs w:val="24"/>
+        </w:rPr>
+      </w:pPr>
+      <w:r>
+        <w:rPr>
+          <w:rFonts w:ascii="Times New Roman" w:hAnsi="Times New Roman" w:cs="Times New Roman"/>
+          <w:color w:val="auto"/>
+          <w:sz w:val="24"/>
+          <w:szCs w:val="24"/>
+        </w:rPr>
+        <w:t>Figure 6. Corrected Environment Trend with separate temperature and humidity axes, five-minute zone means, configured target bands and visible observation gaps.</w:t>
+      </w:r>
+    </w:p>
+    <w:p>
+      <w:pPr>
+        <w:spacing w:line="276" w:lineRule="auto"/>
+        <w:rPr>
+          <w:rFonts w:ascii="Times New Roman" w:hAnsi="Times New Roman" w:cs="Times New Roman"/>
+          <w:color w:val="auto"/>
+          <w:sz w:val="24"/>
+          <w:szCs w:val="24"/>
+        </w:rPr>
+      </w:pPr>
+      <w:r>
+        <w:rPr>
+          <w:rFonts w:ascii="Times New Roman" w:hAnsi="Times New Roman" w:cs="Times New Roman"/>
+          <w:color w:val="auto"/>
+          <w:sz w:val="24"/>
+          <w:szCs w:val="24"/>
+        </w:rPr>
+        <w:t>Read temperature against the left axis and humidity against the right. Blank intervals indicate a lack of observations rather than a constant environment. Red triangles indicate that at least one recorded core-metric alert occurred in the time bin. The band represents shared configured targets for the selected zones.</w:t>
+      </w:r>
+    </w:p>
+    <w:p>
+      <w:pPr>
+        <w:pStyle w:val="Evidence"/>
+        <w:spacing w:line="276" w:lineRule="auto"/>
+        <w:rPr>
+          <w:rFonts w:ascii="Times New Roman" w:hAnsi="Times New Roman" w:cs="Times New Roman"/>
+          <w:color w:val="auto"/>
+          <w:sz w:val="24"/>
+          <w:szCs w:val="24"/>
+        </w:rPr>
+      </w:pPr>
+      <w:r>
+        <w:rPr>
+          <w:rFonts w:ascii="Times New Roman" w:hAnsi="Times New Roman" w:cs="Times New Roman"/>
+          <w:color w:val="auto"/>
+          <w:sz w:val="24"/>
+          <w:szCs w:val="24"/>
+        </w:rPr>
+        <w:t>Soil moisture, nutrient level and pH remain selectable. Where optional measurements are absent, the application presents an explicit no-measurements message rather than inventing values.</w:t>
+      </w:r>
+    </w:p>
+    <w:p>
+      <w:pPr>
+        <w:pStyle w:val="Heading1"/>
+        <w:pageBreakBefore/>
+        <w:spacing w:line="276" w:lineRule="auto"/>
+        <w:rPr>
+          <w:rFonts w:ascii="Times New Roman" w:hAnsi="Times New Roman" w:cs="Times New Roman"/>
+          <w:color w:val="auto"/>
+          <w:sz w:val="24"/>
+          <w:szCs w:val="24"/>
+        </w:rPr>
+      </w:pPr>
+      <w:r>
+        <w:rPr>
+          <w:rFonts w:ascii="Times New Roman" w:hAnsi="Times New Roman" w:cs="Times New Roman"/>
+          <w:color w:val="auto"/>
+          <w:sz w:val="24"/>
+          <w:szCs w:val="24"/>
+        </w:rPr>
+        <w:lastRenderedPageBreak/>
+        <w:t>Analytics: comparison and filtering</w:t>
+      </w:r>
+    </w:p>
+    <w:p>
+      <w:pPr>
+        <w:keepNext/>
+        <w:spacing w:line="276" w:lineRule="auto"/>
+        <w:jc w:val="center"/>
+        <w:rPr>
+          <w:rFonts w:ascii="Times New Roman" w:hAnsi="Times New Roman" w:cs="Times New Roman"/>
+          <w:color w:val="auto"/>
+          <w:sz w:val="24"/>
+          <w:szCs w:val="24"/>
+        </w:rPr>
+      </w:pPr>
+      <w:r>
+        <w:rPr>
+          <w:rFonts w:ascii="Times New Roman" w:hAnsi="Times New Roman" w:cs="Times New Roman"/>
+          <w:noProof/>
+          <w:color w:val="auto"/>
+          <w:sz w:val="24"/>
+          <w:szCs w:val="24"/>
+        </w:rPr>
+        <w:drawing>
+          <wp:inline distT="0" distB="0" distL="0" distR="0" wp14:anchorId="31866F89" wp14:editId="0D71AF38">
+            <wp:extent cx="5943600" cy="3301626"/>
+            <wp:effectExtent l="0" t="0" r="0" b="0"/>
+            <wp:docPr id="6" name="Picture 6" descr="Figure 7. Analytics comparison view: period and metric filters, UTC axes, zone dash legend, summary statistics and dated Eastern availability range."/>
+            <wp:cNvGraphicFramePr>
+              <a:graphicFrameLocks xmlns:a="http://schemas.openxmlformats.org/drawingml/2006/main" noChangeAspect="1"/>
+            </wp:cNvGraphicFramePr>
+            <a:graphic xmlns:a="http://schemas.openxmlformats.org/drawingml/2006/main">
+              <a:graphicData uri="http://schemas.openxmlformats.org/drawingml/2006/picture">
+                <pic:pic xmlns:pic="http://schemas.openxmlformats.org/drawingml/2006/picture">
+                  <pic:nvPicPr>
+                    <pic:cNvPr id="0" name="analytics-chart.png"/>
+                    <pic:cNvPicPr/>
+                  </pic:nvPicPr>
+                  <pic:blipFill>
+                    <a:blip r:embed="rId13"/>
+                    <a:stretch>
+                      <a:fillRect/>
+                    </a:stretch>
+                  </pic:blipFill>
+                  <pic:spPr>
+                    <a:xfrm>
+                      <a:off x="0" y="0"/>
+                      <a:ext cx="5943600" cy="3301626"/>
+                    </a:xfrm>
+                    <a:prstGeom prst="rect">
+                      <a:avLst/>
+                    </a:prstGeom>
+                  </pic:spPr>
+                </pic:pic>
+              </a:graphicData>
+            </a:graphic>
+          </wp:inline>
+        </w:drawing>
+      </w:r>
+    </w:p>
+    <w:p>
+      <w:pPr>
+        <w:pStyle w:val="Evidence"/>
+        <w:keepLines/>
+        <w:spacing w:line="276" w:lineRule="auto"/>
+        <w:rPr>
+          <w:rFonts w:ascii="Times New Roman" w:hAnsi="Times New Roman" w:cs="Times New Roman"/>
+          <w:color w:val="auto"/>
+          <w:sz w:val="24"/>
+          <w:szCs w:val="24"/>
+        </w:rPr>
+      </w:pPr>
+      <w:r>
+        <w:rPr>
+          <w:rFonts w:ascii="Times New Roman" w:hAnsi="Times New Roman" w:cs="Times New Roman"/>
+          <w:color w:val="auto"/>
+          <w:sz w:val="24"/>
+          <w:szCs w:val="24"/>
+        </w:rPr>
+        <w:t>Figure 7. Analytics comparison view: period and metric filters, UTC axes, zone dash legend, summary statistics and dated Eastern availability range.</w:t>
+      </w:r>
+    </w:p>
+    <w:p>
+      <w:pPr>
+        <w:spacing w:line="276" w:lineRule="auto"/>
+        <w:rPr>
+          <w:rFonts w:ascii="Times New Roman" w:hAnsi="Times New Roman" w:cs="Times New Roman"/>
+          <w:color w:val="auto"/>
+          <w:sz w:val="24"/>
+          <w:szCs w:val="24"/>
+        </w:rPr>
+      </w:pPr>
+      <w:r>
+        <w:rPr>
+          <w:rFonts w:ascii="Times New Roman" w:hAnsi="Times New Roman" w:cs="Times New Roman"/>
+          <w:color w:val="auto"/>
+          <w:sz w:val="24"/>
+          <w:szCs w:val="24"/>
+        </w:rPr>
+        <w:t>Compare zones retains each zone's observations. Overall average aligns asynchronous publishers to five-minute bins before averaging zones. Summary cards and comparison tables use all matching loaded records; they can differ from equal-zone chart means when reporting frequencies differ.</w:t>
+      </w:r>
+    </w:p>
+    <w:p>
+      <w:pPr>
+        <w:pStyle w:val="Evidence"/>
+        <w:spacing w:line="276" w:lineRule="auto"/>
+        <w:rPr>
+          <w:rFonts w:ascii="Times New Roman" w:hAnsi="Times New Roman" w:cs="Times New Roman"/>
+          <w:color w:val="auto"/>
+          <w:sz w:val="24"/>
+          <w:szCs w:val="24"/>
+        </w:rPr>
+      </w:pPr>
+      <w:r>
+        <w:rPr>
+          <w:rFonts w:ascii="Times New Roman" w:hAnsi="Times New Roman" w:cs="Times New Roman"/>
+          <w:color w:val="auto"/>
+          <w:sz w:val="24"/>
+          <w:szCs w:val="24"/>
+        </w:rPr>
+        <w:t>Assessment: units and gaps are now explicit, and Reset is functional. Dense overlapping series are still easier to inspect using the Zone filter or a shorter period. The chart is a monitoring aid; use the filtered CSV for exact event-level analysis.</w:t>
+      </w:r>
+    </w:p>
+    <w:p>
+      <w:pPr>
+        <w:pStyle w:val="Heading1"/>
+        <w:pageBreakBefore/>
+        <w:spacing w:line="276" w:lineRule="auto"/>
+        <w:rPr>
+          <w:rFonts w:ascii="Times New Roman" w:hAnsi="Times New Roman" w:cs="Times New Roman"/>
+          <w:color w:val="auto"/>
+          <w:sz w:val="24"/>
+          <w:szCs w:val="24"/>
+        </w:rPr>
+      </w:pPr>
+      <w:r>
+        <w:rPr>
+          <w:rFonts w:ascii="Times New Roman" w:hAnsi="Times New Roman" w:cs="Times New Roman"/>
+          <w:color w:val="auto"/>
+          <w:sz w:val="24"/>
+          <w:szCs w:val="24"/>
+        </w:rPr>
+        <w:lastRenderedPageBreak/>
+        <w:t>Zones: current crop directory</w:t>
+      </w:r>
+    </w:p>
+    <w:p>
+      <w:pPr>
+        <w:keepNext/>
+        <w:spacing w:line="276" w:lineRule="auto"/>
+        <w:jc w:val="center"/>
+        <w:rPr>
+          <w:rFonts w:ascii="Times New Roman" w:hAnsi="Times New Roman" w:cs="Times New Roman"/>
+          <w:color w:val="auto"/>
+          <w:sz w:val="24"/>
+          <w:szCs w:val="24"/>
+        </w:rPr>
+      </w:pPr>
+      <w:r>
+        <w:rPr>
+          <w:rFonts w:ascii="Times New Roman" w:hAnsi="Times New Roman" w:cs="Times New Roman"/>
+          <w:noProof/>
+          <w:color w:val="auto"/>
+          <w:sz w:val="24"/>
+          <w:szCs w:val="24"/>
+        </w:rPr>
+        <w:drawing>
+          <wp:inline distT="0" distB="0" distL="0" distR="0" wp14:anchorId="5D5B9FA7" wp14:editId="1F08BF3C">
+            <wp:extent cx="4811939" cy="6217919"/>
+            <wp:effectExtent l="0" t="0" r="0" b="0"/>
+            <wp:docPr id="7" name="Picture 7" descr="Figure 8. Current eight-zone crop directory with matching crop images, observed conditions and freshness labels."/>
+            <wp:cNvGraphicFramePr>
+              <a:graphicFrameLocks xmlns:a="http://schemas.openxmlformats.org/drawingml/2006/main" noChangeAspect="1"/>
+            </wp:cNvGraphicFramePr>
+            <a:graphic xmlns:a="http://schemas.openxmlformats.org/drawingml/2006/main">
+              <a:graphicData uri="http://schemas.openxmlformats.org/drawingml/2006/picture">
+                <pic:pic xmlns:pic="http://schemas.openxmlformats.org/drawingml/2006/picture">
+                  <pic:nvPicPr>
+                    <pic:cNvPr id="0" name="zones-directory.png"/>
+                    <pic:cNvPicPr/>
+                  </pic:nvPicPr>
+                  <pic:blipFill>
+                    <a:blip r:embed="rId14"/>
+                    <a:stretch>
+                      <a:fillRect/>
+                    </a:stretch>
+                  </pic:blipFill>
+                  <pic:spPr>
+                    <a:xfrm>
+                      <a:off x="0" y="0"/>
+                      <a:ext cx="4811939" cy="6217919"/>
+                    </a:xfrm>
+                    <a:prstGeom prst="rect">
+                      <a:avLst/>
+                    </a:prstGeom>
+                  </pic:spPr>
+                </pic:pic>
+              </a:graphicData>
+            </a:graphic>
+          </wp:inline>
+        </w:drawing>
+      </w:r>
+    </w:p>
+    <w:p>
+      <w:pPr>
+        <w:pStyle w:val="Evidence"/>
+        <w:keepLines/>
+        <w:spacing w:line="276" w:lineRule="auto"/>
+        <w:rPr>
+          <w:rFonts w:ascii="Times New Roman" w:hAnsi="Times New Roman" w:cs="Times New Roman"/>
+          <w:color w:val="auto"/>
+          <w:sz w:val="24"/>
+          <w:szCs w:val="24"/>
+        </w:rPr>
+      </w:pPr>
+      <w:r>
+        <w:rPr>
+          <w:rFonts w:ascii="Times New Roman" w:hAnsi="Times New Roman" w:cs="Times New Roman"/>
+          <w:color w:val="auto"/>
+          <w:sz w:val="24"/>
+          <w:szCs w:val="24"/>
+        </w:rPr>
+        <w:t>Figure 8. Current eight-zone crop directory with matching crop images, observed conditions and freshness labels.</w:t>
+      </w:r>
+    </w:p>
+    <w:p>
+      <w:pPr>
+        <w:pStyle w:val="Evidence"/>
+        <w:spacing w:line="276" w:lineRule="auto"/>
+        <w:rPr>
+          <w:rFonts w:ascii="Times New Roman" w:hAnsi="Times New Roman" w:cs="Times New Roman"/>
+          <w:color w:val="auto"/>
+          <w:sz w:val="24"/>
+          <w:szCs w:val="24"/>
+        </w:rPr>
+      </w:pPr>
+      <w:r>
+        <w:rPr>
+          <w:rFonts w:ascii="Times New Roman" w:hAnsi="Times New Roman" w:cs="Times New Roman"/>
+          <w:color w:val="auto"/>
+          <w:sz w:val="24"/>
+          <w:szCs w:val="24"/>
+        </w:rPr>
+        <w:t xml:space="preserve">The directory includes Tomato, Lettuce, Cucumber, Carrot, Corn, Onion, Watermelon and Seedling zones. Stale readings remain historical evidence. Optional </w:t>
+      </w:r>
+      <w:proofErr w:type="gramStart"/>
+      <w:r>
+        <w:rPr>
+          <w:rFonts w:ascii="Times New Roman" w:hAnsi="Times New Roman" w:cs="Times New Roman"/>
+          <w:color w:val="auto"/>
+          <w:sz w:val="24"/>
+          <w:szCs w:val="24"/>
+        </w:rPr>
+        <w:t>nutrient</w:t>
+      </w:r>
+      <w:proofErr w:type="gramEnd"/>
+      <w:r>
+        <w:rPr>
+          <w:rFonts w:ascii="Times New Roman" w:hAnsi="Times New Roman" w:cs="Times New Roman"/>
+          <w:color w:val="auto"/>
+          <w:sz w:val="24"/>
+          <w:szCs w:val="24"/>
+        </w:rPr>
+        <w:t xml:space="preserve"> and pH values are not available in every stored message.</w:t>
+      </w:r>
+    </w:p>
+    <w:p>
+      <w:pPr>
+        <w:pStyle w:val="Heading1"/>
+        <w:pageBreakBefore/>
+        <w:spacing w:line="276" w:lineRule="auto"/>
+        <w:rPr>
+          <w:rFonts w:ascii="Times New Roman" w:hAnsi="Times New Roman" w:cs="Times New Roman"/>
+          <w:color w:val="auto"/>
+          <w:sz w:val="24"/>
+          <w:szCs w:val="24"/>
+        </w:rPr>
+      </w:pPr>
+      <w:r>
+        <w:rPr>
+          <w:rFonts w:ascii="Times New Roman" w:hAnsi="Times New Roman" w:cs="Times New Roman"/>
+          <w:color w:val="auto"/>
+          <w:sz w:val="24"/>
+          <w:szCs w:val="24"/>
+        </w:rPr>
+        <w:lastRenderedPageBreak/>
+        <w:t>Forecast: current outdoor context</w:t>
+      </w:r>
+    </w:p>
+    <w:p>
+      <w:pPr>
+        <w:keepNext/>
+        <w:spacing w:line="276" w:lineRule="auto"/>
+        <w:jc w:val="center"/>
+        <w:rPr>
+          <w:rFonts w:ascii="Times New Roman" w:hAnsi="Times New Roman" w:cs="Times New Roman"/>
+          <w:color w:val="auto"/>
+          <w:sz w:val="24"/>
+          <w:szCs w:val="24"/>
+        </w:rPr>
+      </w:pPr>
+      <w:r>
+        <w:rPr>
+          <w:rFonts w:ascii="Times New Roman" w:hAnsi="Times New Roman" w:cs="Times New Roman"/>
+          <w:noProof/>
+          <w:color w:val="auto"/>
+          <w:sz w:val="24"/>
+          <w:szCs w:val="24"/>
+        </w:rPr>
+        <w:drawing>
+          <wp:inline distT="0" distB="0" distL="0" distR="0" wp14:anchorId="2D9D140D" wp14:editId="7E16F37C">
+            <wp:extent cx="5634137" cy="5943600"/>
+            <wp:effectExtent l="0" t="0" r="0" b="0"/>
+            <wp:docPr id="8" name="Picture 8" descr="Figure 9. Current Bowie outdoor weather, five-day forecast and greenhouse impact recommendations from the running Forecast page."/>
+            <wp:cNvGraphicFramePr>
+              <a:graphicFrameLocks xmlns:a="http://schemas.openxmlformats.org/drawingml/2006/main" noChangeAspect="1"/>
+            </wp:cNvGraphicFramePr>
+            <a:graphic xmlns:a="http://schemas.openxmlformats.org/drawingml/2006/main">
+              <a:graphicData uri="http://schemas.openxmlformats.org/drawingml/2006/picture">
+                <pic:pic xmlns:pic="http://schemas.openxmlformats.org/drawingml/2006/picture">
+                  <pic:nvPicPr>
+                    <pic:cNvPr id="0" name="forecast-summary.png"/>
+                    <pic:cNvPicPr/>
+                  </pic:nvPicPr>
+                  <pic:blipFill>
+                    <a:blip r:embed="rId15"/>
+                    <a:stretch>
+                      <a:fillRect/>
+                    </a:stretch>
+                  </pic:blipFill>
+                  <pic:spPr>
+                    <a:xfrm>
+                      <a:off x="0" y="0"/>
+                      <a:ext cx="5634137" cy="5943600"/>
+                    </a:xfrm>
+                    <a:prstGeom prst="rect">
+                      <a:avLst/>
+                    </a:prstGeom>
+                  </pic:spPr>
+                </pic:pic>
+              </a:graphicData>
+            </a:graphic>
+          </wp:inline>
+        </w:drawing>
+      </w:r>
+    </w:p>
+    <w:p>
+      <w:pPr>
+        <w:pStyle w:val="Evidence"/>
+        <w:keepLines/>
+        <w:spacing w:line="276" w:lineRule="auto"/>
+        <w:rPr>
+          <w:rFonts w:ascii="Times New Roman" w:hAnsi="Times New Roman" w:cs="Times New Roman"/>
+          <w:color w:val="auto"/>
+          <w:sz w:val="24"/>
+          <w:szCs w:val="24"/>
+        </w:rPr>
+      </w:pPr>
+      <w:r>
+        <w:rPr>
+          <w:rFonts w:ascii="Times New Roman" w:hAnsi="Times New Roman" w:cs="Times New Roman"/>
+          <w:color w:val="auto"/>
+          <w:sz w:val="24"/>
+          <w:szCs w:val="24"/>
+        </w:rPr>
+        <w:t>Figure 9. Current Bowie outdoor weather, five-day forecast and greenhouse impact recommendations from the running Forecast page.</w:t>
+      </w:r>
+    </w:p>
+    <w:p>
+      <w:pPr>
+        <w:pStyle w:val="Evidence"/>
+        <w:spacing w:line="276" w:lineRule="auto"/>
+        <w:rPr>
+          <w:rFonts w:ascii="Times New Roman" w:hAnsi="Times New Roman" w:cs="Times New Roman"/>
+          <w:color w:val="auto"/>
+          <w:sz w:val="24"/>
+          <w:szCs w:val="24"/>
+        </w:rPr>
+      </w:pPr>
+      <w:r>
+        <w:rPr>
+          <w:rFonts w:ascii="Times New Roman" w:hAnsi="Times New Roman" w:cs="Times New Roman"/>
+          <w:color w:val="auto"/>
+          <w:sz w:val="24"/>
+          <w:szCs w:val="24"/>
+        </w:rPr>
+        <w:t xml:space="preserve">Outdoor weather is provided by </w:t>
+      </w:r>
+      <w:proofErr w:type="spellStart"/>
+      <w:r>
+        <w:rPr>
+          <w:rFonts w:ascii="Times New Roman" w:hAnsi="Times New Roman" w:cs="Times New Roman"/>
+          <w:color w:val="auto"/>
+          <w:sz w:val="24"/>
+          <w:szCs w:val="24"/>
+        </w:rPr>
+        <w:t>OpenWeatherMap</w:t>
+      </w:r>
+      <w:proofErr w:type="spellEnd"/>
+      <w:r>
+        <w:rPr>
+          <w:rFonts w:ascii="Times New Roman" w:hAnsi="Times New Roman" w:cs="Times New Roman"/>
+          <w:color w:val="auto"/>
+          <w:sz w:val="24"/>
+          <w:szCs w:val="24"/>
+        </w:rPr>
+        <w:t>. Indoor values elsewhere in this application originate from the repository and were simulated in this review. Forecast recommendations do not actuate hardware.</w:t>
+      </w:r>
+    </w:p>
+    <w:p>
+      <w:pPr>
+        <w:pStyle w:val="Heading1"/>
+        <w:pageBreakBefore/>
+        <w:spacing w:line="276" w:lineRule="auto"/>
+        <w:rPr>
+          <w:rFonts w:ascii="Times New Roman" w:hAnsi="Times New Roman" w:cs="Times New Roman"/>
+          <w:color w:val="auto"/>
+          <w:sz w:val="24"/>
+          <w:szCs w:val="24"/>
+        </w:rPr>
+      </w:pPr>
+      <w:r>
+        <w:rPr>
+          <w:rFonts w:ascii="Times New Roman" w:hAnsi="Times New Roman" w:cs="Times New Roman"/>
+          <w:color w:val="auto"/>
+          <w:sz w:val="24"/>
+          <w:szCs w:val="24"/>
+        </w:rPr>
+        <w:lastRenderedPageBreak/>
+        <w:t>Controls and repository data</w:t>
+      </w:r>
+    </w:p>
+    <w:p>
+      <w:pPr>
+        <w:keepNext/>
+        <w:spacing w:line="276" w:lineRule="auto"/>
+        <w:jc w:val="center"/>
+        <w:rPr>
+          <w:rFonts w:ascii="Times New Roman" w:hAnsi="Times New Roman" w:cs="Times New Roman"/>
+          <w:color w:val="auto"/>
+          <w:sz w:val="24"/>
+          <w:szCs w:val="24"/>
+        </w:rPr>
+      </w:pPr>
+      <w:r>
+        <w:rPr>
+          <w:rFonts w:ascii="Times New Roman" w:hAnsi="Times New Roman" w:cs="Times New Roman"/>
+          <w:noProof/>
+          <w:color w:val="auto"/>
+          <w:sz w:val="24"/>
+          <w:szCs w:val="24"/>
+        </w:rPr>
+        <w:drawing>
+          <wp:inline distT="0" distB="0" distL="0" distR="0" wp14:anchorId="5187E829" wp14:editId="65E26082">
+            <wp:extent cx="4913277" cy="2743200"/>
+            <wp:effectExtent l="0" t="0" r="0" b="0"/>
+            <wp:docPr id="9" name="Picture 9" descr="Figure 10. Controls page explicitly identifies the absence of a physical controller. No request was submitted during review."/>
+            <wp:cNvGraphicFramePr>
+              <a:graphicFrameLocks xmlns:a="http://schemas.openxmlformats.org/drawingml/2006/main" noChangeAspect="1"/>
+            </wp:cNvGraphicFramePr>
+            <a:graphic xmlns:a="http://schemas.openxmlformats.org/drawingml/2006/main">
+              <a:graphicData uri="http://schemas.openxmlformats.org/drawingml/2006/picture">
+                <pic:pic xmlns:pic="http://schemas.openxmlformats.org/drawingml/2006/picture">
+                  <pic:nvPicPr>
+                    <pic:cNvPr id="0" name="controls.png"/>
+                    <pic:cNvPicPr/>
+                  </pic:nvPicPr>
+                  <pic:blipFill>
+                    <a:blip r:embed="rId16"/>
+                    <a:stretch>
+                      <a:fillRect/>
+                    </a:stretch>
+                  </pic:blipFill>
+                  <pic:spPr>
+                    <a:xfrm>
+                      <a:off x="0" y="0"/>
+                      <a:ext cx="4913277" cy="2743200"/>
+                    </a:xfrm>
+                    <a:prstGeom prst="rect">
+                      <a:avLst/>
+                    </a:prstGeom>
+                  </pic:spPr>
+                </pic:pic>
+              </a:graphicData>
+            </a:graphic>
+          </wp:inline>
+        </w:drawing>
+      </w:r>
+    </w:p>
+    <w:p>
+      <w:pPr>
+        <w:pStyle w:val="Evidence"/>
+        <w:keepLines/>
+        <w:spacing w:line="276" w:lineRule="auto"/>
+        <w:rPr>
+          <w:rFonts w:ascii="Times New Roman" w:hAnsi="Times New Roman" w:cs="Times New Roman"/>
+          <w:color w:val="auto"/>
+          <w:sz w:val="24"/>
+          <w:szCs w:val="24"/>
+        </w:rPr>
+      </w:pPr>
+      <w:r>
+        <w:rPr>
+          <w:rFonts w:ascii="Times New Roman" w:hAnsi="Times New Roman" w:cs="Times New Roman"/>
+          <w:color w:val="auto"/>
+          <w:sz w:val="24"/>
+          <w:szCs w:val="24"/>
+        </w:rPr>
+        <w:t xml:space="preserve">Figure 10. </w:t>
+      </w:r>
+      <w:proofErr w:type="gramStart"/>
+      <w:r>
+        <w:rPr>
+          <w:rFonts w:ascii="Times New Roman" w:hAnsi="Times New Roman" w:cs="Times New Roman"/>
+          <w:color w:val="auto"/>
+          <w:sz w:val="24"/>
+          <w:szCs w:val="24"/>
+        </w:rPr>
+        <w:t>Controls page</w:t>
+      </w:r>
+      <w:proofErr w:type="gramEnd"/>
+      <w:r>
+        <w:rPr>
+          <w:rFonts w:ascii="Times New Roman" w:hAnsi="Times New Roman" w:cs="Times New Roman"/>
+          <w:color w:val="auto"/>
+          <w:sz w:val="24"/>
+          <w:szCs w:val="24"/>
+        </w:rPr>
+        <w:t xml:space="preserve"> explicitly identifies the absence of a physical controller. No request was submitted during review.</w:t>
+      </w:r>
+    </w:p>
+    <w:p>
+      <w:pPr>
+        <w:keepNext/>
+        <w:spacing w:line="276" w:lineRule="auto"/>
+        <w:jc w:val="center"/>
+        <w:rPr>
+          <w:rFonts w:ascii="Times New Roman" w:hAnsi="Times New Roman" w:cs="Times New Roman"/>
+          <w:color w:val="auto"/>
+          <w:sz w:val="24"/>
+          <w:szCs w:val="24"/>
+        </w:rPr>
+      </w:pPr>
+      <w:r>
+        <w:rPr>
+          <w:rFonts w:ascii="Times New Roman" w:hAnsi="Times New Roman" w:cs="Times New Roman"/>
+          <w:noProof/>
+          <w:color w:val="auto"/>
+          <w:sz w:val="24"/>
+          <w:szCs w:val="24"/>
+        </w:rPr>
+        <w:drawing>
+          <wp:inline distT="0" distB="0" distL="0" distR="0" wp14:anchorId="389D3F7B" wp14:editId="03992CE0">
+            <wp:extent cx="5273497" cy="3383280"/>
+            <wp:effectExtent l="0" t="0" r="0" b="0"/>
+            <wp:docPr id="10" name="Picture 10" descr="Figure 11. Data page with repository filters, timestamps, provenance fields and CSV export."/>
+            <wp:cNvGraphicFramePr>
+              <a:graphicFrameLocks xmlns:a="http://schemas.openxmlformats.org/drawingml/2006/main" noChangeAspect="1"/>
+            </wp:cNvGraphicFramePr>
+            <a:graphic xmlns:a="http://schemas.openxmlformats.org/drawingml/2006/main">
+              <a:graphicData uri="http://schemas.openxmlformats.org/drawingml/2006/picture">
+                <pic:pic xmlns:pic="http://schemas.openxmlformats.org/drawingml/2006/picture">
+                  <pic:nvPicPr>
+                    <pic:cNvPr id="0" name="data.png"/>
+                    <pic:cNvPicPr/>
+                  </pic:nvPicPr>
+                  <pic:blipFill>
+                    <a:blip r:embed="rId17"/>
+                    <a:stretch>
+                      <a:fillRect/>
+                    </a:stretch>
+                  </pic:blipFill>
+                  <pic:spPr>
+                    <a:xfrm>
+                      <a:off x="0" y="0"/>
+                      <a:ext cx="5273497" cy="3383280"/>
+                    </a:xfrm>
+                    <a:prstGeom prst="rect">
+                      <a:avLst/>
+                    </a:prstGeom>
+                  </pic:spPr>
+                </pic:pic>
+              </a:graphicData>
+            </a:graphic>
+          </wp:inline>
+        </w:drawing>
+      </w:r>
+    </w:p>
+    <w:p>
+      <w:pPr>
+        <w:pStyle w:val="Evidence"/>
+        <w:keepLines/>
+        <w:spacing w:line="276" w:lineRule="auto"/>
+        <w:rPr>
+          <w:rFonts w:ascii="Times New Roman" w:hAnsi="Times New Roman" w:cs="Times New Roman"/>
+          <w:color w:val="auto"/>
+          <w:sz w:val="24"/>
+          <w:szCs w:val="24"/>
+        </w:rPr>
+      </w:pPr>
+      <w:r>
+        <w:rPr>
+          <w:rFonts w:ascii="Times New Roman" w:hAnsi="Times New Roman" w:cs="Times New Roman"/>
+          <w:color w:val="auto"/>
+          <w:sz w:val="24"/>
+          <w:szCs w:val="24"/>
+        </w:rPr>
+        <w:t>Figure 11. Data page with repository filters, timestamps, provenance fields and CSV export.</w:t>
+      </w:r>
+    </w:p>
+    <w:p>
+      <w:pPr>
+        <w:pStyle w:val="Evidence"/>
+        <w:spacing w:line="276" w:lineRule="auto"/>
+        <w:rPr>
+          <w:rFonts w:ascii="Times New Roman" w:hAnsi="Times New Roman" w:cs="Times New Roman"/>
+          <w:color w:val="auto"/>
+          <w:sz w:val="24"/>
+          <w:szCs w:val="24"/>
+        </w:rPr>
+      </w:pPr>
+      <w:r>
+        <w:rPr>
+          <w:rFonts w:ascii="Times New Roman" w:hAnsi="Times New Roman" w:cs="Times New Roman"/>
+          <w:color w:val="auto"/>
+          <w:sz w:val="24"/>
+          <w:szCs w:val="24"/>
+        </w:rPr>
+        <w:t xml:space="preserve">Evidence files: outputs/current-application/. Verification: tests/test_chart_review.py and the complete 26-test suite. The pre-edit report is preserved under </w:t>
+      </w:r>
+      <w:proofErr w:type="spellStart"/>
+      <w:r>
+        <w:rPr>
+          <w:rFonts w:ascii="Times New Roman" w:hAnsi="Times New Roman" w:cs="Times New Roman"/>
+          <w:color w:val="auto"/>
+          <w:sz w:val="24"/>
+          <w:szCs w:val="24"/>
+        </w:rPr>
+        <w:t>tmp</w:t>
+      </w:r>
+      <w:proofErr w:type="spellEnd"/>
+      <w:r>
+        <w:rPr>
+          <w:rFonts w:ascii="Times New Roman" w:hAnsi="Times New Roman" w:cs="Times New Roman"/>
+          <w:color w:val="auto"/>
+          <w:sz w:val="24"/>
+          <w:szCs w:val="24"/>
+        </w:rPr>
+        <w:t>/finalProject-before-chart-review-20260922.docx.</w:t>
       </w:r>
     </w:p>
     <w:sectPr>
-      <w:headerReference w:type="default" r:id="rId11"/>
-      <w:footerReference w:type="default" r:id="rId12"/>
+      <w:headerReference w:type="default" r:id="rId18"/>
+      <w:footerReference w:type="default" r:id="rId19"/>
       <w:pgSz w:w="12240" w:h="15840"/>
       <w:pgMar w:top="1440" w:right="1440" w:bottom="1440" w:left="1440" w:header="708" w:footer="708" w:gutter="0"/>
       <w:pgNumType w:start="0"/>
@@ -5586,25 +8046,21 @@
       <w:jc w:val="right"/>
     </w:pPr>
     <w:r>
-      <w:t xml:space="preserve">Review: 16 September 2026  |  </w:t>
+      <w:t xml:space="preserve">Review: 22 September </w:t>
+    </w:r>
+    <w:proofErr w:type="gramStart"/>
+    <w:r>
+      <w:t>2026  |</w:t>
+    </w:r>
+    <w:proofErr w:type="gramEnd"/>
+    <w:r>
+      <w:t xml:space="preserve">  </w:t>
     </w:r>
     <w:r>
-      <w:fldChar w:fldCharType="begin"/>
-    </w:r>
-    <w:r>
-      <w:instrText>PAGE</w:instrText>
-    </w:r>
-    <w:r>
-      <w:fldChar w:fldCharType="separate"/>
-    </w:r>
-    <w:r>
       <w:rPr>
         <w:noProof/>
       </w:rPr>
       <w:t>1</w:t>
-    </w:r>
-    <w:r>
-      <w:fldChar w:fldCharType="end"/>
     </w:r>
   </w:p>
 </w:ftr>
@@ -5645,12 +8101,37 @@
         <w:szCs w:val="18"/>
       </w:rPr>
     </w:pPr>
+    <w:proofErr w:type="gramStart"/>
     <w:r>
       <w:rPr>
         <w:rFonts w:ascii="Times New Roman" w:hAnsi="Times New Roman" w:cs="Times New Roman"/>
         <w:szCs w:val="18"/>
       </w:rPr>
-      <w:t>GREENHOUSEWATCH  |  CTEC 651  |  PROJECT DELIVERY</w:t>
+      <w:t>GREENHOUSEWATCH  |</w:t>
+    </w:r>
+    <w:proofErr w:type="gramEnd"/>
+    <w:r>
+      <w:rPr>
+        <w:rFonts w:ascii="Times New Roman" w:hAnsi="Times New Roman" w:cs="Times New Roman"/>
+        <w:szCs w:val="18"/>
+      </w:rPr>
+      <w:t xml:space="preserve">  CTEC </w:t>
+    </w:r>
+    <w:proofErr w:type="gramStart"/>
+    <w:r>
+      <w:rPr>
+        <w:rFonts w:ascii="Times New Roman" w:hAnsi="Times New Roman" w:cs="Times New Roman"/>
+        <w:szCs w:val="18"/>
+      </w:rPr>
+      <w:t>651  |</w:t>
+    </w:r>
+    <w:proofErr w:type="gramEnd"/>
+    <w:r>
+      <w:rPr>
+        <w:rFonts w:ascii="Times New Roman" w:hAnsi="Times New Roman" w:cs="Times New Roman"/>
+        <w:szCs w:val="18"/>
+      </w:rPr>
+      <w:t xml:space="preserve">  PROJECT DELIVERY</w:t>
     </w:r>
   </w:p>
 </w:hdr>

</xml_diff>

<commit_message>
Update report and lesson deck with year-long visualizations
- Report Section 5: five new figures (days, months, quarters, year) with
  interpretation and implications; later figures renumbered 7-13; chart
  references in Sections 4 and 6-7 updated. Section 6 humidity, soil
  moisture and light now use the modelled year.
- Deck slide 8: four slide-sized charts (days, months, quarters, year) with
  a title and source note. Slide 9: key insights from the year of data.
- Correct the cold-snap statement: Seedlings dipped 0.3 °C below minimum.

Co-Authored-By: Claude Opus 5.5 <noreply@anthropic.com>
</commit_message>
<xml_diff>
--- a/jerrydfirstdelivery_finalProject.docx
+++ b/jerrydfirstdelivery_finalProject.docx
@@ -3867,7 +3867,7 @@
         <w:rPr>
           <w:rFonts w:ascii="Times New Roman" w:hAnsi="Times New Roman" w:cs="Times New Roman"/>
         </w:rPr>
-        <w:t>The schema has timestamp indexes and parameterized INSERT statements. The offline pipeline initializes a database, seeds historical readings when needed, exports CSV and creates four charts. The current dashboard loads the SQLite repository, applies freshness rules, and preserves UTC storage while presenting user-facing times in Eastern time.</w:t>
+        <w:t>The schema has timestamp indexes and parameterized INSERT statements. The offline pipeline initializes a database, seeds historical readings when needed, exports CSV, builds the modelled year from cached Bowie weather and creates seven charts. The current dashboard loads the SQLite repository, applies freshness rules, and preserves UTC storage while presenting user-facing times in Eastern time.</w:t>
       </w:r>
     </w:p>
     <w:p>
@@ -3960,28 +3960,68 @@
       <w:r>
         <w:rPr>
           <w:rFonts w:ascii="Times New Roman" w:hAnsi="Times New Roman" w:cs="Times New Roman"/>
+        </w:rPr>
+        <w:t xml:space="preserve">The Phase 5 charts now cover a full year, 1 October 2025 to 26 September 2026 (361 whole days, local Bowie time), so the data can be read by day, month, quarter and year. Outdoor weather is real: hourly temperature, humidity and solar radiation for Bowie, MD from the free Open-Meteo historical archive. Indoor conditions for the Tomato, Lettuce and Seedling zones are modelled from that weather hour by hour, applying the controls a typical greenhouse has: solar gain, a heater held just above each crop's minimum, a 40% shade cloth on hot days, vents with evaporative pad cooling, fogging for dry air, morning irrigation with an afternoon top-up and a weekly nutrient change. These rows are stored with source = 'weather model' so they are never confused with sensor readings. Each zone is judged against its own crop targets; an hour is outside target when temperature, humidity or soil moisture is out of range.</w:t>
+      </w:r>
+      <w:proofErr w:type="spellStart"/>
+      <w:proofErr w:type="spellEnd"/>
+    </w:p>
+    <w:p>
+      <w:pPr>
+        <w:pStyle w:val="Heading2"/>
+        <w:jc w:val="both"/>
+        <w:rPr>
+          <w:rFonts w:ascii="Times New Roman" w:hAnsi="Times New Roman" w:cs="Times New Roman"/>
+          <w:color w:val="auto"/>
+          <w:sz w:val="24"/>
+          <w:szCs w:val="24"/>
+        </w:rPr>
+      </w:pPr>
+      <w:r>
+        <w:rPr>
+          <w:rFonts w:ascii="Times New Roman" w:hAnsi="Times New Roman" w:cs="Times New Roman"/>
+          <w:color w:val="auto"/>
+          <w:sz w:val="24"/>
+          <w:szCs w:val="24"/>
+        </w:rPr>
+        <w:t xml:space="preserve">Days</w:t>
+      </w:r>
+    </w:p>
+    <w:p>
+      <w:pPr>
+        <w:spacing w:line="276" w:lineRule="auto"/>
+        <w:jc w:val="both"/>
+        <w:rPr>
+          <w:rFonts w:ascii="Times New Roman" w:hAnsi="Times New Roman" w:cs="Times New Roman"/>
+          <w:color w:val="auto"/>
+          <w:sz w:val="24"/>
+          <w:szCs w:val="24"/>
+        </w:rPr>
+      </w:pPr>
+      <w:r>
+        <w:rPr>
+          <w:rFonts w:ascii="Times New Roman" w:hAnsi="Times New Roman" w:cs="Times New Roman"/>
           <w:noProof/>
           <w:color w:val="auto"/>
           <w:sz w:val="24"/>
           <w:szCs w:val="24"/>
         </w:rPr>
         <w:drawing>
-          <wp:inline distT="0" distB="0" distL="0" distR="0" wp14:anchorId="31830D9D" wp14:editId="0BAE0CFD">
-            <wp:extent cx="5486400" cy="2523744"/>
-            <wp:effectExtent l="0" t="0" r="0" b="0"/>
-            <wp:docPr id="2" name="Picture 2"/>
+          <wp:inline xmlns:a="http://schemas.openxmlformats.org/drawingml/2006/main" xmlns:pic="http://schemas.openxmlformats.org/drawingml/2006/picture">
+            <wp:extent cx="5486400" cy="3657600"/>
+            <wp:docPr id="11" name="Picture 11"/>
             <wp:cNvGraphicFramePr>
-              <a:graphicFrameLocks xmlns:a="http://schemas.openxmlformats.org/drawingml/2006/main" noChangeAspect="1"/>
+              <a:graphicFrameLocks noChangeAspect="1"/>
             </wp:cNvGraphicFramePr>
-            <a:graphic xmlns:a="http://schemas.openxmlformats.org/drawingml/2006/main">
+            <a:graphic>
               <a:graphicData uri="http://schemas.openxmlformats.org/drawingml/2006/picture">
-                <pic:pic xmlns:pic="http://schemas.openxmlformats.org/drawingml/2006/picture">
+                <pic:pic>
                   <pic:nvPicPr>
-                    <pic:cNvPr id="0" name="01_temperature_over_time.png"/>
+                    <pic:cNvPr id="0" name="02_daily_cycle_by_season.png"/>
                     <pic:cNvPicPr/>
                   </pic:nvPicPr>
                   <pic:blipFill>
-                    <a:blip r:embed="rId9"/>
+                    <a:blip r:embed="rId22"/>
                     <a:stretch>
                       <a:fillRect/>
                     </a:stretch>
@@ -3989,11 +4029,9 @@
                   <pic:spPr>
                     <a:xfrm>
                       <a:off x="0" y="0"/>
-                      <a:ext cx="5486400" cy="2523744"/>
+                      <a:ext cx="5486400" cy="3657600"/>
                     </a:xfrm>
-                    <a:prstGeom prst="rect">
-                      <a:avLst/>
-                    </a:prstGeom>
+                    <a:prstGeom prst="rect"/>
                   </pic:spPr>
                 </pic:pic>
               </a:graphicData>
@@ -4021,7 +4059,7 @@
           <w:sz w:val="24"/>
           <w:szCs w:val="24"/>
         </w:rPr>
-        <w:t>Figure 2. Temperature history from the repository; dashed lines show project limits.</w:t>
+        <w:t xml:space="preserve">Figure 2. Average 24-hour temperature cycle in each season, by zone, against outdoor air.</w:t>
       </w:r>
     </w:p>
     <w:p>
@@ -4039,22 +4077,10 @@
         <w:rPr>
           <w:rFonts w:ascii="Times New Roman" w:hAnsi="Times New Roman" w:cs="Times New Roman"/>
         </w:rPr>
-        <w:t xml:space="preserve">In the retained 100-record </w:t>
+        <w:t xml:space="preserve">In winter the indoor lines are almost flat while the outdoor mean runs from about -2 to 4 degrees C: heating holds each zone just above its minimum all day. In summer the pattern reverses. Outdoor air peaks near 29 degrees C in mid-afternoon and every zone rises with it. Between 15:00 and 16:00, Lettuce is outside its temperature target in 48% of hours and Seedlings in 45%, against 14% and 3% at 03:00.</w:t>
       </w:r>
       <w:proofErr w:type="spellStart"/>
-      <w:r>
-        <w:rPr>
-          <w:rFonts w:ascii="Times New Roman" w:hAnsi="Times New Roman" w:cs="Times New Roman"/>
-        </w:rPr>
-        <w:t>sensor_data</w:t>
-      </w:r>
       <w:proofErr w:type="spellEnd"/>
-      <w:r>
-        <w:rPr>
-          <w:rFonts w:ascii="Times New Roman" w:hAnsi="Times New Roman" w:cs="Times New Roman"/>
-        </w:rPr>
-        <w:t xml:space="preserve"> snapshot, the temperature range is 13.37-28.96 degrees C. No stored value exceeds the 32-degree upper limit. The single low-temperature alert occurs on 7 September at 17:31:21 UTC; it is an injected simulated cold event, not a measured dawn event.</w:t>
-      </w:r>
     </w:p>
     <w:p>
       <w:pPr>
@@ -4076,22 +4102,21 @@
           <w:szCs w:val="24"/>
         </w:rPr>
         <w:drawing>
-          <wp:inline distT="0" distB="0" distL="0" distR="0" wp14:anchorId="2F350E4B" wp14:editId="2172188F">
-            <wp:extent cx="5486400" cy="2294313"/>
-            <wp:effectExtent l="0" t="0" r="0" b="0"/>
-            <wp:docPr id="3" name="Picture 3"/>
+          <wp:inline xmlns:a="http://schemas.openxmlformats.org/drawingml/2006/main" xmlns:pic="http://schemas.openxmlformats.org/drawingml/2006/picture">
+            <wp:extent cx="5486400" cy="4343400"/>
+            <wp:docPr id="12" name="Picture 12"/>
             <wp:cNvGraphicFramePr>
-              <a:graphicFrameLocks xmlns:a="http://schemas.openxmlformats.org/drawingml/2006/main" noChangeAspect="1"/>
+              <a:graphicFrameLocks noChangeAspect="1"/>
             </wp:cNvGraphicFramePr>
-            <a:graphic xmlns:a="http://schemas.openxmlformats.org/drawingml/2006/main">
+            <a:graphic>
               <a:graphicData uri="http://schemas.openxmlformats.org/drawingml/2006/picture">
-                <pic:pic xmlns:pic="http://schemas.openxmlformats.org/drawingml/2006/picture">
+                <pic:pic>
                   <pic:nvPicPr>
-                    <pic:cNvPr id="0" name="04_alert_summary.png"/>
+                    <pic:cNvPr id="0" name="03_daily_temperature_year.png"/>
                     <pic:cNvPicPr/>
                   </pic:nvPicPr>
                   <pic:blipFill>
-                    <a:blip r:embed="rId10"/>
+                    <a:blip r:embed="rId23"/>
                     <a:stretch>
                       <a:fillRect/>
                     </a:stretch>
@@ -4099,11 +4124,9 @@
                   <pic:spPr>
                     <a:xfrm>
                       <a:off x="0" y="0"/>
-                      <a:ext cx="5486400" cy="2294313"/>
+                      <a:ext cx="5486400" cy="4343400"/>
                     </a:xfrm>
-                    <a:prstGeom prst="rect">
-                      <a:avLst/>
-                    </a:prstGeom>
+                    <a:prstGeom prst="rect"/>
                   </pic:spPr>
                 </pic:pic>
               </a:graphicData>
@@ -4131,7 +4154,7 @@
           <w:sz w:val="24"/>
           <w:szCs w:val="24"/>
         </w:rPr>
-        <w:t>Figure 3. Current condition summary: 93 normal readings and 7 alerts.</w:t>
+        <w:t xml:space="preserve">Figure 3. Daily mean (line) and low-to-high range (shading) for every day of the year, with each crop's target band (grey) and the outdoor daily mean.</w:t>
       </w:r>
     </w:p>
     <w:p>
@@ -4148,81 +4171,84 @@
       <w:r>
         <w:rPr>
           <w:rFonts w:ascii="Times New Roman" w:hAnsi="Times New Roman" w:cs="Times New Roman"/>
-          <w:color w:val="auto"/>
-          <w:sz w:val="24"/>
-          <w:szCs w:val="24"/>
-        </w:rPr>
-        <w:t xml:space="preserve">Alerts represent 7% of 100 stored readings: three </w:t>
+        </w:rPr>
+        <w:t xml:space="preserve">From November to March each zone's daily mean sits on the lower edge of its target band, including the coldest hour of the year (-17.7 degrees C outdoors at 06:00 on 30 January 2026). From June to September daily highs break above the band; on the hottest day (37.4 degrees C outdoors, 4 July 2026) all three zones peak above 29 degrees C.</w:t>
       </w:r>
       <w:proofErr w:type="spellStart"/>
-      <w:r>
-        <w:rPr>
-          <w:rFonts w:ascii="Times New Roman" w:hAnsi="Times New Roman" w:cs="Times New Roman"/>
-          <w:color w:val="auto"/>
-          <w:sz w:val="24"/>
-          <w:szCs w:val="24"/>
-        </w:rPr>
-        <w:t>high_humidity</w:t>
-      </w:r>
       <w:proofErr w:type="spellEnd"/>
-      <w:r>
-        <w:rPr>
-          <w:rFonts w:ascii="Times New Roman" w:hAnsi="Times New Roman" w:cs="Times New Roman"/>
-          <w:color w:val="auto"/>
-          <w:sz w:val="24"/>
-          <w:szCs w:val="24"/>
-        </w:rPr>
-        <w:t xml:space="preserve">, three </w:t>
-      </w:r>
-      <w:proofErr w:type="spellStart"/>
-      <w:r>
-        <w:rPr>
-          <w:rFonts w:ascii="Times New Roman" w:hAnsi="Times New Roman" w:cs="Times New Roman"/>
-          <w:color w:val="auto"/>
-          <w:sz w:val="24"/>
-          <w:szCs w:val="24"/>
-        </w:rPr>
-        <w:t>dry_soil</w:t>
-      </w:r>
-      <w:proofErr w:type="spellEnd"/>
-      <w:r>
-        <w:rPr>
-          <w:rFonts w:ascii="Times New Roman" w:hAnsi="Times New Roman" w:cs="Times New Roman"/>
-          <w:color w:val="auto"/>
-          <w:sz w:val="24"/>
-          <w:szCs w:val="24"/>
-        </w:rPr>
-        <w:t xml:space="preserve"> and one </w:t>
-      </w:r>
-      <w:proofErr w:type="spellStart"/>
-      <w:r>
-        <w:rPr>
-          <w:rFonts w:ascii="Times New Roman" w:hAnsi="Times New Roman" w:cs="Times New Roman"/>
-          <w:color w:val="auto"/>
-          <w:sz w:val="24"/>
-          <w:szCs w:val="24"/>
-        </w:rPr>
-        <w:t>low_temperature</w:t>
-      </w:r>
-      <w:proofErr w:type="spellEnd"/>
-      <w:r>
-        <w:rPr>
-          <w:rFonts w:ascii="Times New Roman" w:hAnsi="Times New Roman" w:cs="Times New Roman"/>
-          <w:color w:val="auto"/>
-          <w:sz w:val="24"/>
-          <w:szCs w:val="24"/>
-        </w:rPr>
-        <w:t xml:space="preserve">. This percentage weights records, not elapsed time, because the historical and </w:t>
-      </w:r>
-      <w:r>
-        <w:rPr>
-          <w:rFonts w:ascii="Times New Roman" w:hAnsi="Times New Roman" w:cs="Times New Roman"/>
-          <w:color w:val="auto"/>
-          <w:sz w:val="24"/>
-          <w:szCs w:val="24"/>
-        </w:rPr>
-        <w:lastRenderedPageBreak/>
-        <w:t>MQTT batches use different sampling intervals. The scatter reflects the programmed relationship between temperature and humidity.</w:t>
+    </w:p>
+    <w:p>
+      <w:pPr>
+        <w:pStyle w:val="Heading2"/>
+        <w:jc w:val="both"/>
+        <w:rPr>
+          <w:rFonts w:ascii="Times New Roman" w:hAnsi="Times New Roman" w:cs="Times New Roman"/>
+          <w:color w:val="auto"/>
+          <w:sz w:val="24"/>
+          <w:szCs w:val="24"/>
+        </w:rPr>
+      </w:pPr>
+      <w:r>
+        <w:rPr>
+          <w:rFonts w:ascii="Times New Roman" w:hAnsi="Times New Roman" w:cs="Times New Roman"/>
+          <w:color w:val="auto"/>
+          <w:sz w:val="24"/>
+          <w:szCs w:val="24"/>
+        </w:rPr>
+        <w:t xml:space="preserve">Months and quarters</w:t>
+      </w:r>
+    </w:p>
+    <w:p>
+      <w:pPr>
+        <w:spacing w:line="276" w:lineRule="auto"/>
+        <w:jc w:val="both"/>
+        <w:rPr>
+          <w:rFonts w:ascii="Times New Roman" w:hAnsi="Times New Roman" w:cs="Times New Roman"/>
+          <w:color w:val="auto"/>
+          <w:sz w:val="24"/>
+          <w:szCs w:val="24"/>
+        </w:rPr>
+      </w:pPr>
+      <w:r>
+        <w:rPr>
+          <w:rFonts w:ascii="Times New Roman" w:hAnsi="Times New Roman" w:cs="Times New Roman"/>
+          <w:noProof/>
+          <w:color w:val="auto"/>
+          <w:sz w:val="24"/>
+          <w:szCs w:val="24"/>
+        </w:rPr>
+        <w:drawing>
+          <wp:inline xmlns:a="http://schemas.openxmlformats.org/drawingml/2006/main" xmlns:pic="http://schemas.openxmlformats.org/drawingml/2006/picture">
+            <wp:extent cx="5486400" cy="3886200"/>
+            <wp:docPr id="13" name="Picture 13"/>
+            <wp:cNvGraphicFramePr>
+              <a:graphicFrameLocks noChangeAspect="1"/>
+            </wp:cNvGraphicFramePr>
+            <a:graphic>
+              <a:graphicData uri="http://schemas.openxmlformats.org/drawingml/2006/picture">
+                <pic:pic>
+                  <pic:nvPicPr>
+                    <pic:cNvPr id="0" name="04_monthly_summary.png"/>
+                    <pic:cNvPicPr/>
+                  </pic:nvPicPr>
+                  <pic:blipFill>
+                    <a:blip r:embed="rId24"/>
+                    <a:stretch>
+                      <a:fillRect/>
+                    </a:stretch>
+                  </pic:blipFill>
+                  <pic:spPr>
+                    <a:xfrm>
+                      <a:off x="0" y="0"/>
+                      <a:ext cx="5486400" cy="3886200"/>
+                    </a:xfrm>
+                    <a:prstGeom prst="rect"/>
+                  </pic:spPr>
+                </pic:pic>
+              </a:graphicData>
+            </a:graphic>
+          </wp:inline>
+        </w:drawing>
       </w:r>
     </w:p>
     <w:p>
@@ -4244,28 +4270,368 @@
           <w:sz w:val="24"/>
           <w:szCs w:val="24"/>
         </w:rPr>
-        <w:t>Sources: outputs/01_temperature_over_time.png and outputs/04_alert_summary.png; data/</w:t>
+        <w:t xml:space="preserve">Figure 4. Monthly mean temperature (top) and share of hours outside any target (bottom), by zone.</w:t>
+      </w:r>
+    </w:p>
+    <w:p>
+      <w:pPr>
+        <w:spacing w:line="276" w:lineRule="auto"/>
+        <w:jc w:val="both"/>
+        <w:rPr>
+          <w:rFonts w:ascii="Times New Roman" w:hAnsi="Times New Roman" w:cs="Times New Roman"/>
+          <w:color w:val="auto"/>
+          <w:sz w:val="24"/>
+          <w:szCs w:val="24"/>
+        </w:rPr>
+      </w:pPr>
+      <w:r>
+        <w:rPr>
+          <w:rFonts w:ascii="Times New Roman" w:hAnsi="Times New Roman" w:cs="Times New Roman"/>
+        </w:rPr>
+        <w:t xml:space="preserve">Monthly mean outdoor temperature ranges from -1 degrees C in January to 25 degrees C in July, while Tomatoes stay between 21 and 26 degrees C every month. Hours outside target have two separate seasonal causes. In January heated air is too dry, and Seedlings are outside target 51% of hours. In July and August pad cooling cannot pull humid summer air low enough, and Lettuce reaches 82% and 85%. November is the easiest month (1-13%).</w:t>
       </w:r>
       <w:proofErr w:type="spellStart"/>
-      <w:r>
-        <w:rPr>
-          <w:rFonts w:ascii="Times New Roman" w:hAnsi="Times New Roman" w:cs="Times New Roman"/>
-          <w:color w:val="auto"/>
-          <w:sz w:val="24"/>
-          <w:szCs w:val="24"/>
-        </w:rPr>
-        <w:t>iot_data.db</w:t>
-      </w:r>
       <w:proofErr w:type="spellEnd"/>
-      <w:r>
-        <w:rPr>
-          <w:rFonts w:ascii="Times New Roman" w:hAnsi="Times New Roman" w:cs="Times New Roman"/>
-          <w:color w:val="auto"/>
-          <w:sz w:val="24"/>
-          <w:szCs w:val="24"/>
-        </w:rPr>
-        <w:t>. Additional charts: 02_humidity_over_time.png and 03_soil_and_light.png.</w:t>
-      </w:r>
+    </w:p>
+    <w:p>
+      <w:pPr>
+        <w:spacing w:line="276" w:lineRule="auto"/>
+        <w:jc w:val="both"/>
+        <w:rPr>
+          <w:rFonts w:ascii="Times New Roman" w:hAnsi="Times New Roman" w:cs="Times New Roman"/>
+          <w:color w:val="auto"/>
+          <w:sz w:val="24"/>
+          <w:szCs w:val="24"/>
+        </w:rPr>
+      </w:pPr>
+      <w:r>
+        <w:rPr>
+          <w:rFonts w:ascii="Times New Roman" w:hAnsi="Times New Roman" w:cs="Times New Roman"/>
+          <w:noProof/>
+          <w:color w:val="auto"/>
+          <w:sz w:val="24"/>
+          <w:szCs w:val="24"/>
+        </w:rPr>
+        <w:drawing>
+          <wp:inline xmlns:a="http://schemas.openxmlformats.org/drawingml/2006/main" xmlns:pic="http://schemas.openxmlformats.org/drawingml/2006/picture">
+            <wp:extent cx="5486400" cy="4239491"/>
+            <wp:docPr id="14" name="Picture 14"/>
+            <wp:cNvGraphicFramePr>
+              <a:graphicFrameLocks noChangeAspect="1"/>
+            </wp:cNvGraphicFramePr>
+            <a:graphic>
+              <a:graphicData uri="http://schemas.openxmlformats.org/drawingml/2006/picture">
+                <pic:pic>
+                  <pic:nvPicPr>
+                    <pic:cNvPr id="0" name="05_quarterly_summary.png"/>
+                    <pic:cNvPicPr/>
+                  </pic:nvPicPr>
+                  <pic:blipFill>
+                    <a:blip r:embed="rId25"/>
+                    <a:stretch>
+                      <a:fillRect/>
+                    </a:stretch>
+                  </pic:blipFill>
+                  <pic:spPr>
+                    <a:xfrm>
+                      <a:off x="0" y="0"/>
+                      <a:ext cx="5486400" cy="4239491"/>
+                    </a:xfrm>
+                    <a:prstGeom prst="rect"/>
+                  </pic:spPr>
+                </pic:pic>
+              </a:graphicData>
+            </a:graphic>
+          </wp:inline>
+        </w:drawing>
+      </w:r>
+    </w:p>
+    <w:p>
+      <w:pPr>
+        <w:pStyle w:val="Evidence"/>
+        <w:spacing w:line="276" w:lineRule="auto"/>
+        <w:jc w:val="both"/>
+        <w:rPr>
+          <w:rFonts w:ascii="Times New Roman" w:hAnsi="Times New Roman" w:cs="Times New Roman"/>
+          <w:color w:val="auto"/>
+          <w:sz w:val="24"/>
+          <w:szCs w:val="24"/>
+        </w:rPr>
+      </w:pPr>
+      <w:r>
+        <w:rPr>
+          <w:rFonts w:ascii="Times New Roman" w:hAnsi="Times New Roman" w:cs="Times New Roman"/>
+          <w:color w:val="auto"/>
+          <w:sz w:val="24"/>
+          <w:szCs w:val="24"/>
+        </w:rPr>
+        <w:t xml:space="preserve">Figure 5. Share of hours outside each target by quarter and zone (darker = worse).</w:t>
+      </w:r>
+    </w:p>
+    <w:p>
+      <w:pPr>
+        <w:spacing w:line="276" w:lineRule="auto"/>
+        <w:jc w:val="both"/>
+        <w:rPr>
+          <w:rFonts w:ascii="Times New Roman" w:hAnsi="Times New Roman" w:cs="Times New Roman"/>
+          <w:color w:val="auto"/>
+          <w:sz w:val="24"/>
+          <w:szCs w:val="24"/>
+        </w:rPr>
+      </w:pPr>
+      <w:r>
+        <w:rPr>
+          <w:rFonts w:ascii="Times New Roman" w:hAnsi="Times New Roman" w:cs="Times New Roman"/>
+        </w:rPr>
+        <w:t xml:space="preserve">By quarter, hours outside any target rise from Q4 2025 to Q3 2026 for every zone: Tomatoes 4%, 13%, 17%, 35%; Lettuce 6%, 12%, 38%, 76%; Seedlings 18%, 32%, 28%, 56%. The breakdown shows why: Lettuce fails on temperature in summer (69% of Q3 hours), while Seedlings fail on humidity in winter (30% of Q1 hours). Soil moisture was within target in all but four hours of the year, all in the Seedling zone after missed irrigation cycles, so irrigation is not the constraint.</w:t>
+      </w:r>
+      <w:proofErr w:type="spellStart"/>
+      <w:proofErr w:type="spellEnd"/>
+    </w:p>
+    <w:p>
+      <w:pPr>
+        <w:pStyle w:val="Heading2"/>
+        <w:jc w:val="both"/>
+        <w:rPr>
+          <w:rFonts w:ascii="Times New Roman" w:hAnsi="Times New Roman" w:cs="Times New Roman"/>
+          <w:color w:val="auto"/>
+          <w:sz w:val="24"/>
+          <w:szCs w:val="24"/>
+        </w:rPr>
+      </w:pPr>
+      <w:r>
+        <w:rPr>
+          <w:rFonts w:ascii="Times New Roman" w:hAnsi="Times New Roman" w:cs="Times New Roman"/>
+          <w:color w:val="auto"/>
+          <w:sz w:val="24"/>
+          <w:szCs w:val="24"/>
+        </w:rPr>
+        <w:t xml:space="preserve">Year</w:t>
+      </w:r>
+    </w:p>
+    <w:p>
+      <w:pPr>
+        <w:spacing w:line="276" w:lineRule="auto"/>
+        <w:jc w:val="both"/>
+        <w:rPr>
+          <w:rFonts w:ascii="Times New Roman" w:hAnsi="Times New Roman" w:cs="Times New Roman"/>
+          <w:color w:val="auto"/>
+          <w:sz w:val="24"/>
+          <w:szCs w:val="24"/>
+        </w:rPr>
+      </w:pPr>
+      <w:r>
+        <w:rPr>
+          <w:rFonts w:ascii="Times New Roman" w:hAnsi="Times New Roman" w:cs="Times New Roman"/>
+          <w:noProof/>
+          <w:color w:val="auto"/>
+          <w:sz w:val="24"/>
+          <w:szCs w:val="24"/>
+        </w:rPr>
+        <w:drawing>
+          <wp:inline xmlns:a="http://schemas.openxmlformats.org/drawingml/2006/main" xmlns:pic="http://schemas.openxmlformats.org/drawingml/2006/picture">
+            <wp:extent cx="5486400" cy="3038622"/>
+            <wp:docPr id="15" name="Picture 15"/>
+            <wp:cNvGraphicFramePr>
+              <a:graphicFrameLocks noChangeAspect="1"/>
+            </wp:cNvGraphicFramePr>
+            <a:graphic>
+              <a:graphicData uri="http://schemas.openxmlformats.org/drawingml/2006/picture">
+                <pic:pic>
+                  <pic:nvPicPr>
+                    <pic:cNvPr id="0" name="06_year_calendar.png"/>
+                    <pic:cNvPicPr/>
+                  </pic:nvPicPr>
+                  <pic:blipFill>
+                    <a:blip r:embed="rId26"/>
+                    <a:stretch>
+                      <a:fillRect/>
+                    </a:stretch>
+                  </pic:blipFill>
+                  <pic:spPr>
+                    <a:xfrm>
+                      <a:off x="0" y="0"/>
+                      <a:ext cx="5486400" cy="3038622"/>
+                    </a:xfrm>
+                    <a:prstGeom prst="rect"/>
+                  </pic:spPr>
+                </pic:pic>
+              </a:graphicData>
+            </a:graphic>
+          </wp:inline>
+        </w:drawing>
+      </w:r>
+    </w:p>
+    <w:p>
+      <w:pPr>
+        <w:pStyle w:val="Evidence"/>
+        <w:spacing w:line="276" w:lineRule="auto"/>
+        <w:jc w:val="both"/>
+        <w:rPr>
+          <w:rFonts w:ascii="Times New Roman" w:hAnsi="Times New Roman" w:cs="Times New Roman"/>
+          <w:color w:val="auto"/>
+          <w:sz w:val="24"/>
+          <w:szCs w:val="24"/>
+        </w:rPr>
+      </w:pPr>
+      <w:r>
+        <w:rPr>
+          <w:rFonts w:ascii="Times New Roman" w:hAnsi="Times New Roman" w:cs="Times New Roman"/>
+          <w:color w:val="auto"/>
+          <w:sz w:val="24"/>
+          <w:szCs w:val="24"/>
+        </w:rPr>
+        <w:t xml:space="preserve">Figure 6. Calendar of hours outside any target for each day of the year, by zone.</w:t>
+      </w:r>
+    </w:p>
+    <w:p>
+      <w:pPr>
+        <w:spacing w:line="276" w:lineRule="auto"/>
+        <w:jc w:val="both"/>
+        <w:rPr>
+          <w:rFonts w:ascii="Times New Roman" w:hAnsi="Times New Roman" w:cs="Times New Roman"/>
+          <w:color w:val="auto"/>
+          <w:sz w:val="24"/>
+          <w:szCs w:val="24"/>
+        </w:rPr>
+      </w:pPr>
+      <w:r>
+        <w:rPr>
+          <w:rFonts w:ascii="Times New Roman" w:hAnsi="Times New Roman" w:cs="Times New Roman"/>
+        </w:rPr>
+        <w:t xml:space="preserve">Of 361 days, Tomatoes had 136 days within target in every hour, Lettuce 103 and Seedlings 76. The problem days cluster in two blocks: late January to February (dry air, mostly Seedlings) and June to early September (heat, mostly Lettuce). The indoor-versus-outdoor chart (outputs/07_indoor_vs_outdoor.png) shows the same threshold: indoor temperature is flat while the outdoor daily mean is below about 15 degrees C and starts to track outdoor air above about 20 degrees C.</w:t>
+      </w:r>
+      <w:proofErr w:type="spellStart"/>
+      <w:proofErr w:type="spellEnd"/>
+    </w:p>
+    <w:p>
+      <w:pPr>
+        <w:pStyle w:val="Heading2"/>
+        <w:jc w:val="both"/>
+        <w:rPr>
+          <w:rFonts w:ascii="Times New Roman" w:hAnsi="Times New Roman" w:cs="Times New Roman"/>
+          <w:color w:val="auto"/>
+          <w:sz w:val="24"/>
+          <w:szCs w:val="24"/>
+        </w:rPr>
+      </w:pPr>
+      <w:r>
+        <w:rPr>
+          <w:rFonts w:ascii="Times New Roman" w:hAnsi="Times New Roman" w:cs="Times New Roman"/>
+          <w:color w:val="auto"/>
+          <w:sz w:val="24"/>
+          <w:szCs w:val="24"/>
+        </w:rPr>
+        <w:t xml:space="preserve">Implications</w:t>
+      </w:r>
+    </w:p>
+    <w:p>
+      <w:pPr>
+        <w:pStyle w:val="ListBullet"/>
+        <w:spacing w:line="276" w:lineRule="auto"/>
+        <w:rPr>
+          <w:rFonts w:ascii="Times New Roman" w:hAnsi="Times New Roman" w:cs="Times New Roman"/>
+          <w:color w:val="auto"/>
+          <w:sz w:val="24"/>
+          <w:szCs w:val="24"/>
+        </w:rPr>
+      </w:pPr>
+      <w:r>
+        <w:rPr>
+          <w:rFonts w:ascii="Times New Roman" w:hAnsi="Times New Roman" w:cs="Times New Roman"/>
+          <w:color w:val="auto"/>
+          <w:sz w:val="24"/>
+          <w:szCs w:val="24"/>
+        </w:rPr>
+        <w:t xml:space="preserve">Lettuce is a cool-season crop in this house: within target 94% of hours in Q4 but 24% in Q3. Growing it from October to April and switching to a heat-tolerant crop over summer would remove most of its alert hours.</w:t>
+      </w:r>
+    </w:p>
+    <w:p>
+      <w:pPr>
+        <w:pStyle w:val="ListBullet"/>
+        <w:spacing w:line="276" w:lineRule="auto"/>
+        <w:rPr>
+          <w:rFonts w:ascii="Times New Roman" w:hAnsi="Times New Roman" w:cs="Times New Roman"/>
+          <w:color w:val="auto"/>
+          <w:sz w:val="24"/>
+          <w:szCs w:val="24"/>
+        </w:rPr>
+      </w:pPr>
+      <w:r>
+        <w:rPr>
+          <w:rFonts w:ascii="Times New Roman" w:hAnsi="Times New Roman" w:cs="Times New Roman"/>
+          <w:color w:val="auto"/>
+          <w:sz w:val="24"/>
+          <w:szCs w:val="24"/>
+        </w:rPr>
+        <w:t xml:space="preserve">Seedlings need more winter humidity: a third of Q1 hours are too dry because heating dries the air. Added fogging capacity or propagation covers is the cheapest fix.</w:t>
+      </w:r>
+    </w:p>
+    <w:p>
+      <w:pPr>
+        <w:pStyle w:val="ListBullet"/>
+        <w:spacing w:line="276" w:lineRule="auto"/>
+        <w:rPr>
+          <w:rFonts w:ascii="Times New Roman" w:hAnsi="Times New Roman" w:cs="Times New Roman"/>
+          <w:color w:val="auto"/>
+          <w:sz w:val="24"/>
+          <w:szCs w:val="24"/>
+        </w:rPr>
+      </w:pPr>
+      <w:r>
+        <w:rPr>
+          <w:rFonts w:ascii="Times New Roman" w:hAnsi="Times New Roman" w:cs="Times New Roman"/>
+          <w:color w:val="auto"/>
+          <w:sz w:val="24"/>
+          <w:szCs w:val="24"/>
+        </w:rPr>
+        <w:t xml:space="preserve">Tomatoes suit the house best, outside target 17% of the year and mostly on summer afternoons; stronger shading or cooling in July and August would help most.</w:t>
+      </w:r>
+    </w:p>
+    <w:p>
+      <w:pPr>
+        <w:pStyle w:val="ListBullet"/>
+        <w:spacing w:line="276" w:lineRule="auto"/>
+        <w:rPr>
+          <w:rFonts w:ascii="Times New Roman" w:hAnsi="Times New Roman" w:cs="Times New Roman"/>
+          <w:color w:val="auto"/>
+          <w:sz w:val="24"/>
+          <w:szCs w:val="24"/>
+        </w:rPr>
+      </w:pPr>
+      <w:r>
+        <w:rPr>
+          <w:rFonts w:ascii="Times New Roman" w:hAnsi="Times New Roman" w:cs="Times New Roman"/>
+          <w:color w:val="auto"/>
+          <w:sz w:val="24"/>
+          <w:szCs w:val="24"/>
+        </w:rPr>
+        <w:t>Heating is adequate except in the deepest cold: at -17.7 degrees C outdoors (30 January 2026), Seedlings dipped to 17.7 degrees C, 0.3 degrees under their minimum, and Tomatoes to 17.7 degrees C, 2.3 degrees under their 20-degree minimum. A backup heater or thermal screen for the coldest nights would close that gap.</w:t>
+      </w:r>
+    </w:p>
+    <w:p>
+      <w:pPr>
+        <w:pStyle w:val="Evidence"/>
+        <w:spacing w:line="276" w:lineRule="auto"/>
+        <w:jc w:val="left"/>
+        <w:rPr>
+          <w:rFonts w:ascii="Times New Roman" w:hAnsi="Times New Roman" w:cs="Times New Roman"/>
+          <w:color w:val="auto"/>
+          <w:sz w:val="24"/>
+          <w:szCs w:val="24"/>
+        </w:rPr>
+      </w:pPr>
+      <w:r>
+        <w:rPr>
+          <w:rFonts w:ascii="Times New Roman" w:hAnsi="Times New Roman" w:cs="Times New Roman"/>
+          <w:color w:val="auto"/>
+          <w:sz w:val="24"/>
+          <w:szCs w:val="24"/>
+        </w:rPr>
+        <w:t xml:space="preserve">Sources: outputs/02_daily_cycle_by_season.png, 03_daily_temperature_year.png, 04_monthly_summary.png, 05_quarterly_summary.png and 06_year_calendar.png, with the numbers in outputs/monthly_summary.csv and quarterly_summary.csv. Additional charts: 01_last_7_days_hourly.png and 07_indoor_vs_outdoor.png. Generated by src/build_history.py and src/visualize.py from data/iot_data.db. Limit: indoor values are a model of how a typical greenhouse with these controls responds to the weather Bowie actually had, not measurements. Full write-up: docs/visualization_interpretation.md.</w:t>
+      </w:r>
+      <w:proofErr w:type="spellStart"/>
+      <w:proofErr w:type="spellEnd"/>
     </w:p>
     <w:p>
       <w:pPr>
@@ -4341,7 +4707,49 @@
           <w:sz w:val="24"/>
           <w:szCs w:val="24"/>
         </w:rPr>
-        <w:t>Humidity ranges from 55.27% to 80.42%. Three simulated records exceed 80%, at 01:16, 02:46 and 05:01 UTC on 7 September. Soil moisture ranges from 20.12% to 73.36%; dry-soil alerts occur at 12:46, 13:01 and 13:16 UTC, followed by the modeled irrigation recovery. Light ranges from 0 to 7,863.2 lux and follows the programmed solar pattern. These results illustrate how stored data makes threshold events visible; they do not independently validate a physical clock or greenhouse safety.</w:t>
+        <w:t>Humidity. Across the year, indoor relative humidity ranges from 46% (Tomatoes) to 92% (Lettuce). Humidity failures split almost evenly between too dry and too humid. In winter, heated air falls below target: Seedlings are below their 65% minimum in 30% of Q1 hours. In summer, humid outdoor air entering through the vents pushes humidity above target: Lettuce exceeds its 80% maximum in 26% of Q3 hours.</w:t>
+      </w:r>
+    </w:p>
+    <w:p>
+      <w:pPr>
+        <w:spacing w:line="276" w:lineRule="auto"/>
+        <w:jc w:val="both"/>
+        <w:rPr>
+          <w:rFonts w:ascii="Times New Roman" w:hAnsi="Times New Roman" w:cs="Times New Roman"/>
+          <w:color w:val="auto"/>
+          <w:sz w:val="24"/>
+          <w:szCs w:val="24"/>
+        </w:rPr>
+      </w:pPr>
+      <w:r>
+        <w:rPr>
+          <w:rFonts w:ascii="Times New Roman" w:hAnsi="Times New Roman" w:cs="Times New Roman"/>
+          <w:color w:val="auto"/>
+          <w:sz w:val="24"/>
+          <w:szCs w:val="24"/>
+        </w:rPr>
+        <w:t>Soil moisture. The daily irrigation cycle keeps every zone above its minimum. Soil falls by about 7 percentage points a day on average, from 4 points in December to 10 in July as sun and heat raise water use. The only dry spell was four hours in the Seedling zone on 18 July 2026 (10:00-13:00) after a missed morning cycle, with a low of 52.4% against a 55% minimum.</w:t>
+      </w:r>
+    </w:p>
+    <w:p>
+      <w:pPr>
+        <w:spacing w:line="276" w:lineRule="auto"/>
+        <w:jc w:val="both"/>
+        <w:rPr>
+          <w:rFonts w:ascii="Times New Roman" w:hAnsi="Times New Roman" w:cs="Times New Roman"/>
+          <w:color w:val="auto"/>
+          <w:sz w:val="24"/>
+          <w:szCs w:val="24"/>
+        </w:rPr>
+      </w:pPr>
+      <w:r>
+        <w:rPr>
+          <w:rFonts w:ascii="Times New Roman" w:hAnsi="Times New Roman" w:cs="Times New Roman"/>
+          <w:color w:val="auto"/>
+          <w:sz w:val="24"/>
+          <w:szCs w:val="24"/>
+        </w:rPr>
+        <w:t>Light. Daylight inside the house, taken as 70% of measured outdoor sunshine, peaks at 77,000 lux (31 May 2026). The average daily peak ranges from about 27,000 lux in December to 66,000 lux in June, and hours of daylight from 10 to 16. December and January are therefore when supplemental lighting would help most. These values come from the modelled year described in Section 5.</w:t>
       </w:r>
     </w:p>
     <w:p>
@@ -4409,7 +4817,7 @@
         <w:rPr>
           <w:rFonts w:ascii="Times New Roman" w:hAnsi="Times New Roman" w:cs="Times New Roman"/>
         </w:rPr>
-        <w:t xml:space="preserve"> a searchable crop directory and selected-zone details. Analytics provides compact filters, zone comparison, gaps, alert analysis and summaries. Forecast provides a default Bowie location, current weather, daily summaries, recommendations and indoor/outdoor comparison.</w:t>
+        <w:t xml:space="preserve"> a searchable crop directory and selected-zone details. Analytics provides compact filters, zone comparison, gaps, alert analysis and summaries. Forecast provides a default Bowie location, current weather, daily summaries, recommendations and indoor/outdoor comparison. Analytics also includes Long-term trends, which groups every stored reading by day, week, month, quarter or year, by zone and data source, with a table view and CSV export.</w:t>
       </w:r>
     </w:p>
     <w:p>
@@ -4935,7 +5343,7 @@
                 <w:sz w:val="24"/>
                 <w:szCs w:val="24"/>
               </w:rPr>
-              <w:t>Four PNG charts and corrected interpretation in this report; met, with display limitations.</w:t>
+              <w:t>Seven PNG charts covering days, months, quarters and a full year, with interpretation in Section 5; met.</w:t>
             </w:r>
           </w:p>
         </w:tc>
@@ -5418,7 +5826,7 @@
                 <w:sz w:val="24"/>
                 <w:szCs w:val="24"/>
               </w:rPr>
-              <w:t>Four images in outputs/. Corrected interpretation in this report; docs/visualization_interpretation.md remains stale.</w:t>
+              <w:t>Seven images and two CSV summaries in outputs/. Interpretation in Section 5 and docs/visualization_interpretation.md.</w:t>
             </w:r>
           </w:p>
         </w:tc>
@@ -7161,7 +7569,7 @@
           <w:sz w:val="24"/>
           <w:szCs w:val="24"/>
         </w:rPr>
-        <w:t>Figure 5. Operations Overview: current repository values, source freshness, environmental trend, primary zone health and simulated irrigation controls.</w:t>
+        <w:t>Figure 7. Operations Overview: current repository values, source freshness, environmental trend, primary zone health and simulated irrigation controls.</w:t>
       </w:r>
     </w:p>
     <w:p>
@@ -7284,7 +7692,7 @@
           <w:sz w:val="24"/>
           <w:szCs w:val="24"/>
         </w:rPr>
-        <w:t>Figure 6. Corrected Environment Trend with separate temperature and humidity axes, five-minute zone means, configured target bands and visible observation gaps.</w:t>
+        <w:t>Figure 8. Corrected Environment Trend with separate temperature and humidity axes, five-minute zone means, configured target bands and visible observation gaps.</w:t>
       </w:r>
     </w:p>
     <w:p>
@@ -7427,7 +7835,7 @@
           <w:sz w:val="24"/>
           <w:szCs w:val="24"/>
         </w:rPr>
-        <w:t>Figure 7. Analytics comparison view: period and metric filters, UTC axes, zone dash legend, summary statistics and dated Eastern availability range.</w:t>
+        <w:t>Figure 9. Analytics comparison view: period and metric filters, UTC axes, zone dash legend, summary statistics and dated Eastern availability range.</w:t>
       </w:r>
     </w:p>
     <w:p>
@@ -7570,7 +7978,7 @@
           <w:sz w:val="24"/>
           <w:szCs w:val="24"/>
         </w:rPr>
-        <w:t>Figure 8. Current eight-zone crop directory with matching crop images, observed conditions and freshness labels.</w:t>
+        <w:t>Figure 10. Current eight-zone crop directory with matching crop images, observed conditions and freshness labels.</w:t>
       </w:r>
     </w:p>
     <w:p>
@@ -7713,7 +8121,7 @@
           <w:sz w:val="24"/>
           <w:szCs w:val="24"/>
         </w:rPr>
-        <w:t>Figure 9. Current Bowie outdoor weather, five-day forecast and greenhouse impact recommendations from the running Forecast page.</w:t>
+        <w:t>Figure 11. Current Bowie outdoor weather, five-day forecast and greenhouse impact recommendations from the running Forecast page.</w:t>
       </w:r>
     </w:p>
     <w:p>
@@ -7856,7 +8264,7 @@
           <w:sz w:val="24"/>
           <w:szCs w:val="24"/>
         </w:rPr>
-        <w:t xml:space="preserve">Figure 10. </w:t>
+        <w:t xml:space="preserve">Figure 12. </w:t>
       </w:r>
       <w:proofErr w:type="gramStart"/>
       <w:r>
@@ -7955,7 +8363,7 @@
           <w:sz w:val="24"/>
           <w:szCs w:val="24"/>
         </w:rPr>
-        <w:t>Figure 11. Data page with repository filters, timestamps, provenance fields and CSV export.</w:t>
+        <w:t>Figure 13. Data page with repository filters, timestamps, provenance fields and CSV export.</w:t>
       </w:r>
     </w:p>
     <w:p>

</xml_diff>

<commit_message>
Make report and deck charts reproducible from the system
- visualize.py now also draws the slide-8 charts (outputs/slides/), so every
  chart in the report (Figures 2-6) and the deck comes from one script;
  --db/--out options allow drawing from another database
- build_history.py: history_readings() generator with a fixed default seed
  (651); --seed and --weather-only options
- publisher.py --replay-history [--days N] sends the modelled readings over
  MQTT (QoS 1, paced by --rate, default 25/s); --seed makes live simulated
  values repeatable
- subscriber.py subscribes at QoS 1, uses a per-process client ID, and adds
  --db and --quiet
- Verified end to end: a full-year replay through HiveMQ into an empty
  database stored all 26,064 readings with identical values, and the charts
  drawn from it match the report and deck pixel for pixel
- Report and slide 8 now state how the figures are reproduced

Co-Authored-By: Claude Opus 5.5 <noreply@anthropic.com>
</commit_message>
<xml_diff>
--- a/jerrydfirstdelivery_finalProject.docx
+++ b/jerrydfirstdelivery_finalProject.docx
@@ -520,33 +520,11 @@
           <w:szCs w:val="24"/>
         </w:rPr>
       </w:pPr>
-      <w:proofErr w:type="spellStart"/>
       <w:r>
         <w:rPr>
           <w:rFonts w:ascii="Times New Roman" w:hAnsi="Times New Roman" w:cs="Times New Roman"/>
         </w:rPr>
-        <w:t>GreenHouseWatch</w:t>
-      </w:r>
-      <w:proofErr w:type="spellEnd"/>
-      <w:r>
-        <w:rPr>
-          <w:rFonts w:ascii="Times New Roman" w:hAnsi="Times New Roman" w:cs="Times New Roman"/>
-        </w:rPr>
-        <w:t xml:space="preserve"> is a local IoT digital repository for greenhouse monitoring demonstrations. The simulator and MQTT publisher produce temperature, humidity, soil-moisture, light, nutrient-level and pH readings for crop-specific zones. The subscriber stores accepted messages in SQLite, while the </w:t>
-      </w:r>
-      <w:proofErr w:type="spellStart"/>
-      <w:r>
-        <w:rPr>
-          <w:rFonts w:ascii="Times New Roman" w:hAnsi="Times New Roman" w:cs="Times New Roman"/>
-        </w:rPr>
-        <w:t>Streamlit</w:t>
-      </w:r>
-      <w:proofErr w:type="spellEnd"/>
-      <w:r>
-        <w:rPr>
-          <w:rFonts w:ascii="Times New Roman" w:hAnsi="Times New Roman" w:cs="Times New Roman"/>
-        </w:rPr>
-        <w:t xml:space="preserve"> dashboard provides Overview, Zones, Analytics, Forecast, Controls and Data pages.</w:t>
+        <w:t>GreenHouseWatch is a local IoT digital repository for greenhouse monitoring demonstrations. The simulator and MQTT publisher produce temperature, humidity, soil-moisture, light, nutrient-level and pH readings for crop-specific zones. The subscriber stores accepted messages in SQLite, while the Streamlit dashboard provides Overview, Zones, Analytics, Forecast, Controls and Data pages.</w:t>
       </w:r>
     </w:p>
     <w:p>
@@ -622,21 +600,7 @@
         <w:rPr>
           <w:rFonts w:ascii="Times New Roman" w:hAnsi="Times New Roman" w:cs="Times New Roman"/>
         </w:rPr>
-        <w:t xml:space="preserve">The repository now includes the design proposal, architecture diagram, simulator, MQTT pipeline, SQLite storage, visualizations and a live </w:t>
-      </w:r>
-      <w:proofErr w:type="spellStart"/>
-      <w:r>
-        <w:rPr>
-          <w:rFonts w:ascii="Times New Roman" w:hAnsi="Times New Roman" w:cs="Times New Roman"/>
-        </w:rPr>
-        <w:t>Streamlit</w:t>
-      </w:r>
-      <w:proofErr w:type="spellEnd"/>
-      <w:r>
-        <w:rPr>
-          <w:rFonts w:ascii="Times New Roman" w:hAnsi="Times New Roman" w:cs="Times New Roman"/>
-        </w:rPr>
-        <w:t xml:space="preserve"> dashboard. The dashboard reads the repository every five seconds, distinguishes fresh, stale, demo and simulated data, and exposes crop-specific targets. Input validation, alert normalization, forecast handling and page-level rendering are covered by the local test suite.</w:t>
+        <w:t>The repository now includes the design proposal, architecture diagram, simulator, MQTT pipeline, SQLite storage, visualizations and a live Streamlit dashboard. The dashboard reads the repository every five seconds, distinguishes fresh, stale, demo and simulated data, and exposes crop-specific targets. Input validation, alert normalization, forecast handling and page-level rendering are covered by the local test suite.</w:t>
       </w:r>
     </w:p>
     <w:p>
@@ -806,27 +770,7 @@
           <w:szCs w:val="24"/>
         </w:rPr>
         <w:lastRenderedPageBreak/>
-        <w:t xml:space="preserve">The publisher imports the simulator; the subscriber receives the same JSON schema and commits each accepted message. The repository remains local even though message transport uses an external public broker. Configuration is centralized in </w:t>
-      </w:r>
-      <w:proofErr w:type="spellStart"/>
-      <w:r>
-        <w:rPr>
-          <w:rFonts w:ascii="Times New Roman" w:hAnsi="Times New Roman" w:cs="Times New Roman"/>
-          <w:color w:val="auto"/>
-          <w:sz w:val="24"/>
-          <w:szCs w:val="24"/>
-        </w:rPr>
-        <w:t>src</w:t>
-      </w:r>
-      <w:proofErr w:type="spellEnd"/>
-      <w:r>
-        <w:rPr>
-          <w:rFonts w:ascii="Times New Roman" w:hAnsi="Times New Roman" w:cs="Times New Roman"/>
-          <w:color w:val="auto"/>
-          <w:sz w:val="24"/>
-          <w:szCs w:val="24"/>
-        </w:rPr>
-        <w:t>/config.py.</w:t>
+        <w:t>The publisher imports the simulator; the subscriber receives the same JSON schema and commits each accepted message. The repository remains local even though message transport uses an external public broker. Configuration is centralized in src/config.py.</w:t>
       </w:r>
     </w:p>
     <w:tbl>
@@ -1123,7 +1067,6 @@
                 <w:szCs w:val="24"/>
               </w:rPr>
             </w:pPr>
-            <w:proofErr w:type="spellStart"/>
             <w:r>
               <w:rPr>
                 <w:rFonts w:ascii="Times New Roman" w:hAnsi="Times New Roman" w:cs="Times New Roman"/>
@@ -1133,7 +1076,6 @@
               </w:rPr>
               <w:t>iso_time</w:t>
             </w:r>
-            <w:proofErr w:type="spellEnd"/>
           </w:p>
         </w:tc>
         <w:tc>
@@ -1208,7 +1150,6 @@
                 <w:szCs w:val="24"/>
               </w:rPr>
             </w:pPr>
-            <w:proofErr w:type="spellStart"/>
             <w:r>
               <w:rPr>
                 <w:rFonts w:ascii="Times New Roman" w:hAnsi="Times New Roman" w:cs="Times New Roman"/>
@@ -1218,7 +1159,6 @@
               </w:rPr>
               <w:t>device_id</w:t>
             </w:r>
-            <w:proofErr w:type="spellEnd"/>
           </w:p>
         </w:tc>
         <w:tc>
@@ -1293,7 +1233,6 @@
                 <w:szCs w:val="24"/>
               </w:rPr>
             </w:pPr>
-            <w:proofErr w:type="spellStart"/>
             <w:r>
               <w:rPr>
                 <w:rFonts w:ascii="Times New Roman" w:hAnsi="Times New Roman" w:cs="Times New Roman"/>
@@ -1303,7 +1242,6 @@
               </w:rPr>
               <w:t>temperature_c</w:t>
             </w:r>
-            <w:proofErr w:type="spellEnd"/>
           </w:p>
         </w:tc>
         <w:tc>
@@ -1354,27 +1292,7 @@
                 <w:sz w:val="24"/>
                 <w:szCs w:val="24"/>
               </w:rPr>
-              <w:t xml:space="preserve">Air temperature </w:t>
-            </w:r>
-            <w:proofErr w:type="gramStart"/>
-            <w:r>
-              <w:rPr>
-                <w:rFonts w:ascii="Times New Roman" w:hAnsi="Times New Roman" w:cs="Times New Roman"/>
-                <w:color w:val="auto"/>
-                <w:sz w:val="24"/>
-                <w:szCs w:val="24"/>
-              </w:rPr>
-              <w:t>in</w:t>
-            </w:r>
-            <w:proofErr w:type="gramEnd"/>
-            <w:r>
-              <w:rPr>
-                <w:rFonts w:ascii="Times New Roman" w:hAnsi="Times New Roman" w:cs="Times New Roman"/>
-                <w:color w:val="auto"/>
-                <w:sz w:val="24"/>
-                <w:szCs w:val="24"/>
-              </w:rPr>
-              <w:t xml:space="preserve"> degrees Celsius</w:t>
+              <w:t>Air temperature in degrees Celsius</w:t>
             </w:r>
           </w:p>
         </w:tc>
@@ -1398,7 +1316,6 @@
                 <w:szCs w:val="24"/>
               </w:rPr>
             </w:pPr>
-            <w:proofErr w:type="spellStart"/>
             <w:r>
               <w:rPr>
                 <w:rFonts w:ascii="Times New Roman" w:hAnsi="Times New Roman" w:cs="Times New Roman"/>
@@ -1408,7 +1325,6 @@
               </w:rPr>
               <w:t>humidity_pct</w:t>
             </w:r>
-            <w:proofErr w:type="spellEnd"/>
           </w:p>
         </w:tc>
         <w:tc>
@@ -1483,7 +1399,6 @@
                 <w:szCs w:val="24"/>
               </w:rPr>
             </w:pPr>
-            <w:proofErr w:type="spellStart"/>
             <w:r>
               <w:rPr>
                 <w:rFonts w:ascii="Times New Roman" w:hAnsi="Times New Roman" w:cs="Times New Roman"/>
@@ -1493,7 +1408,6 @@
               </w:rPr>
               <w:t>soil_moisture_pct</w:t>
             </w:r>
-            <w:proofErr w:type="spellEnd"/>
           </w:p>
         </w:tc>
         <w:tc>
@@ -1568,7 +1482,6 @@
                 <w:szCs w:val="24"/>
               </w:rPr>
             </w:pPr>
-            <w:proofErr w:type="spellStart"/>
             <w:r>
               <w:rPr>
                 <w:rFonts w:ascii="Times New Roman" w:hAnsi="Times New Roman" w:cs="Times New Roman"/>
@@ -1578,7 +1491,6 @@
               </w:rPr>
               <w:t>light_lux</w:t>
             </w:r>
-            <w:proofErr w:type="spellEnd"/>
           </w:p>
         </w:tc>
         <w:tc>
@@ -1653,7 +1565,6 @@
                 <w:szCs w:val="24"/>
               </w:rPr>
             </w:pPr>
-            <w:proofErr w:type="spellStart"/>
             <w:r>
               <w:rPr>
                 <w:rFonts w:ascii="Times New Roman" w:hAnsi="Times New Roman" w:cs="Times New Roman"/>
@@ -1663,7 +1574,6 @@
               </w:rPr>
               <w:t>alert_flag</w:t>
             </w:r>
-            <w:proofErr w:type="spellEnd"/>
           </w:p>
         </w:tc>
         <w:tc>
@@ -1738,7 +1648,6 @@
                 <w:szCs w:val="24"/>
               </w:rPr>
             </w:pPr>
-            <w:proofErr w:type="spellStart"/>
             <w:r>
               <w:rPr>
                 <w:rFonts w:ascii="Times New Roman" w:hAnsi="Times New Roman" w:cs="Times New Roman"/>
@@ -1748,7 +1657,6 @@
               </w:rPr>
               <w:t>alert_reason</w:t>
             </w:r>
-            <w:proofErr w:type="spellEnd"/>
           </w:p>
         </w:tc>
         <w:tc>
@@ -1815,14 +1723,12 @@
                 <w:rFonts w:ascii="Times New Roman" w:hAnsi="Times New Roman" w:cs="Times New Roman"/>
               </w:rPr>
             </w:pPr>
-            <w:proofErr w:type="spellStart"/>
             <w:r>
               <w:rPr>
                 <w:rFonts w:ascii="Times New Roman" w:hAnsi="Times New Roman" w:cs="Times New Roman"/>
               </w:rPr>
               <w:t>nutrient_level</w:t>
             </w:r>
-            <w:proofErr w:type="spellEnd"/>
           </w:p>
         </w:tc>
         <w:tc>
@@ -1873,14 +1779,12 @@
                 <w:rFonts w:ascii="Times New Roman" w:hAnsi="Times New Roman" w:cs="Times New Roman"/>
               </w:rPr>
             </w:pPr>
-            <w:proofErr w:type="spellStart"/>
             <w:r>
               <w:rPr>
                 <w:rFonts w:ascii="Times New Roman" w:hAnsi="Times New Roman" w:cs="Times New Roman"/>
               </w:rPr>
               <w:t>ph_scale</w:t>
             </w:r>
-            <w:proofErr w:type="spellEnd"/>
           </w:p>
         </w:tc>
         <w:tc>
@@ -1931,14 +1835,12 @@
                 <w:rFonts w:ascii="Times New Roman" w:hAnsi="Times New Roman" w:cs="Times New Roman"/>
               </w:rPr>
             </w:pPr>
-            <w:proofErr w:type="spellStart"/>
             <w:r>
               <w:rPr>
                 <w:rFonts w:ascii="Times New Roman" w:hAnsi="Times New Roman" w:cs="Times New Roman"/>
               </w:rPr>
               <w:t>measured_at</w:t>
             </w:r>
-            <w:proofErr w:type="spellEnd"/>
           </w:p>
         </w:tc>
         <w:tc>
@@ -1989,14 +1891,12 @@
                 <w:rFonts w:ascii="Times New Roman" w:hAnsi="Times New Roman" w:cs="Times New Roman"/>
               </w:rPr>
             </w:pPr>
-            <w:proofErr w:type="spellStart"/>
             <w:r>
               <w:rPr>
                 <w:rFonts w:ascii="Times New Roman" w:hAnsi="Times New Roman" w:cs="Times New Roman"/>
               </w:rPr>
               <w:t>received_at</w:t>
             </w:r>
-            <w:proofErr w:type="spellEnd"/>
           </w:p>
         </w:tc>
         <w:tc>
@@ -2065,105 +1965,7 @@
         <w:rPr>
           <w:rFonts w:ascii="Times New Roman" w:hAnsi="Times New Roman" w:cs="Times New Roman"/>
         </w:rPr>
-        <w:t xml:space="preserve">Schema sources are src/db.py tables </w:t>
-      </w:r>
-      <w:proofErr w:type="spellStart"/>
-      <w:r>
-        <w:rPr>
-          <w:rFonts w:ascii="Times New Roman" w:hAnsi="Times New Roman" w:cs="Times New Roman"/>
-        </w:rPr>
-        <w:t>sensor_data</w:t>
-      </w:r>
-      <w:proofErr w:type="spellEnd"/>
-      <w:r>
-        <w:rPr>
-          <w:rFonts w:ascii="Times New Roman" w:hAnsi="Times New Roman" w:cs="Times New Roman"/>
-        </w:rPr>
-        <w:t xml:space="preserve"> and </w:t>
-      </w:r>
-      <w:proofErr w:type="spellStart"/>
-      <w:r>
-        <w:rPr>
-          <w:rFonts w:ascii="Times New Roman" w:hAnsi="Times New Roman" w:cs="Times New Roman"/>
-        </w:rPr>
-        <w:t>zone_telemetry</w:t>
-      </w:r>
-      <w:proofErr w:type="spellEnd"/>
-      <w:r>
-        <w:rPr>
-          <w:rFonts w:ascii="Times New Roman" w:hAnsi="Times New Roman" w:cs="Times New Roman"/>
-        </w:rPr>
-        <w:t xml:space="preserve">. Zone telemetry includes </w:t>
-      </w:r>
-      <w:proofErr w:type="spellStart"/>
-      <w:r>
-        <w:rPr>
-          <w:rFonts w:ascii="Times New Roman" w:hAnsi="Times New Roman" w:cs="Times New Roman"/>
-        </w:rPr>
-        <w:t>measured_at</w:t>
-      </w:r>
-      <w:proofErr w:type="spellEnd"/>
-      <w:r>
-        <w:rPr>
-          <w:rFonts w:ascii="Times New Roman" w:hAnsi="Times New Roman" w:cs="Times New Roman"/>
-        </w:rPr>
-        <w:t xml:space="preserve">, </w:t>
-      </w:r>
-      <w:proofErr w:type="spellStart"/>
-      <w:r>
-        <w:rPr>
-          <w:rFonts w:ascii="Times New Roman" w:hAnsi="Times New Roman" w:cs="Times New Roman"/>
-        </w:rPr>
-        <w:t>received_at</w:t>
-      </w:r>
-      <w:proofErr w:type="spellEnd"/>
-      <w:r>
-        <w:rPr>
-          <w:rFonts w:ascii="Times New Roman" w:hAnsi="Times New Roman" w:cs="Times New Roman"/>
-        </w:rPr>
-        <w:t xml:space="preserve">, crop-health fields, optional </w:t>
-      </w:r>
-      <w:proofErr w:type="spellStart"/>
-      <w:r>
-        <w:rPr>
-          <w:rFonts w:ascii="Times New Roman" w:hAnsi="Times New Roman" w:cs="Times New Roman"/>
-        </w:rPr>
-        <w:t>nutrient_level</w:t>
-      </w:r>
-      <w:proofErr w:type="spellEnd"/>
-      <w:r>
-        <w:rPr>
-          <w:rFonts w:ascii="Times New Roman" w:hAnsi="Times New Roman" w:cs="Times New Roman"/>
-        </w:rPr>
-        <w:t xml:space="preserve"> and </w:t>
-      </w:r>
-      <w:proofErr w:type="spellStart"/>
-      <w:r>
-        <w:rPr>
-          <w:rFonts w:ascii="Times New Roman" w:hAnsi="Times New Roman" w:cs="Times New Roman"/>
-        </w:rPr>
-        <w:t>ph_scale</w:t>
-      </w:r>
-      <w:proofErr w:type="spellEnd"/>
-      <w:r>
-        <w:rPr>
-          <w:rFonts w:ascii="Times New Roman" w:hAnsi="Times New Roman" w:cs="Times New Roman"/>
-        </w:rPr>
-        <w:t xml:space="preserve">, and alert metadata. SQLite type declarations alone do not enforce numeric sensor values; subscriber validation and write-time alert normalization provide </w:t>
-      </w:r>
-      <w:proofErr w:type="gramStart"/>
-      <w:r>
-        <w:rPr>
-          <w:rFonts w:ascii="Times New Roman" w:hAnsi="Times New Roman" w:cs="Times New Roman"/>
-        </w:rPr>
-        <w:t>the application</w:t>
-      </w:r>
-      <w:proofErr w:type="gramEnd"/>
-      <w:r>
-        <w:rPr>
-          <w:rFonts w:ascii="Times New Roman" w:hAnsi="Times New Roman" w:cs="Times New Roman"/>
-        </w:rPr>
-        <w:t>-level checks.</w:t>
+        <w:t>Schema sources are src/db.py tables sensor_data and zone_telemetry. Zone telemetry includes measured_at, received_at, crop-health fields, optional nutrient_level and ph_scale, and alert metadata. SQLite type declarations alone do not enforce numeric sensor values; subscriber validation and write-time alert normalization provide the application-level checks.</w:t>
       </w:r>
     </w:p>
     <w:p>
@@ -2202,67 +2004,7 @@
           <w:sz w:val="24"/>
           <w:szCs w:val="24"/>
         </w:rPr>
-        <w:t>Free toolchain: Python, paho-</w:t>
-      </w:r>
-      <w:proofErr w:type="spellStart"/>
-      <w:r>
-        <w:rPr>
-          <w:rFonts w:ascii="Times New Roman" w:hAnsi="Times New Roman" w:cs="Times New Roman"/>
-          <w:color w:val="auto"/>
-          <w:sz w:val="24"/>
-          <w:szCs w:val="24"/>
-        </w:rPr>
-        <w:t>mqtt</w:t>
-      </w:r>
-      <w:proofErr w:type="spellEnd"/>
-      <w:r>
-        <w:rPr>
-          <w:rFonts w:ascii="Times New Roman" w:hAnsi="Times New Roman" w:cs="Times New Roman"/>
-          <w:color w:val="auto"/>
-          <w:sz w:val="24"/>
-          <w:szCs w:val="24"/>
-        </w:rPr>
-        <w:t xml:space="preserve">, </w:t>
-      </w:r>
-      <w:proofErr w:type="spellStart"/>
-      <w:r>
-        <w:rPr>
-          <w:rFonts w:ascii="Times New Roman" w:hAnsi="Times New Roman" w:cs="Times New Roman"/>
-          <w:color w:val="auto"/>
-          <w:sz w:val="24"/>
-          <w:szCs w:val="24"/>
-        </w:rPr>
-        <w:t>HiveMQ</w:t>
-      </w:r>
-      <w:proofErr w:type="spellEnd"/>
-      <w:r>
-        <w:rPr>
-          <w:rFonts w:ascii="Times New Roman" w:hAnsi="Times New Roman" w:cs="Times New Roman"/>
-          <w:color w:val="auto"/>
-          <w:sz w:val="24"/>
-          <w:szCs w:val="24"/>
-        </w:rPr>
-        <w:t xml:space="preserve"> public broker, SQLite, Matplotlib and optional </w:t>
-      </w:r>
-      <w:proofErr w:type="spellStart"/>
-      <w:r>
-        <w:rPr>
-          <w:rFonts w:ascii="Times New Roman" w:hAnsi="Times New Roman" w:cs="Times New Roman"/>
-          <w:color w:val="auto"/>
-          <w:sz w:val="24"/>
-          <w:szCs w:val="24"/>
-        </w:rPr>
-        <w:t>Streamlit</w:t>
-      </w:r>
-      <w:proofErr w:type="spellEnd"/>
-      <w:r>
-        <w:rPr>
-          <w:rFonts w:ascii="Times New Roman" w:hAnsi="Times New Roman" w:cs="Times New Roman"/>
-          <w:color w:val="auto"/>
-          <w:sz w:val="24"/>
-          <w:szCs w:val="24"/>
-        </w:rPr>
-        <w:t>/pandas. CSV can be opened in a spreadsheet, but no paid spreadsheet software is needed.</w:t>
+        <w:t>Free toolchain: Python, paho-mqtt, HiveMQ public broker, SQLite, Matplotlib and optional Streamlit/pandas. CSV can be opened in a spreadsheet, but no paid spreadsheet software is needed.</w:t>
       </w:r>
     </w:p>
     <w:p>
@@ -2323,21 +2065,7 @@
         <w:rPr>
           <w:rFonts w:ascii="Times New Roman" w:hAnsi="Times New Roman" w:cs="Times New Roman"/>
         </w:rPr>
-        <w:t xml:space="preserve">src/simulator.py generates JSON records with UTC timestamps, a device identifier, temperature, humidity, soil moisture, light, nutrient level, pH and alert metadata. The default live interval is two seconds. Zone publishers attach </w:t>
-      </w:r>
-      <w:proofErr w:type="gramStart"/>
-      <w:r>
-        <w:rPr>
-          <w:rFonts w:ascii="Times New Roman" w:hAnsi="Times New Roman" w:cs="Times New Roman"/>
-        </w:rPr>
-        <w:t>crop</w:t>
-      </w:r>
-      <w:proofErr w:type="gramEnd"/>
-      <w:r>
-        <w:rPr>
-          <w:rFonts w:ascii="Times New Roman" w:hAnsi="Times New Roman" w:cs="Times New Roman"/>
-        </w:rPr>
-        <w:t xml:space="preserve"> and device-health metadata; command-line options control count, interval and zone.</w:t>
+        <w:t>src/simulator.py generates JSON records with UTC timestamps, a device identifier, temperature, humidity, soil moisture, light, nutrient level, pH and alert metadata. The default live interval is two seconds. Zone publishers attach crop and device-health metadata; command-line options control count, interval and zone.</w:t>
       </w:r>
     </w:p>
     <w:p>
@@ -2373,7 +2101,6 @@
           <w:szCs w:val="24"/>
         </w:rPr>
       </w:pPr>
-      <w:proofErr w:type="spellStart"/>
       <w:r>
         <w:rPr>
           <w:rFonts w:ascii="Times New Roman" w:hAnsi="Times New Roman" w:cs="Times New Roman"/>
@@ -2381,97 +2108,7 @@
           <w:sz w:val="24"/>
           <w:szCs w:val="24"/>
         </w:rPr>
-        <w:t>generate_</w:t>
-      </w:r>
-      <w:proofErr w:type="gramStart"/>
-      <w:r>
-        <w:rPr>
-          <w:rFonts w:ascii="Times New Roman" w:hAnsi="Times New Roman" w:cs="Times New Roman"/>
-          <w:color w:val="auto"/>
-          <w:sz w:val="24"/>
-          <w:szCs w:val="24"/>
-        </w:rPr>
-        <w:t>reading</w:t>
-      </w:r>
-      <w:proofErr w:type="spellEnd"/>
-      <w:r>
-        <w:rPr>
-          <w:rFonts w:ascii="Times New Roman" w:hAnsi="Times New Roman" w:cs="Times New Roman"/>
-          <w:color w:val="auto"/>
-          <w:sz w:val="24"/>
-          <w:szCs w:val="24"/>
-        </w:rPr>
-        <w:t>(</w:t>
-      </w:r>
-      <w:proofErr w:type="gramEnd"/>
-      <w:r>
-        <w:rPr>
-          <w:rFonts w:ascii="Times New Roman" w:hAnsi="Times New Roman" w:cs="Times New Roman"/>
-          <w:color w:val="auto"/>
-          <w:sz w:val="24"/>
-          <w:szCs w:val="24"/>
-        </w:rPr>
-        <w:t xml:space="preserve">) </w:t>
-      </w:r>
-      <w:proofErr w:type="gramStart"/>
-      <w:r>
-        <w:rPr>
-          <w:rFonts w:ascii="Times New Roman" w:hAnsi="Times New Roman" w:cs="Times New Roman"/>
-          <w:color w:val="auto"/>
-          <w:sz w:val="24"/>
-          <w:szCs w:val="24"/>
-        </w:rPr>
-        <w:t>models</w:t>
-      </w:r>
-      <w:proofErr w:type="gramEnd"/>
-      <w:r>
-        <w:rPr>
-          <w:rFonts w:ascii="Times New Roman" w:hAnsi="Times New Roman" w:cs="Times New Roman"/>
-          <w:color w:val="auto"/>
-          <w:sz w:val="24"/>
-          <w:szCs w:val="24"/>
-        </w:rPr>
-        <w:t xml:space="preserve"> temperature and light with a solar curve and humidity with an inverse trend plus random variation. Live calls use soil moisture near the default 55% baseline. </w:t>
-      </w:r>
-      <w:proofErr w:type="spellStart"/>
-      <w:r>
-        <w:rPr>
-          <w:rFonts w:ascii="Times New Roman" w:hAnsi="Times New Roman" w:cs="Times New Roman"/>
-          <w:color w:val="auto"/>
-          <w:sz w:val="24"/>
-          <w:szCs w:val="24"/>
-        </w:rPr>
-        <w:t>generate_</w:t>
-      </w:r>
-      <w:proofErr w:type="gramStart"/>
-      <w:r>
-        <w:rPr>
-          <w:rFonts w:ascii="Times New Roman" w:hAnsi="Times New Roman" w:cs="Times New Roman"/>
-          <w:color w:val="auto"/>
-          <w:sz w:val="24"/>
-          <w:szCs w:val="24"/>
-        </w:rPr>
-        <w:t>series</w:t>
-      </w:r>
-      <w:proofErr w:type="spellEnd"/>
-      <w:r>
-        <w:rPr>
-          <w:rFonts w:ascii="Times New Roman" w:hAnsi="Times New Roman" w:cs="Times New Roman"/>
-          <w:color w:val="auto"/>
-          <w:sz w:val="24"/>
-          <w:szCs w:val="24"/>
-        </w:rPr>
-        <w:t>(</w:t>
-      </w:r>
-      <w:proofErr w:type="gramEnd"/>
-      <w:r>
-        <w:rPr>
-          <w:rFonts w:ascii="Times New Roman" w:hAnsi="Times New Roman" w:cs="Times New Roman"/>
-          <w:color w:val="auto"/>
-          <w:sz w:val="24"/>
-          <w:szCs w:val="24"/>
-        </w:rPr>
-        <w:t>) adds soil dry-down, a mid-series irrigation recovery and injected anomalies. Those historical events are not automatically present in the live publisher. The implemented temperature curve does not include the two-hour lag claimed in a source comment.</w:t>
+        <w:t>generate_reading() models temperature and light with a solar curve and humidity with an inverse trend plus random variation. Live calls use soil moisture near the default 55% baseline. generate_series() adds soil dry-down, a mid-series irrigation recovery and injected anomalies. Those historical events are not automatically present in the live publisher. The implemented temperature curve does not include the two-hour lag claimed in a source comment.</w:t>
       </w:r>
     </w:p>
     <w:p>
@@ -2514,27 +2151,7 @@
           <w:sz w:val="24"/>
           <w:szCs w:val="24"/>
         </w:rPr>
-        <w:t>.</w:t>
-      </w:r>
-      <w:proofErr w:type="spellStart"/>
-      <w:r>
-        <w:rPr>
-          <w:rFonts w:ascii="Times New Roman" w:hAnsi="Times New Roman" w:cs="Times New Roman"/>
-          <w:color w:val="auto"/>
-          <w:sz w:val="24"/>
-          <w:szCs w:val="24"/>
-        </w:rPr>
-        <w:t>venv</w:t>
-      </w:r>
-      <w:proofErr w:type="spellEnd"/>
-      <w:r>
-        <w:rPr>
-          <w:rFonts w:ascii="Times New Roman" w:hAnsi="Times New Roman" w:cs="Times New Roman"/>
-          <w:color w:val="auto"/>
-          <w:sz w:val="24"/>
-          <w:szCs w:val="24"/>
-        </w:rPr>
-        <w:t>\Scripts\python.exe src/simulator.py --count 20 --interval 2</w:t>
+        <w:t>.venv\Scripts\python.exe src/simulator.py --count 20 --interval 2</w:t>
       </w:r>
       <w:r>
         <w:rPr>
@@ -2544,27 +2161,7 @@
           <w:szCs w:val="24"/>
         </w:rPr>
         <w:br/>
-        <w:t>.</w:t>
-      </w:r>
-      <w:proofErr w:type="spellStart"/>
-      <w:r>
-        <w:rPr>
-          <w:rFonts w:ascii="Times New Roman" w:hAnsi="Times New Roman" w:cs="Times New Roman"/>
-          <w:color w:val="auto"/>
-          <w:sz w:val="24"/>
-          <w:szCs w:val="24"/>
-        </w:rPr>
-        <w:t>venv</w:t>
-      </w:r>
-      <w:proofErr w:type="spellEnd"/>
-      <w:r>
-        <w:rPr>
-          <w:rFonts w:ascii="Times New Roman" w:hAnsi="Times New Roman" w:cs="Times New Roman"/>
-          <w:color w:val="auto"/>
-          <w:sz w:val="24"/>
-          <w:szCs w:val="24"/>
-        </w:rPr>
-        <w:t>\Scripts\python.exe src/simulator.py --once</w:t>
+        <w:t>.venv\Scripts\python.exe src/simulator.py --once</w:t>
       </w:r>
     </w:p>
     <w:p>
@@ -2607,27 +2204,7 @@
           <w:sz w:val="24"/>
           <w:szCs w:val="24"/>
         </w:rPr>
-        <w:t xml:space="preserve">samples/phase2_sample_output.txt contains 20 </w:t>
-      </w:r>
-      <w:proofErr w:type="spellStart"/>
-      <w:r>
-        <w:rPr>
-          <w:rFonts w:ascii="Times New Roman" w:hAnsi="Times New Roman" w:cs="Times New Roman"/>
-          <w:color w:val="auto"/>
-          <w:sz w:val="24"/>
-          <w:szCs w:val="24"/>
-        </w:rPr>
-        <w:t>parseable</w:t>
-      </w:r>
-      <w:proofErr w:type="spellEnd"/>
-      <w:r>
-        <w:rPr>
-          <w:rFonts w:ascii="Times New Roman" w:hAnsi="Times New Roman" w:cs="Times New Roman"/>
-          <w:color w:val="auto"/>
-          <w:sz w:val="24"/>
-          <w:szCs w:val="24"/>
-        </w:rPr>
-        <w:t xml:space="preserve"> JSON records, satisfying the requested 10-20 record sample. Its header explicitly uses interval=0.0s, so this artifact demonstrates the output format rather than two-second timing. One actual saved record is reproduced below.</w:t>
+        <w:t>samples/phase2_sample_output.txt contains 20 parseable JSON records, satisfying the requested 10-20 record sample. Its header explicitly uses interval=0.0s, so this artifact demonstrates the output format rather than two-second timing. One actual saved record is reproduced below.</w:t>
       </w:r>
     </w:p>
     <w:p>
@@ -2668,27 +2245,7 @@
           <w:szCs w:val="24"/>
         </w:rPr>
         <w:br/>
-        <w:t xml:space="preserve">  "</w:t>
-      </w:r>
-      <w:proofErr w:type="spellStart"/>
-      <w:r>
-        <w:rPr>
-          <w:rFonts w:ascii="Times New Roman" w:hAnsi="Times New Roman" w:cs="Times New Roman"/>
-          <w:color w:val="auto"/>
-          <w:sz w:val="24"/>
-          <w:szCs w:val="24"/>
-        </w:rPr>
-        <w:t>iso_time</w:t>
-      </w:r>
-      <w:proofErr w:type="spellEnd"/>
-      <w:r>
-        <w:rPr>
-          <w:rFonts w:ascii="Times New Roman" w:hAnsi="Times New Roman" w:cs="Times New Roman"/>
-          <w:color w:val="auto"/>
-          <w:sz w:val="24"/>
-          <w:szCs w:val="24"/>
-        </w:rPr>
-        <w:t>": "2026-09-07T20:31:26.598819+00:00",</w:t>
+        <w:t xml:space="preserve">  "iso_time": "2026-09-07T20:31:26.598819+00:00",</w:t>
       </w:r>
       <w:r>
         <w:rPr>
@@ -2698,27 +2255,7 @@
           <w:szCs w:val="24"/>
         </w:rPr>
         <w:br/>
-        <w:t xml:space="preserve">  "</w:t>
-      </w:r>
-      <w:proofErr w:type="spellStart"/>
-      <w:r>
-        <w:rPr>
-          <w:rFonts w:ascii="Times New Roman" w:hAnsi="Times New Roman" w:cs="Times New Roman"/>
-          <w:color w:val="auto"/>
-          <w:sz w:val="24"/>
-          <w:szCs w:val="24"/>
-        </w:rPr>
-        <w:t>device_id</w:t>
-      </w:r>
-      <w:proofErr w:type="spellEnd"/>
-      <w:r>
-        <w:rPr>
-          <w:rFonts w:ascii="Times New Roman" w:hAnsi="Times New Roman" w:cs="Times New Roman"/>
-          <w:color w:val="auto"/>
-          <w:sz w:val="24"/>
-          <w:szCs w:val="24"/>
-        </w:rPr>
-        <w:t>": "GH-SENSOR-01",</w:t>
+        <w:t xml:space="preserve">  "device_id": "GH-SENSOR-01",</w:t>
       </w:r>
       <w:r>
         <w:rPr>
@@ -2728,27 +2265,7 @@
           <w:szCs w:val="24"/>
         </w:rPr>
         <w:br/>
-        <w:t xml:space="preserve">  "</w:t>
-      </w:r>
-      <w:proofErr w:type="spellStart"/>
-      <w:r>
-        <w:rPr>
-          <w:rFonts w:ascii="Times New Roman" w:hAnsi="Times New Roman" w:cs="Times New Roman"/>
-          <w:color w:val="auto"/>
-          <w:sz w:val="24"/>
-          <w:szCs w:val="24"/>
-        </w:rPr>
-        <w:t>temperature_c</w:t>
-      </w:r>
-      <w:proofErr w:type="spellEnd"/>
-      <w:r>
-        <w:rPr>
-          <w:rFonts w:ascii="Times New Roman" w:hAnsi="Times New Roman" w:cs="Times New Roman"/>
-          <w:color w:val="auto"/>
-          <w:sz w:val="24"/>
-          <w:szCs w:val="24"/>
-        </w:rPr>
-        <w:t>": 16.85,</w:t>
+        <w:t xml:space="preserve">  "temperature_c": 16.85,</w:t>
       </w:r>
       <w:r>
         <w:rPr>
@@ -2758,27 +2275,7 @@
           <w:szCs w:val="24"/>
         </w:rPr>
         <w:br/>
-        <w:t xml:space="preserve">  "</w:t>
-      </w:r>
-      <w:proofErr w:type="spellStart"/>
-      <w:r>
-        <w:rPr>
-          <w:rFonts w:ascii="Times New Roman" w:hAnsi="Times New Roman" w:cs="Times New Roman"/>
-          <w:color w:val="auto"/>
-          <w:sz w:val="24"/>
-          <w:szCs w:val="24"/>
-        </w:rPr>
-        <w:t>humidity_pct</w:t>
-      </w:r>
-      <w:proofErr w:type="spellEnd"/>
-      <w:r>
-        <w:rPr>
-          <w:rFonts w:ascii="Times New Roman" w:hAnsi="Times New Roman" w:cs="Times New Roman"/>
-          <w:color w:val="auto"/>
-          <w:sz w:val="24"/>
-          <w:szCs w:val="24"/>
-        </w:rPr>
-        <w:t>": 75.82,</w:t>
+        <w:t xml:space="preserve">  "humidity_pct": 75.82,</w:t>
       </w:r>
       <w:r>
         <w:rPr>
@@ -2788,27 +2285,7 @@
           <w:szCs w:val="24"/>
         </w:rPr>
         <w:br/>
-        <w:t xml:space="preserve">  "</w:t>
-      </w:r>
-      <w:proofErr w:type="spellStart"/>
-      <w:r>
-        <w:rPr>
-          <w:rFonts w:ascii="Times New Roman" w:hAnsi="Times New Roman" w:cs="Times New Roman"/>
-          <w:color w:val="auto"/>
-          <w:sz w:val="24"/>
-          <w:szCs w:val="24"/>
-        </w:rPr>
-        <w:t>soil_moisture_pct</w:t>
-      </w:r>
-      <w:proofErr w:type="spellEnd"/>
-      <w:r>
-        <w:rPr>
-          <w:rFonts w:ascii="Times New Roman" w:hAnsi="Times New Roman" w:cs="Times New Roman"/>
-          <w:color w:val="auto"/>
-          <w:sz w:val="24"/>
-          <w:szCs w:val="24"/>
-        </w:rPr>
-        <w:t>": 54.34,</w:t>
+        <w:t xml:space="preserve">  "soil_moisture_pct": 54.34,</w:t>
       </w:r>
       <w:r>
         <w:rPr>
@@ -2818,27 +2295,7 @@
           <w:szCs w:val="24"/>
         </w:rPr>
         <w:br/>
-        <w:t xml:space="preserve">  "</w:t>
-      </w:r>
-      <w:proofErr w:type="spellStart"/>
-      <w:r>
-        <w:rPr>
-          <w:rFonts w:ascii="Times New Roman" w:hAnsi="Times New Roman" w:cs="Times New Roman"/>
-          <w:color w:val="auto"/>
-          <w:sz w:val="24"/>
-          <w:szCs w:val="24"/>
-        </w:rPr>
-        <w:t>light_lux</w:t>
-      </w:r>
-      <w:proofErr w:type="spellEnd"/>
-      <w:r>
-        <w:rPr>
-          <w:rFonts w:ascii="Times New Roman" w:hAnsi="Times New Roman" w:cs="Times New Roman"/>
-          <w:color w:val="auto"/>
-          <w:sz w:val="24"/>
-          <w:szCs w:val="24"/>
-        </w:rPr>
-        <w:t>": 20.9,</w:t>
+        <w:t xml:space="preserve">  "light_lux": 20.9,</w:t>
       </w:r>
       <w:r>
         <w:rPr>
@@ -2848,27 +2305,7 @@
           <w:szCs w:val="24"/>
         </w:rPr>
         <w:br/>
-        <w:t xml:space="preserve">  "</w:t>
-      </w:r>
-      <w:proofErr w:type="spellStart"/>
-      <w:r>
-        <w:rPr>
-          <w:rFonts w:ascii="Times New Roman" w:hAnsi="Times New Roman" w:cs="Times New Roman"/>
-          <w:color w:val="auto"/>
-          <w:sz w:val="24"/>
-          <w:szCs w:val="24"/>
-        </w:rPr>
-        <w:t>alert_flag</w:t>
-      </w:r>
-      <w:proofErr w:type="spellEnd"/>
-      <w:r>
-        <w:rPr>
-          <w:rFonts w:ascii="Times New Roman" w:hAnsi="Times New Roman" w:cs="Times New Roman"/>
-          <w:color w:val="auto"/>
-          <w:sz w:val="24"/>
-          <w:szCs w:val="24"/>
-        </w:rPr>
-        <w:t>": 0,</w:t>
+        <w:t xml:space="preserve">  "alert_flag": 0,</w:t>
       </w:r>
       <w:r>
         <w:rPr>
@@ -2878,27 +2315,7 @@
           <w:szCs w:val="24"/>
         </w:rPr>
         <w:br/>
-        <w:t xml:space="preserve">  "</w:t>
-      </w:r>
-      <w:proofErr w:type="spellStart"/>
-      <w:r>
-        <w:rPr>
-          <w:rFonts w:ascii="Times New Roman" w:hAnsi="Times New Roman" w:cs="Times New Roman"/>
-          <w:color w:val="auto"/>
-          <w:sz w:val="24"/>
-          <w:szCs w:val="24"/>
-        </w:rPr>
-        <w:t>alert_reason</w:t>
-      </w:r>
-      <w:proofErr w:type="spellEnd"/>
-      <w:r>
-        <w:rPr>
-          <w:rFonts w:ascii="Times New Roman" w:hAnsi="Times New Roman" w:cs="Times New Roman"/>
-          <w:color w:val="auto"/>
-          <w:sz w:val="24"/>
-          <w:szCs w:val="24"/>
-        </w:rPr>
-        <w:t>": null</w:t>
+        <w:t xml:space="preserve">  "alert_reason": null</w:t>
       </w:r>
       <w:r>
         <w:rPr>
@@ -2948,21 +2365,7 @@
         <w:rPr>
           <w:rFonts w:ascii="Times New Roman" w:hAnsi="Times New Roman" w:cs="Times New Roman"/>
         </w:rPr>
-        <w:t>Threshold and repository tests pass, including exact boundary cases, multi-zone telemetry, nutrient/</w:t>
-      </w:r>
-      <w:proofErr w:type="gramStart"/>
-      <w:r>
-        <w:rPr>
-          <w:rFonts w:ascii="Times New Roman" w:hAnsi="Times New Roman" w:cs="Times New Roman"/>
-        </w:rPr>
-        <w:t>pH fields and alert normalization</w:t>
-      </w:r>
-      <w:proofErr w:type="gramEnd"/>
-      <w:r>
-        <w:rPr>
-          <w:rFonts w:ascii="Times New Roman" w:hAnsi="Times New Roman" w:cs="Times New Roman"/>
-        </w:rPr>
-        <w:t>. The implementation supports eight configured crop zones; active telemetry is still simulated unless a physical publisher is connected.</w:t>
+        <w:t>Threshold and repository tests pass, including exact boundary cases, multi-zone telemetry, nutrient/pH fields and alert normalization. The implementation supports eight configured crop zones; active telemetry is still simulated unless a physical publisher is connected.</w:t>
       </w:r>
     </w:p>
     <w:p>
@@ -2984,27 +2387,7 @@
           <w:sz w:val="24"/>
           <w:szCs w:val="24"/>
         </w:rPr>
-        <w:t xml:space="preserve">Phase 1 artifacts: docs/PHASE1_Project_Proposal.docx and diagrams/architecture.png. Phase 2 artifacts: </w:t>
-      </w:r>
-      <w:proofErr w:type="spellStart"/>
-      <w:r>
-        <w:rPr>
-          <w:rFonts w:ascii="Times New Roman" w:hAnsi="Times New Roman" w:cs="Times New Roman"/>
-          <w:color w:val="auto"/>
-          <w:sz w:val="24"/>
-          <w:szCs w:val="24"/>
-        </w:rPr>
-        <w:t>src</w:t>
-      </w:r>
-      <w:proofErr w:type="spellEnd"/>
-      <w:r>
-        <w:rPr>
-          <w:rFonts w:ascii="Times New Roman" w:hAnsi="Times New Roman" w:cs="Times New Roman"/>
-          <w:color w:val="auto"/>
-          <w:sz w:val="24"/>
-          <w:szCs w:val="24"/>
-        </w:rPr>
-        <w:t>/simulator.py, src/config.py and samples/phase2_sample_output.txt.</w:t>
+        <w:t>Phase 1 artifacts: docs/PHASE1_Project_Proposal.docx and diagrams/architecture.png. Phase 2 artifacts: src/simulator.py, src/config.py and samples/phase2_sample_output.txt.</w:t>
       </w:r>
     </w:p>
     <w:p>
@@ -3067,77 +2450,7 @@
         <w:rPr>
           <w:rFonts w:ascii="Times New Roman" w:hAnsi="Times New Roman" w:cs="Times New Roman"/>
         </w:rPr>
-        <w:t>src/publisher.py sends zone-aware JSON through broker.hivemq.com:1883 on ctec651/</w:t>
-      </w:r>
-      <w:proofErr w:type="spellStart"/>
-      <w:r>
-        <w:rPr>
-          <w:rFonts w:ascii="Times New Roman" w:hAnsi="Times New Roman" w:cs="Times New Roman"/>
-        </w:rPr>
-        <w:t>greenhousewatch</w:t>
-      </w:r>
-      <w:proofErr w:type="spellEnd"/>
-      <w:r>
-        <w:rPr>
-          <w:rFonts w:ascii="Times New Roman" w:hAnsi="Times New Roman" w:cs="Times New Roman"/>
-        </w:rPr>
-        <w:t>/</w:t>
-      </w:r>
-      <w:proofErr w:type="spellStart"/>
-      <w:r>
-        <w:rPr>
-          <w:rFonts w:ascii="Times New Roman" w:hAnsi="Times New Roman" w:cs="Times New Roman"/>
-        </w:rPr>
-        <w:t>ipmcbit</w:t>
-      </w:r>
-      <w:proofErr w:type="spellEnd"/>
-      <w:r>
-        <w:rPr>
-          <w:rFonts w:ascii="Times New Roman" w:hAnsi="Times New Roman" w:cs="Times New Roman"/>
-        </w:rPr>
-        <w:t xml:space="preserve">. src/subscriber.py validates payloads, records </w:t>
-      </w:r>
-      <w:proofErr w:type="spellStart"/>
-      <w:r>
-        <w:rPr>
-          <w:rFonts w:ascii="Times New Roman" w:hAnsi="Times New Roman" w:cs="Times New Roman"/>
-        </w:rPr>
-        <w:t>received_at</w:t>
-      </w:r>
-      <w:proofErr w:type="spellEnd"/>
-      <w:r>
-        <w:rPr>
-          <w:rFonts w:ascii="Times New Roman" w:hAnsi="Times New Roman" w:cs="Times New Roman"/>
-        </w:rPr>
-        <w:t xml:space="preserve">, preserves </w:t>
-      </w:r>
-      <w:proofErr w:type="spellStart"/>
-      <w:r>
-        <w:rPr>
-          <w:rFonts w:ascii="Times New Roman" w:hAnsi="Times New Roman" w:cs="Times New Roman"/>
-        </w:rPr>
-        <w:t>measured_at</w:t>
-      </w:r>
-      <w:proofErr w:type="spellEnd"/>
-      <w:r>
-        <w:rPr>
-          <w:rFonts w:ascii="Times New Roman" w:hAnsi="Times New Roman" w:cs="Times New Roman"/>
-        </w:rPr>
-        <w:t xml:space="preserve">, normalizes crop-specific alert metadata and inserts readings through </w:t>
-      </w:r>
-      <w:proofErr w:type="spellStart"/>
-      <w:r>
-        <w:rPr>
-          <w:rFonts w:ascii="Times New Roman" w:hAnsi="Times New Roman" w:cs="Times New Roman"/>
-        </w:rPr>
-        <w:t>src</w:t>
-      </w:r>
-      <w:proofErr w:type="spellEnd"/>
-      <w:r>
-        <w:rPr>
-          <w:rFonts w:ascii="Times New Roman" w:hAnsi="Times New Roman" w:cs="Times New Roman"/>
-        </w:rPr>
-        <w:t>/db.py. The publisher retries after transient broker disconnects.</w:t>
+        <w:t>src/publisher.py sends zone-aware JSON through broker.hivemq.com:1883 on ctec651/greenhousewatch/ipmcbit. src/subscriber.py validates payloads, records received_at, preserves measured_at, normalizes crop-specific alert metadata and inserts readings through src/db.py. The publisher retries after transient broker disconnects.</w:t>
       </w:r>
     </w:p>
     <w:p>
@@ -3319,47 +2632,7 @@
                 <w:sz w:val="24"/>
                 <w:szCs w:val="24"/>
               </w:rPr>
-              <w:t>data/</w:t>
-            </w:r>
-            <w:proofErr w:type="spellStart"/>
-            <w:r>
-              <w:rPr>
-                <w:rFonts w:ascii="Times New Roman" w:hAnsi="Times New Roman" w:cs="Times New Roman"/>
-                <w:color w:val="auto"/>
-                <w:sz w:val="24"/>
-                <w:szCs w:val="24"/>
-              </w:rPr>
-              <w:t>iot_data.db</w:t>
-            </w:r>
-            <w:proofErr w:type="spellEnd"/>
-            <w:r>
-              <w:rPr>
-                <w:rFonts w:ascii="Times New Roman" w:hAnsi="Times New Roman" w:cs="Times New Roman"/>
-                <w:color w:val="auto"/>
-                <w:sz w:val="24"/>
-                <w:szCs w:val="24"/>
-              </w:rPr>
-              <w:t xml:space="preserve">; PRAGMA </w:t>
-            </w:r>
-            <w:proofErr w:type="spellStart"/>
-            <w:r>
-              <w:rPr>
-                <w:rFonts w:ascii="Times New Roman" w:hAnsi="Times New Roman" w:cs="Times New Roman"/>
-                <w:color w:val="auto"/>
-                <w:sz w:val="24"/>
-                <w:szCs w:val="24"/>
-              </w:rPr>
-              <w:t>integrity_check</w:t>
-            </w:r>
-            <w:proofErr w:type="spellEnd"/>
-            <w:r>
-              <w:rPr>
-                <w:rFonts w:ascii="Times New Roman" w:hAnsi="Times New Roman" w:cs="Times New Roman"/>
-                <w:color w:val="auto"/>
-                <w:sz w:val="24"/>
-                <w:szCs w:val="24"/>
-              </w:rPr>
-              <w:t xml:space="preserve"> = ok</w:t>
+              <w:t>data/iot_data.db; PRAGMA integrity_check = ok</w:t>
             </w:r>
           </w:p>
         </w:tc>
@@ -3804,27 +3077,7 @@
                 <w:sz w:val="24"/>
                 <w:szCs w:val="24"/>
               </w:rPr>
-              <w:t xml:space="preserve">All ISO/numeric times agree within 1 </w:t>
-            </w:r>
-            <w:proofErr w:type="spellStart"/>
-            <w:r>
-              <w:rPr>
-                <w:rFonts w:ascii="Times New Roman" w:hAnsi="Times New Roman" w:cs="Times New Roman"/>
-                <w:color w:val="auto"/>
-                <w:sz w:val="24"/>
-                <w:szCs w:val="24"/>
-              </w:rPr>
-              <w:t>ms</w:t>
-            </w:r>
-            <w:proofErr w:type="spellEnd"/>
-            <w:r>
-              <w:rPr>
-                <w:rFonts w:ascii="Times New Roman" w:hAnsi="Times New Roman" w:cs="Times New Roman"/>
-                <w:color w:val="auto"/>
-                <w:sz w:val="24"/>
-                <w:szCs w:val="24"/>
-              </w:rPr>
-              <w:t>; all alerts match current threshold logic</w:t>
+              <w:t>All ISO/numeric times agree within 1 ms; all alerts match current threshold logic</w:t>
             </w:r>
           </w:p>
         </w:tc>
@@ -3889,27 +3142,7 @@
           <w:szCs w:val="24"/>
         </w:rPr>
         <w:lastRenderedPageBreak/>
-        <w:t xml:space="preserve">MQTT QoS 0 and the publisher console counter do not establish subscriber </w:t>
-      </w:r>
-      <w:proofErr w:type="gramStart"/>
-      <w:r>
-        <w:rPr>
-          <w:rFonts w:ascii="Times New Roman" w:hAnsi="Times New Roman" w:cs="Times New Roman"/>
-          <w:color w:val="auto"/>
-          <w:sz w:val="24"/>
-          <w:szCs w:val="24"/>
-        </w:rPr>
-        <w:t>receipt</w:t>
-      </w:r>
-      <w:proofErr w:type="gramEnd"/>
-      <w:r>
-        <w:rPr>
-          <w:rFonts w:ascii="Times New Roman" w:hAnsi="Times New Roman" w:cs="Times New Roman"/>
-          <w:color w:val="auto"/>
-          <w:sz w:val="24"/>
-          <w:szCs w:val="24"/>
-        </w:rPr>
-        <w:t>. For this snapshot, the independent subscriber log and database matching provide the stronger evidence. The offline script bypasses MQTT and cannot by itself prove Phase 3 communication.</w:t>
+        <w:t>MQTT QoS 0 and the publisher console counter do not establish subscriber receipt. For this snapshot, the independent subscriber log and database matching provide the stronger evidence. The offline script bypasses MQTT and cannot by itself prove Phase 3 communication.</w:t>
       </w:r>
     </w:p>
     <w:p>
@@ -3961,34 +3194,32 @@
         <w:rPr>
           <w:rFonts w:ascii="Times New Roman" w:hAnsi="Times New Roman" w:cs="Times New Roman"/>
         </w:rPr>
-        <w:t xml:space="preserve">The Phase 5 charts now cover a full year, 1 October 2025 to 26 September 2026 (361 whole days, local Bowie time), so the data can be read by day, month, quarter and year. Outdoor weather is real: hourly temperature, humidity and solar radiation for Bowie, MD from the free Open-Meteo historical archive. Indoor conditions for the Tomato, Lettuce and Seedling zones are modelled from that weather hour by hour, applying the controls a typical greenhouse has: solar gain, a heater held just above each crop's minimum, a 40% shade cloth on hot days, vents with evaporative pad cooling, fogging for dry air, morning irrigation with an afternoon top-up and a weekly nutrient change. These rows are stored with source = 'weather model' so they are never confused with sensor readings. Each zone is judged against its own crop targets; an hour is outside target when temperature, humidity or soil moisture is out of range.</w:t>
-      </w:r>
-      <w:proofErr w:type="spellStart"/>
-      <w:proofErr w:type="spellEnd"/>
-    </w:p>
-    <w:p>
-      <w:pPr>
-        <w:pStyle w:val="Heading2"/>
-        <w:jc w:val="both"/>
-        <w:rPr>
-          <w:rFonts w:ascii="Times New Roman" w:hAnsi="Times New Roman" w:cs="Times New Roman"/>
-          <w:color w:val="auto"/>
-          <w:sz w:val="24"/>
-          <w:szCs w:val="24"/>
-        </w:rPr>
-      </w:pPr>
-      <w:r>
-        <w:rPr>
-          <w:rFonts w:ascii="Times New Roman" w:hAnsi="Times New Roman" w:cs="Times New Roman"/>
-          <w:color w:val="auto"/>
-          <w:sz w:val="24"/>
-          <w:szCs w:val="24"/>
-        </w:rPr>
-        <w:t xml:space="preserve">Days</w:t>
+        <w:t>The Phase 5 charts now cover a full year, 1 October 2025 to 26 September 2026 (361 whole days, local Bowie time), so the data can be read by day, month, quarter and year. Outdoor weather is real: hourly temperature, humidity and solar radiation for Bowie, MD from the free Open-Meteo historical archive. Indoor conditions for the Tomato, Lettuce and Seedling zones are modelled from that weather hour by hour, applying the controls a typical greenhouse has: solar gain, a heater held just above each crop's minimum, a 40% shade cloth on hot days, vents with evaporative pad cooling, fogging for dry air, morning irrigation with an afternoon top-up and a weekly nutrient change. These rows are stored with source = 'weather model' so they are never confused with sensor readings. Each zone is judged against its own crop targets; an hour is outside target when temperature, humidity or soil moisture is out of range.</w:t>
       </w:r>
     </w:p>
     <w:p>
       <w:pPr>
+        <w:pStyle w:val="Heading2"/>
+        <w:jc w:val="both"/>
+        <w:rPr>
+          <w:rFonts w:ascii="Times New Roman" w:hAnsi="Times New Roman" w:cs="Times New Roman"/>
+          <w:color w:val="auto"/>
+          <w:sz w:val="24"/>
+          <w:szCs w:val="24"/>
+        </w:rPr>
+      </w:pPr>
+      <w:r>
+        <w:rPr>
+          <w:rFonts w:ascii="Times New Roman" w:hAnsi="Times New Roman" w:cs="Times New Roman"/>
+          <w:color w:val="auto"/>
+          <w:sz w:val="24"/>
+          <w:szCs w:val="24"/>
+        </w:rPr>
+        <w:t>Days</w:t>
+      </w:r>
+    </w:p>
+    <w:p>
+      <w:pPr>
         <w:spacing w:line="276" w:lineRule="auto"/>
         <w:jc w:val="both"/>
         <w:rPr>
@@ -4007,21 +3238,22 @@
           <w:szCs w:val="24"/>
         </w:rPr>
         <w:drawing>
-          <wp:inline xmlns:a="http://schemas.openxmlformats.org/drawingml/2006/main" xmlns:pic="http://schemas.openxmlformats.org/drawingml/2006/picture">
+          <wp:inline distT="0" distB="0" distL="0" distR="0" wp14:anchorId="1755E21D" wp14:editId="54D0439B">
             <wp:extent cx="5486400" cy="3657600"/>
+            <wp:effectExtent l="0" t="0" r="0" b="0"/>
             <wp:docPr id="11" name="Picture 11"/>
             <wp:cNvGraphicFramePr>
-              <a:graphicFrameLocks noChangeAspect="1"/>
+              <a:graphicFrameLocks xmlns:a="http://schemas.openxmlformats.org/drawingml/2006/main" noChangeAspect="1"/>
             </wp:cNvGraphicFramePr>
-            <a:graphic>
+            <a:graphic xmlns:a="http://schemas.openxmlformats.org/drawingml/2006/main">
               <a:graphicData uri="http://schemas.openxmlformats.org/drawingml/2006/picture">
-                <pic:pic>
+                <pic:pic xmlns:pic="http://schemas.openxmlformats.org/drawingml/2006/picture">
                   <pic:nvPicPr>
                     <pic:cNvPr id="0" name="02_daily_cycle_by_season.png"/>
                     <pic:cNvPicPr/>
                   </pic:nvPicPr>
                   <pic:blipFill>
-                    <a:blip r:embed="rId22"/>
+                    <a:blip r:embed="rId9"/>
                     <a:stretch>
                       <a:fillRect/>
                     </a:stretch>
@@ -4031,7 +3263,9 @@
                       <a:off x="0" y="0"/>
                       <a:ext cx="5486400" cy="3657600"/>
                     </a:xfrm>
-                    <a:prstGeom prst="rect"/>
+                    <a:prstGeom prst="rect">
+                      <a:avLst/>
+                    </a:prstGeom>
                   </pic:spPr>
                 </pic:pic>
               </a:graphicData>
@@ -4059,7 +3293,7 @@
           <w:sz w:val="24"/>
           <w:szCs w:val="24"/>
         </w:rPr>
-        <w:t xml:space="preserve">Figure 2. Average 24-hour temperature cycle in each season, by zone, against outdoor air.</w:t>
+        <w:t>Figure 2. Average 24-hour temperature cycle in each season, by zone, against outdoor air.</w:t>
       </w:r>
     </w:p>
     <w:p>
@@ -4077,10 +3311,8 @@
         <w:rPr>
           <w:rFonts w:ascii="Times New Roman" w:hAnsi="Times New Roman" w:cs="Times New Roman"/>
         </w:rPr>
-        <w:t xml:space="preserve">In winter the indoor lines are almost flat while the outdoor mean runs from about -2 to 4 degrees C: heating holds each zone just above its minimum all day. In summer the pattern reverses. Outdoor air peaks near 29 degrees C in mid-afternoon and every zone rises with it. Between 15:00 and 16:00, Lettuce is outside its temperature target in 48% of hours and Seedlings in 45%, against 14% and 3% at 03:00.</w:t>
+        <w:t>In winter the indoor lines are almost flat while the outdoor mean runs from about -2 to 4 degrees C: heating holds each zone just above its minimum all day. In summer the pattern reverses. Outdoor air peaks near 29 degrees C in mid-afternoon and every zone rises with it. Between 15:00 and 16:00, Lettuce is outside its temperature target in 48% of hours and Seedlings in 45%, against 14% and 3% at 03:00.</w:t>
       </w:r>
-      <w:proofErr w:type="spellStart"/>
-      <w:proofErr w:type="spellEnd"/>
     </w:p>
     <w:p>
       <w:pPr>
@@ -4101,22 +3333,24 @@
           <w:sz w:val="24"/>
           <w:szCs w:val="24"/>
         </w:rPr>
+        <w:lastRenderedPageBreak/>
         <w:drawing>
-          <wp:inline xmlns:a="http://schemas.openxmlformats.org/drawingml/2006/main" xmlns:pic="http://schemas.openxmlformats.org/drawingml/2006/picture">
+          <wp:inline distT="0" distB="0" distL="0" distR="0" wp14:anchorId="54BE7FAD" wp14:editId="2B34FF0B">
             <wp:extent cx="5486400" cy="4343400"/>
+            <wp:effectExtent l="0" t="0" r="0" b="0"/>
             <wp:docPr id="12" name="Picture 12"/>
             <wp:cNvGraphicFramePr>
-              <a:graphicFrameLocks noChangeAspect="1"/>
+              <a:graphicFrameLocks xmlns:a="http://schemas.openxmlformats.org/drawingml/2006/main" noChangeAspect="1"/>
             </wp:cNvGraphicFramePr>
-            <a:graphic>
+            <a:graphic xmlns:a="http://schemas.openxmlformats.org/drawingml/2006/main">
               <a:graphicData uri="http://schemas.openxmlformats.org/drawingml/2006/picture">
-                <pic:pic>
+                <pic:pic xmlns:pic="http://schemas.openxmlformats.org/drawingml/2006/picture">
                   <pic:nvPicPr>
                     <pic:cNvPr id="0" name="03_daily_temperature_year.png"/>
                     <pic:cNvPicPr/>
                   </pic:nvPicPr>
                   <pic:blipFill>
-                    <a:blip r:embed="rId23"/>
+                    <a:blip r:embed="rId10"/>
                     <a:stretch>
                       <a:fillRect/>
                     </a:stretch>
@@ -4126,7 +3360,9 @@
                       <a:off x="0" y="0"/>
                       <a:ext cx="5486400" cy="4343400"/>
                     </a:xfrm>
-                    <a:prstGeom prst="rect"/>
+                    <a:prstGeom prst="rect">
+                      <a:avLst/>
+                    </a:prstGeom>
                   </pic:spPr>
                 </pic:pic>
               </a:graphicData>
@@ -4154,7 +3390,7 @@
           <w:sz w:val="24"/>
           <w:szCs w:val="24"/>
         </w:rPr>
-        <w:t xml:space="preserve">Figure 3. Daily mean (line) and low-to-high range (shading) for every day of the year, with each crop's target band (grey) and the outdoor daily mean.</w:t>
+        <w:t>Figure 3. Daily mean (line) and low-to-high range (shading) for every day of the year, with each crop's target band (grey) and the outdoor daily mean.</w:t>
       </w:r>
     </w:p>
     <w:p>
@@ -4172,34 +3408,33 @@
         <w:rPr>
           <w:rFonts w:ascii="Times New Roman" w:hAnsi="Times New Roman" w:cs="Times New Roman"/>
         </w:rPr>
-        <w:t xml:space="preserve">From November to March each zone's daily mean sits on the lower edge of its target band, including the coldest hour of the year (-17.7 degrees C outdoors at 06:00 on 30 January 2026). From June to September daily highs break above the band; on the hottest day (37.4 degrees C outdoors, 4 July 2026) all three zones peak above 29 degrees C.</w:t>
-      </w:r>
-      <w:proofErr w:type="spellStart"/>
-      <w:proofErr w:type="spellEnd"/>
-    </w:p>
-    <w:p>
-      <w:pPr>
-        <w:pStyle w:val="Heading2"/>
-        <w:jc w:val="both"/>
-        <w:rPr>
-          <w:rFonts w:ascii="Times New Roman" w:hAnsi="Times New Roman" w:cs="Times New Roman"/>
-          <w:color w:val="auto"/>
-          <w:sz w:val="24"/>
-          <w:szCs w:val="24"/>
-        </w:rPr>
-      </w:pPr>
-      <w:r>
-        <w:rPr>
-          <w:rFonts w:ascii="Times New Roman" w:hAnsi="Times New Roman" w:cs="Times New Roman"/>
-          <w:color w:val="auto"/>
-          <w:sz w:val="24"/>
-          <w:szCs w:val="24"/>
-        </w:rPr>
-        <w:t xml:space="preserve">Months and quarters</w:t>
+        <w:t>From November to March each zone's daily mean sits on the lower edge of its target band, including the coldest hour of the year (-17.7 degrees C outdoors at 06:00 on 30 January 2026). From June to September daily highs break above the band; on the hottest day (37.4 degrees C outdoors, 4 July 2026) all three zones peak above 29 degrees C.</w:t>
       </w:r>
     </w:p>
     <w:p>
       <w:pPr>
+        <w:pStyle w:val="Heading2"/>
+        <w:jc w:val="both"/>
+        <w:rPr>
+          <w:rFonts w:ascii="Times New Roman" w:hAnsi="Times New Roman" w:cs="Times New Roman"/>
+          <w:color w:val="auto"/>
+          <w:sz w:val="24"/>
+          <w:szCs w:val="24"/>
+        </w:rPr>
+      </w:pPr>
+      <w:r>
+        <w:rPr>
+          <w:rFonts w:ascii="Times New Roman" w:hAnsi="Times New Roman" w:cs="Times New Roman"/>
+          <w:color w:val="auto"/>
+          <w:sz w:val="24"/>
+          <w:szCs w:val="24"/>
+        </w:rPr>
+        <w:lastRenderedPageBreak/>
+        <w:t>Months and quarters</w:t>
+      </w:r>
+    </w:p>
+    <w:p>
+      <w:pPr>
         <w:spacing w:line="276" w:lineRule="auto"/>
         <w:jc w:val="both"/>
         <w:rPr>
@@ -4218,21 +3453,22 @@
           <w:szCs w:val="24"/>
         </w:rPr>
         <w:drawing>
-          <wp:inline xmlns:a="http://schemas.openxmlformats.org/drawingml/2006/main" xmlns:pic="http://schemas.openxmlformats.org/drawingml/2006/picture">
+          <wp:inline distT="0" distB="0" distL="0" distR="0" wp14:anchorId="2B2911C1" wp14:editId="619ADAE6">
             <wp:extent cx="5486400" cy="3886200"/>
+            <wp:effectExtent l="0" t="0" r="0" b="0"/>
             <wp:docPr id="13" name="Picture 13"/>
             <wp:cNvGraphicFramePr>
-              <a:graphicFrameLocks noChangeAspect="1"/>
+              <a:graphicFrameLocks xmlns:a="http://schemas.openxmlformats.org/drawingml/2006/main" noChangeAspect="1"/>
             </wp:cNvGraphicFramePr>
-            <a:graphic>
+            <a:graphic xmlns:a="http://schemas.openxmlformats.org/drawingml/2006/main">
               <a:graphicData uri="http://schemas.openxmlformats.org/drawingml/2006/picture">
-                <pic:pic>
+                <pic:pic xmlns:pic="http://schemas.openxmlformats.org/drawingml/2006/picture">
                   <pic:nvPicPr>
                     <pic:cNvPr id="0" name="04_monthly_summary.png"/>
                     <pic:cNvPicPr/>
                   </pic:nvPicPr>
                   <pic:blipFill>
-                    <a:blip r:embed="rId24"/>
+                    <a:blip r:embed="rId11"/>
                     <a:stretch>
                       <a:fillRect/>
                     </a:stretch>
@@ -4242,7 +3478,9 @@
                       <a:off x="0" y="0"/>
                       <a:ext cx="5486400" cy="3886200"/>
                     </a:xfrm>
-                    <a:prstGeom prst="rect"/>
+                    <a:prstGeom prst="rect">
+                      <a:avLst/>
+                    </a:prstGeom>
                   </pic:spPr>
                 </pic:pic>
               </a:graphicData>
@@ -4270,7 +3508,7 @@
           <w:sz w:val="24"/>
           <w:szCs w:val="24"/>
         </w:rPr>
-        <w:t xml:space="preserve">Figure 4. Monthly mean temperature (top) and share of hours outside any target (bottom), by zone.</w:t>
+        <w:t>Figure 4. Monthly mean temperature (top) and share of hours outside any target (bottom), by zone.</w:t>
       </w:r>
     </w:p>
     <w:p>
@@ -4288,10 +3526,8 @@
         <w:rPr>
           <w:rFonts w:ascii="Times New Roman" w:hAnsi="Times New Roman" w:cs="Times New Roman"/>
         </w:rPr>
-        <w:t xml:space="preserve">Monthly mean outdoor temperature ranges from -1 degrees C in January to 25 degrees C in July, while Tomatoes stay between 21 and 26 degrees C every month. Hours outside target have two separate seasonal causes. In January heated air is too dry, and Seedlings are outside target 51% of hours. In July and August pad cooling cannot pull humid summer air low enough, and Lettuce reaches 82% and 85%. November is the easiest month (1-13%).</w:t>
+        <w:t>Monthly mean outdoor temperature ranges from -1 degrees C in January to 25 degrees C in July, while Tomatoes stay between 21 and 26 degrees C every month. Hours outside target have two separate seasonal causes. In January heated air is too dry, and Seedlings are outside target 51% of hours. In July and August pad cooling cannot pull humid summer air low enough, and Lettuce reaches 82% and 85%. November is the easiest month (1-13%).</w:t>
       </w:r>
-      <w:proofErr w:type="spellStart"/>
-      <w:proofErr w:type="spellEnd"/>
     </w:p>
     <w:p>
       <w:pPr>
@@ -4312,22 +3548,24 @@
           <w:sz w:val="24"/>
           <w:szCs w:val="24"/>
         </w:rPr>
+        <w:lastRenderedPageBreak/>
         <w:drawing>
-          <wp:inline xmlns:a="http://schemas.openxmlformats.org/drawingml/2006/main" xmlns:pic="http://schemas.openxmlformats.org/drawingml/2006/picture">
+          <wp:inline distT="0" distB="0" distL="0" distR="0" wp14:anchorId="0CCC95D4" wp14:editId="1F9CAB8D">
             <wp:extent cx="5486400" cy="4239491"/>
+            <wp:effectExtent l="0" t="0" r="0" b="0"/>
             <wp:docPr id="14" name="Picture 14"/>
             <wp:cNvGraphicFramePr>
-              <a:graphicFrameLocks noChangeAspect="1"/>
+              <a:graphicFrameLocks xmlns:a="http://schemas.openxmlformats.org/drawingml/2006/main" noChangeAspect="1"/>
             </wp:cNvGraphicFramePr>
-            <a:graphic>
+            <a:graphic xmlns:a="http://schemas.openxmlformats.org/drawingml/2006/main">
               <a:graphicData uri="http://schemas.openxmlformats.org/drawingml/2006/picture">
-                <pic:pic>
+                <pic:pic xmlns:pic="http://schemas.openxmlformats.org/drawingml/2006/picture">
                   <pic:nvPicPr>
                     <pic:cNvPr id="0" name="05_quarterly_summary.png"/>
                     <pic:cNvPicPr/>
                   </pic:nvPicPr>
                   <pic:blipFill>
-                    <a:blip r:embed="rId25"/>
+                    <a:blip r:embed="rId12"/>
                     <a:stretch>
                       <a:fillRect/>
                     </a:stretch>
@@ -4337,7 +3575,9 @@
                       <a:off x="0" y="0"/>
                       <a:ext cx="5486400" cy="4239491"/>
                     </a:xfrm>
-                    <a:prstGeom prst="rect"/>
+                    <a:prstGeom prst="rect">
+                      <a:avLst/>
+                    </a:prstGeom>
                   </pic:spPr>
                 </pic:pic>
               </a:graphicData>
@@ -4365,7 +3605,7 @@
           <w:sz w:val="24"/>
           <w:szCs w:val="24"/>
         </w:rPr>
-        <w:t xml:space="preserve">Figure 5. Share of hours outside each target by quarter and zone (darker = worse).</w:t>
+        <w:t>Figure 5. Share of hours outside each target by quarter and zone (darker = worse).</w:t>
       </w:r>
     </w:p>
     <w:p>
@@ -4383,34 +3623,33 @@
         <w:rPr>
           <w:rFonts w:ascii="Times New Roman" w:hAnsi="Times New Roman" w:cs="Times New Roman"/>
         </w:rPr>
-        <w:t xml:space="preserve">By quarter, hours outside any target rise from Q4 2025 to Q3 2026 for every zone: Tomatoes 4%, 13%, 17%, 35%; Lettuce 6%, 12%, 38%, 76%; Seedlings 18%, 32%, 28%, 56%. The breakdown shows why: Lettuce fails on temperature in summer (69% of Q3 hours), while Seedlings fail on humidity in winter (30% of Q1 hours). Soil moisture was within target in all but four hours of the year, all in the Seedling zone after missed irrigation cycles, so irrigation is not the constraint.</w:t>
-      </w:r>
-      <w:proofErr w:type="spellStart"/>
-      <w:proofErr w:type="spellEnd"/>
-    </w:p>
-    <w:p>
-      <w:pPr>
-        <w:pStyle w:val="Heading2"/>
-        <w:jc w:val="both"/>
-        <w:rPr>
-          <w:rFonts w:ascii="Times New Roman" w:hAnsi="Times New Roman" w:cs="Times New Roman"/>
-          <w:color w:val="auto"/>
-          <w:sz w:val="24"/>
-          <w:szCs w:val="24"/>
-        </w:rPr>
-      </w:pPr>
-      <w:r>
-        <w:rPr>
-          <w:rFonts w:ascii="Times New Roman" w:hAnsi="Times New Roman" w:cs="Times New Roman"/>
-          <w:color w:val="auto"/>
-          <w:sz w:val="24"/>
-          <w:szCs w:val="24"/>
-        </w:rPr>
-        <w:t xml:space="preserve">Year</w:t>
+        <w:t>By quarter, hours outside any target rise from Q4 2025 to Q3 2026 for every zone: Tomatoes 4%, 13%, 17%, 35%; Lettuce 6%, 12%, 38%, 76%; Seedlings 18%, 32%, 28%, 56%. The breakdown shows why: Lettuce fails on temperature in summer (69% of Q3 hours), while Seedlings fail on humidity in winter (30% of Q1 hours). Soil moisture was within target in all but four hours of the year, all in the Seedling zone after missed irrigation cycles, so irrigation is not the constraint.</w:t>
       </w:r>
     </w:p>
     <w:p>
       <w:pPr>
+        <w:pStyle w:val="Heading2"/>
+        <w:jc w:val="both"/>
+        <w:rPr>
+          <w:rFonts w:ascii="Times New Roman" w:hAnsi="Times New Roman" w:cs="Times New Roman"/>
+          <w:color w:val="auto"/>
+          <w:sz w:val="24"/>
+          <w:szCs w:val="24"/>
+        </w:rPr>
+      </w:pPr>
+      <w:r>
+        <w:rPr>
+          <w:rFonts w:ascii="Times New Roman" w:hAnsi="Times New Roman" w:cs="Times New Roman"/>
+          <w:color w:val="auto"/>
+          <w:sz w:val="24"/>
+          <w:szCs w:val="24"/>
+        </w:rPr>
+        <w:lastRenderedPageBreak/>
+        <w:t>Year</w:t>
+      </w:r>
+    </w:p>
+    <w:p>
+      <w:pPr>
         <w:spacing w:line="276" w:lineRule="auto"/>
         <w:jc w:val="both"/>
         <w:rPr>
@@ -4429,21 +3668,22 @@
           <w:szCs w:val="24"/>
         </w:rPr>
         <w:drawing>
-          <wp:inline xmlns:a="http://schemas.openxmlformats.org/drawingml/2006/main" xmlns:pic="http://schemas.openxmlformats.org/drawingml/2006/picture">
+          <wp:inline distT="0" distB="0" distL="0" distR="0" wp14:anchorId="586E0947" wp14:editId="1066C675">
             <wp:extent cx="5486400" cy="3038622"/>
+            <wp:effectExtent l="0" t="0" r="0" b="0"/>
             <wp:docPr id="15" name="Picture 15"/>
             <wp:cNvGraphicFramePr>
-              <a:graphicFrameLocks noChangeAspect="1"/>
+              <a:graphicFrameLocks xmlns:a="http://schemas.openxmlformats.org/drawingml/2006/main" noChangeAspect="1"/>
             </wp:cNvGraphicFramePr>
-            <a:graphic>
+            <a:graphic xmlns:a="http://schemas.openxmlformats.org/drawingml/2006/main">
               <a:graphicData uri="http://schemas.openxmlformats.org/drawingml/2006/picture">
-                <pic:pic>
+                <pic:pic xmlns:pic="http://schemas.openxmlformats.org/drawingml/2006/picture">
                   <pic:nvPicPr>
                     <pic:cNvPr id="0" name="06_year_calendar.png"/>
                     <pic:cNvPicPr/>
                   </pic:nvPicPr>
                   <pic:blipFill>
-                    <a:blip r:embed="rId26"/>
+                    <a:blip r:embed="rId13"/>
                     <a:stretch>
                       <a:fillRect/>
                     </a:stretch>
@@ -4453,7 +3693,9 @@
                       <a:off x="0" y="0"/>
                       <a:ext cx="5486400" cy="3038622"/>
                     </a:xfrm>
-                    <a:prstGeom prst="rect"/>
+                    <a:prstGeom prst="rect">
+                      <a:avLst/>
+                    </a:prstGeom>
                   </pic:spPr>
                 </pic:pic>
               </a:graphicData>
@@ -4481,7 +3723,7 @@
           <w:sz w:val="24"/>
           <w:szCs w:val="24"/>
         </w:rPr>
-        <w:t xml:space="preserve">Figure 6. Calendar of hours outside any target for each day of the year, by zone.</w:t>
+        <w:t>Figure 6. Calendar of hours outside any target for each day of the year, by zone.</w:t>
       </w:r>
     </w:p>
     <w:p>
@@ -4499,36 +3741,13 @@
         <w:rPr>
           <w:rFonts w:ascii="Times New Roman" w:hAnsi="Times New Roman" w:cs="Times New Roman"/>
         </w:rPr>
-        <w:t xml:space="preserve">Of 361 days, Tomatoes had 136 days within target in every hour, Lettuce 103 and Seedlings 76. The problem days cluster in two blocks: late January to February (dry air, mostly Seedlings) and June to early September (heat, mostly Lettuce). The indoor-versus-outdoor chart (outputs/07_indoor_vs_outdoor.png) shows the same threshold: indoor temperature is flat while the outdoor daily mean is below about 15 degrees C and starts to track outdoor air above about 20 degrees C.</w:t>
-      </w:r>
-      <w:proofErr w:type="spellStart"/>
-      <w:proofErr w:type="spellEnd"/>
-    </w:p>
-    <w:p>
-      <w:pPr>
-        <w:pStyle w:val="Heading2"/>
-        <w:jc w:val="both"/>
-        <w:rPr>
-          <w:rFonts w:ascii="Times New Roman" w:hAnsi="Times New Roman" w:cs="Times New Roman"/>
-          <w:color w:val="auto"/>
-          <w:sz w:val="24"/>
-          <w:szCs w:val="24"/>
-        </w:rPr>
-      </w:pPr>
-      <w:r>
-        <w:rPr>
-          <w:rFonts w:ascii="Times New Roman" w:hAnsi="Times New Roman" w:cs="Times New Roman"/>
-          <w:color w:val="auto"/>
-          <w:sz w:val="24"/>
-          <w:szCs w:val="24"/>
-        </w:rPr>
-        <w:t xml:space="preserve">Implications</w:t>
+        <w:t>Of 361 days, Tomatoes had 136 days within target in every hour, Lettuce 103 and Seedlings 76. The problem days cluster in two blocks: late January to February (dry air, mostly Seedlings) and June to early September (heat, mostly Lettuce). The indoor-versus-outdoor chart (outputs/07_indoor_vs_outdoor.png) shows the same threshold: indoor temperature is flat while the outdoor daily mean is below about 15 degrees C and starts to track outdoor air above about 20 degrees C.</w:t>
       </w:r>
     </w:p>
     <w:p>
       <w:pPr>
-        <w:pStyle w:val="ListBullet"/>
-        <w:spacing w:line="276" w:lineRule="auto"/>
+        <w:pStyle w:val="Heading2"/>
+        <w:jc w:val="both"/>
         <w:rPr>
           <w:rFonts w:ascii="Times New Roman" w:hAnsi="Times New Roman" w:cs="Times New Roman"/>
           <w:color w:val="auto"/>
@@ -4543,7 +3762,7 @@
           <w:sz w:val="24"/>
           <w:szCs w:val="24"/>
         </w:rPr>
-        <w:t xml:space="preserve">Lettuce is a cool-season crop in this house: within target 94% of hours in Q4 but 24% in Q3. Growing it from October to April and switching to a heat-tolerant crop over summer would remove most of its alert hours.</w:t>
+        <w:t>Implications</w:t>
       </w:r>
     </w:p>
     <w:p>
@@ -4564,7 +3783,7 @@
           <w:sz w:val="24"/>
           <w:szCs w:val="24"/>
         </w:rPr>
-        <w:t xml:space="preserve">Seedlings need more winter humidity: a third of Q1 hours are too dry because heating dries the air. Added fogging capacity or propagation covers is the cheapest fix.</w:t>
+        <w:t>Lettuce is a cool-season crop in this house: within target 94% of hours in Q4 but 24% in Q3. Growing it from October to April and switching to a heat-tolerant crop over summer would remove most of its alert hours.</w:t>
       </w:r>
     </w:p>
     <w:p>
@@ -4585,7 +3804,28 @@
           <w:sz w:val="24"/>
           <w:szCs w:val="24"/>
         </w:rPr>
-        <w:t xml:space="preserve">Tomatoes suit the house best, outside target 17% of the year and mostly on summer afternoons; stronger shading or cooling in July and August would help most.</w:t>
+        <w:t>Seedlings need more winter humidity: a third of Q1 hours are too dry because heating dries the air. Added fogging capacity or propagation covers is the cheapest fix.</w:t>
+      </w:r>
+    </w:p>
+    <w:p>
+      <w:pPr>
+        <w:pStyle w:val="ListBullet"/>
+        <w:spacing w:line="276" w:lineRule="auto"/>
+        <w:rPr>
+          <w:rFonts w:ascii="Times New Roman" w:hAnsi="Times New Roman" w:cs="Times New Roman"/>
+          <w:color w:val="auto"/>
+          <w:sz w:val="24"/>
+          <w:szCs w:val="24"/>
+        </w:rPr>
+      </w:pPr>
+      <w:r>
+        <w:rPr>
+          <w:rFonts w:ascii="Times New Roman" w:hAnsi="Times New Roman" w:cs="Times New Roman"/>
+          <w:color w:val="auto"/>
+          <w:sz w:val="24"/>
+          <w:szCs w:val="24"/>
+        </w:rPr>
+        <w:t>Tomatoes suit the house best, outside target 17% of the year and mostly on summer afternoons; stronger shading or cooling in July and August would help most.</w:t>
       </w:r>
     </w:p>
     <w:p>
@@ -4613,7 +3853,6 @@
       <w:pPr>
         <w:pStyle w:val="Evidence"/>
         <w:spacing w:line="276" w:lineRule="auto"/>
-        <w:jc w:val="left"/>
         <w:rPr>
           <w:rFonts w:ascii="Times New Roman" w:hAnsi="Times New Roman" w:cs="Times New Roman"/>
           <w:color w:val="auto"/>
@@ -4628,10 +3867,17 @@
           <w:sz w:val="24"/>
           <w:szCs w:val="24"/>
         </w:rPr>
-        <w:t xml:space="preserve">Sources: outputs/02_daily_cycle_by_season.png, 03_daily_temperature_year.png, 04_monthly_summary.png, 05_quarterly_summary.png and 06_year_calendar.png, with the numbers in outputs/monthly_summary.csv and quarterly_summary.csv. Additional charts: 01_last_7_days_hourly.png and 07_indoor_vs_outdoor.png. Generated by src/build_history.py and src/visualize.py from data/iot_data.db. Limit: indoor values are a model of how a typical greenhouse with these controls responds to the weather Bowie actually had, not measurements. Full write-up: docs/visualization_interpretation.md.</w:t>
+        <w:t xml:space="preserve">Sources: outputs/02_daily_cycle_by_season.png, 03_daily_temperature_year.png, 04_monthly_summary.png, 05_quarterly_summary.png and 06_year_calendar.png, with the numbers in outputs/monthly_summary.csv and quarterly_summary.csv. Additional charts: 01_last_7_days_hourly.png and 07_indoor_vs_outdoor.png. Generated by src/build_history.py </w:t>
       </w:r>
-      <w:proofErr w:type="spellStart"/>
-      <w:proofErr w:type="spellEnd"/>
+      <w:r>
+        <w:rPr>
+          <w:rFonts w:ascii="Times New Roman" w:hAnsi="Times New Roman" w:cs="Times New Roman"/>
+          <w:color w:val="auto"/>
+          <w:sz w:val="24"/>
+          <w:szCs w:val="24"/>
+        </w:rPr>
+        <w:t>and src/visualize.py from data/iot_data.db. Limit: indoor values are a model of how a typical greenhouse with these controls responds to the weather Bowie actually had, not measurements. Full write-up: docs/visualization_interpretation.md. Reproducibility: the model uses a fixed seed (651), so running python src/visualize.py regenerates these figures pixel for pixel; the same readings can also be sent through MQTT with python src/publisher.py --replay-history and produce the same charts.</w:t>
+      </w:r>
     </w:p>
     <w:p>
       <w:pPr>
@@ -4789,35 +4035,7 @@
         <w:rPr>
           <w:rFonts w:ascii="Times New Roman" w:hAnsi="Times New Roman" w:cs="Times New Roman"/>
         </w:rPr>
-        <w:t xml:space="preserve">src/dashboard.py launches a multi-page </w:t>
-      </w:r>
-      <w:proofErr w:type="spellStart"/>
-      <w:r>
-        <w:rPr>
-          <w:rFonts w:ascii="Times New Roman" w:hAnsi="Times New Roman" w:cs="Times New Roman"/>
-        </w:rPr>
-        <w:t>Streamlit</w:t>
-      </w:r>
-      <w:proofErr w:type="spellEnd"/>
-      <w:r>
-        <w:rPr>
-          <w:rFonts w:ascii="Times New Roman" w:hAnsi="Times New Roman" w:cs="Times New Roman"/>
-        </w:rPr>
-        <w:t xml:space="preserve"> application. Overview presents primary zone health, explicit KPI averages, environmental trends and data-quality status. Zones </w:t>
-      </w:r>
-      <w:proofErr w:type="gramStart"/>
-      <w:r>
-        <w:rPr>
-          <w:rFonts w:ascii="Times New Roman" w:hAnsi="Times New Roman" w:cs="Times New Roman"/>
-        </w:rPr>
-        <w:t>provides</w:t>
-      </w:r>
-      <w:proofErr w:type="gramEnd"/>
-      <w:r>
-        <w:rPr>
-          <w:rFonts w:ascii="Times New Roman" w:hAnsi="Times New Roman" w:cs="Times New Roman"/>
-        </w:rPr>
-        <w:t xml:space="preserve"> a searchable crop directory and selected-zone details. Analytics provides compact filters, zone comparison, gaps, alert analysis and summaries. Forecast provides a default Bowie location, current weather, daily summaries, recommendations and indoor/outdoor comparison. Analytics also includes Long-term trends, which groups every stored reading by day, week, month, quarter or year, by zone and data source, with a table view and CSV export.</w:t>
+        <w:t>src/dashboard.py launches a multi-page Streamlit application. Overview presents primary zone health, explicit KPI averages, environmental trends and data-quality status. Zones provides a searchable crop directory and selected-zone details. Analytics provides compact filters, zone comparison, gaps, alert analysis and summaries. Forecast provides a default Bowie location, current weather, daily summaries, recommendations and indoor/outdoor comparison. Analytics also includes Long-term trends, which groups every stored reading by day, week, month, quarter or year, by zone and data source, with a table view and CSV export.</w:t>
       </w:r>
     </w:p>
     <w:p>
@@ -5007,7 +4225,6 @@
                 <w:sz w:val="24"/>
                 <w:szCs w:val="24"/>
               </w:rPr>
-              <w:lastRenderedPageBreak/>
               <w:t>Objective (PDF p. 1)</w:t>
             </w:r>
           </w:p>
@@ -5062,7 +4279,6 @@
                 <w:szCs w:val="24"/>
               </w:rPr>
             </w:pPr>
-            <w:proofErr w:type="gramStart"/>
             <w:r>
               <w:rPr>
                 <w:rFonts w:ascii="Times New Roman" w:hAnsi="Times New Roman" w:cs="Times New Roman"/>
@@ -5070,17 +4286,7 @@
                 <w:sz w:val="24"/>
                 <w:szCs w:val="24"/>
               </w:rPr>
-              <w:t>Understand</w:t>
-            </w:r>
-            <w:proofErr w:type="gramEnd"/>
-            <w:r>
-              <w:rPr>
-                <w:rFonts w:ascii="Times New Roman" w:hAnsi="Times New Roman" w:cs="Times New Roman"/>
-                <w:color w:val="auto"/>
-                <w:sz w:val="24"/>
-                <w:szCs w:val="24"/>
-              </w:rPr>
-              <w:t xml:space="preserve"> IoT architecture</w:t>
+              <w:t>Understand IoT architecture</w:t>
             </w:r>
           </w:p>
         </w:tc>
@@ -5679,6 +4885,7 @@
                 <w:sz w:val="24"/>
                 <w:szCs w:val="24"/>
               </w:rPr>
+              <w:lastRenderedPageBreak/>
               <w:t>3. MQTT / 21 Sep</w:t>
             </w:r>
           </w:p>
@@ -5699,7 +4906,6 @@
                 <w:szCs w:val="24"/>
               </w:rPr>
             </w:pPr>
-            <w:proofErr w:type="spellStart"/>
             <w:r>
               <w:rPr>
                 <w:rFonts w:ascii="Times New Roman" w:hAnsi="Times New Roman" w:cs="Times New Roman"/>
@@ -5707,17 +4913,7 @@
                 <w:sz w:val="24"/>
                 <w:szCs w:val="24"/>
               </w:rPr>
-              <w:t>src</w:t>
-            </w:r>
-            <w:proofErr w:type="spellEnd"/>
-            <w:r>
-              <w:rPr>
-                <w:rFonts w:ascii="Times New Roman" w:hAnsi="Times New Roman" w:cs="Times New Roman"/>
-                <w:color w:val="auto"/>
-                <w:sz w:val="24"/>
-                <w:szCs w:val="24"/>
-              </w:rPr>
-              <w:t>/publisher.py, src/subscriber.py and samples/subscriber_run.log. Retained transmission output matches 20 stored rows; no new network run in this review.</w:t>
+              <w:t>src/publisher.py, src/subscriber.py and samples/subscriber_run.log. Retained transmission output matches 20 stored rows; no new network run in this review.</w:t>
             </w:r>
           </w:p>
         </w:tc>
@@ -5917,7 +5113,6 @@
                 <w:sz w:val="24"/>
                 <w:szCs w:val="24"/>
               </w:rPr>
-              <w:lastRenderedPageBreak/>
               <w:t>7. Presentation / 28 Sep</w:t>
             </w:r>
           </w:p>
@@ -5988,35 +5183,7 @@
         <w:rPr>
           <w:rFonts w:ascii="Times New Roman" w:hAnsi="Times New Roman" w:cs="Times New Roman"/>
         </w:rPr>
-        <w:t xml:space="preserve">Input validation is now enforced before insertion for numeric, finite and physically valid measurements. Zone </w:t>
-      </w:r>
-      <w:proofErr w:type="spellStart"/>
-      <w:r>
-        <w:rPr>
-          <w:rFonts w:ascii="Times New Roman" w:hAnsi="Times New Roman" w:cs="Times New Roman"/>
-        </w:rPr>
-        <w:t>alert_flag</w:t>
-      </w:r>
-      <w:proofErr w:type="spellEnd"/>
-      <w:r>
-        <w:rPr>
-          <w:rFonts w:ascii="Times New Roman" w:hAnsi="Times New Roman" w:cs="Times New Roman"/>
-        </w:rPr>
-        <w:t xml:space="preserve"> and </w:t>
-      </w:r>
-      <w:proofErr w:type="spellStart"/>
-      <w:r>
-        <w:rPr>
-          <w:rFonts w:ascii="Times New Roman" w:hAnsi="Times New Roman" w:cs="Times New Roman"/>
-        </w:rPr>
-        <w:t>alert_reason</w:t>
-      </w:r>
-      <w:proofErr w:type="spellEnd"/>
-      <w:r>
-        <w:rPr>
-          <w:rFonts w:ascii="Times New Roman" w:hAnsi="Times New Roman" w:cs="Times New Roman"/>
-        </w:rPr>
-        <w:t xml:space="preserve"> are recomputed from configured crop thresholds at write time. The active database was normalized and has no inconsistent alert flag/reason pairs.</w:t>
+        <w:t>Input validation is now enforced before insertion for numeric, finite and physically valid measurements. Zone alert_flag and alert_reason are recomputed from configured crop thresholds at write time. The active database was normalized and has no inconsistent alert flag/reason pairs.</w:t>
       </w:r>
     </w:p>
     <w:p>
@@ -6034,21 +5201,7 @@
         <w:rPr>
           <w:rFonts w:ascii="Times New Roman" w:hAnsi="Times New Roman" w:cs="Times New Roman"/>
         </w:rPr>
-        <w:t xml:space="preserve">Section 9 provides the current application review and screenshots. The earlier </w:t>
-      </w:r>
-      <w:proofErr w:type="gramStart"/>
-      <w:r>
-        <w:rPr>
-          <w:rFonts w:ascii="Times New Roman" w:hAnsi="Times New Roman" w:cs="Times New Roman"/>
-        </w:rPr>
-        <w:t>single-device</w:t>
-      </w:r>
-      <w:proofErr w:type="gramEnd"/>
-      <w:r>
-        <w:rPr>
-          <w:rFonts w:ascii="Times New Roman" w:hAnsi="Times New Roman" w:cs="Times New Roman"/>
-        </w:rPr>
-        <w:t xml:space="preserve"> counts and static figures are retained as historical evidence; they are not the current multi-zone dashboard totals. Supporting slides and interpretation files should identify their dataset and distinguish simulated from physical readings.</w:t>
+        <w:t>Section 9 provides the current application review and screenshots. The earlier single-device counts and static figures are retained as historical evidence; they are not the current multi-zone dashboard totals. Supporting slides and interpretation files should identify their dataset and distinguish simulated from physical readings.</w:t>
       </w:r>
     </w:p>
     <w:p>
@@ -6170,30 +5323,6 @@
     </w:p>
     <w:p>
       <w:pPr>
-        <w:spacing w:line="276" w:lineRule="auto"/>
-        <w:jc w:val="both"/>
-        <w:rPr>
-          <w:rFonts w:ascii="Times New Roman" w:hAnsi="Times New Roman" w:cs="Times New Roman"/>
-          <w:color w:val="auto"/>
-          <w:sz w:val="24"/>
-          <w:szCs w:val="24"/>
-        </w:rPr>
-      </w:pPr>
-    </w:p>
-    <w:p>
-      <w:pPr>
-        <w:spacing w:line="276" w:lineRule="auto"/>
-        <w:jc w:val="both"/>
-        <w:rPr>
-          <w:rFonts w:ascii="Times New Roman" w:hAnsi="Times New Roman" w:cs="Times New Roman"/>
-          <w:color w:val="auto"/>
-          <w:sz w:val="24"/>
-          <w:szCs w:val="24"/>
-        </w:rPr>
-      </w:pPr>
-    </w:p>
-    <w:p>
-      <w:pPr>
         <w:pStyle w:val="Heading1"/>
         <w:spacing w:line="276" w:lineRule="auto"/>
         <w:jc w:val="both"/>
@@ -6211,6 +5340,7 @@
           <w:sz w:val="24"/>
           <w:szCs w:val="24"/>
         </w:rPr>
+        <w:lastRenderedPageBreak/>
         <w:t>8. Verification record and demonstration guide</w:t>
       </w:r>
     </w:p>
@@ -6382,7 +5512,6 @@
                 <w:sz w:val="24"/>
                 <w:szCs w:val="24"/>
               </w:rPr>
-              <w:lastRenderedPageBreak/>
               <w:t>Data integrity and consistency</w:t>
             </w:r>
           </w:p>
@@ -6705,47 +5834,7 @@
                 <w:sz w:val="24"/>
                 <w:szCs w:val="24"/>
               </w:rPr>
-              <w:t xml:space="preserve">20 payloads match stored rows. </w:t>
-            </w:r>
-            <w:proofErr w:type="gramStart"/>
-            <w:r>
-              <w:rPr>
-                <w:rFonts w:ascii="Times New Roman" w:hAnsi="Times New Roman" w:cs="Times New Roman"/>
-                <w:color w:val="auto"/>
-                <w:sz w:val="24"/>
-                <w:szCs w:val="24"/>
-              </w:rPr>
-              <w:t>A fresh</w:t>
-            </w:r>
-            <w:proofErr w:type="gramEnd"/>
-            <w:r>
-              <w:rPr>
-                <w:rFonts w:ascii="Times New Roman" w:hAnsi="Times New Roman" w:cs="Times New Roman"/>
-                <w:color w:val="auto"/>
-                <w:sz w:val="24"/>
-                <w:szCs w:val="24"/>
-              </w:rPr>
-              <w:t xml:space="preserve"> </w:t>
-            </w:r>
-            <w:proofErr w:type="spellStart"/>
-            <w:r>
-              <w:rPr>
-                <w:rFonts w:ascii="Times New Roman" w:hAnsi="Times New Roman" w:cs="Times New Roman"/>
-                <w:color w:val="auto"/>
-                <w:sz w:val="24"/>
-                <w:szCs w:val="24"/>
-              </w:rPr>
-              <w:t>HiveMQ</w:t>
-            </w:r>
-            <w:proofErr w:type="spellEnd"/>
-            <w:r>
-              <w:rPr>
-                <w:rFonts w:ascii="Times New Roman" w:hAnsi="Times New Roman" w:cs="Times New Roman"/>
-                <w:color w:val="auto"/>
-                <w:sz w:val="24"/>
-                <w:szCs w:val="24"/>
-              </w:rPr>
-              <w:t xml:space="preserve"> round trip was not run.</w:t>
+              <w:t>20 payloads match stored rows. A fresh HiveMQ round trip was not run.</w:t>
             </w:r>
           </w:p>
         </w:tc>
@@ -6809,27 +5898,7 @@
           <w:sz w:val="24"/>
           <w:szCs w:val="24"/>
         </w:rPr>
-        <w:t>.</w:t>
-      </w:r>
-      <w:proofErr w:type="spellStart"/>
-      <w:r>
-        <w:rPr>
-          <w:rFonts w:ascii="Times New Roman" w:hAnsi="Times New Roman" w:cs="Times New Roman"/>
-          <w:color w:val="auto"/>
-          <w:sz w:val="24"/>
-          <w:szCs w:val="24"/>
-        </w:rPr>
-        <w:t>venv</w:t>
-      </w:r>
-      <w:proofErr w:type="spellEnd"/>
-      <w:r>
-        <w:rPr>
-          <w:rFonts w:ascii="Times New Roman" w:hAnsi="Times New Roman" w:cs="Times New Roman"/>
-          <w:color w:val="auto"/>
-          <w:sz w:val="24"/>
-          <w:szCs w:val="24"/>
-        </w:rPr>
-        <w:t>\Scripts\python.exe src/db.py</w:t>
+        <w:t>.venv\Scripts\python.exe src/db.py</w:t>
       </w:r>
       <w:r>
         <w:rPr>
@@ -6849,27 +5918,7 @@
           <w:szCs w:val="24"/>
         </w:rPr>
         <w:br/>
-        <w:t>.</w:t>
-      </w:r>
-      <w:proofErr w:type="spellStart"/>
-      <w:r>
-        <w:rPr>
-          <w:rFonts w:ascii="Times New Roman" w:hAnsi="Times New Roman" w:cs="Times New Roman"/>
-          <w:color w:val="auto"/>
-          <w:sz w:val="24"/>
-          <w:szCs w:val="24"/>
-        </w:rPr>
-        <w:t>venv</w:t>
-      </w:r>
-      <w:proofErr w:type="spellEnd"/>
-      <w:r>
-        <w:rPr>
-          <w:rFonts w:ascii="Times New Roman" w:hAnsi="Times New Roman" w:cs="Times New Roman"/>
-          <w:color w:val="auto"/>
-          <w:sz w:val="24"/>
-          <w:szCs w:val="24"/>
-        </w:rPr>
-        <w:t>\Scripts\python.exe src/subscriber.py</w:t>
+        <w:t>.venv\Scripts\python.exe src/subscriber.py</w:t>
       </w:r>
       <w:r>
         <w:rPr>
@@ -6889,27 +5938,7 @@
           <w:szCs w:val="24"/>
         </w:rPr>
         <w:br/>
-        <w:t>.</w:t>
-      </w:r>
-      <w:proofErr w:type="spellStart"/>
-      <w:r>
-        <w:rPr>
-          <w:rFonts w:ascii="Times New Roman" w:hAnsi="Times New Roman" w:cs="Times New Roman"/>
-          <w:color w:val="auto"/>
-          <w:sz w:val="24"/>
-          <w:szCs w:val="24"/>
-        </w:rPr>
-        <w:t>venv</w:t>
-      </w:r>
-      <w:proofErr w:type="spellEnd"/>
-      <w:r>
-        <w:rPr>
-          <w:rFonts w:ascii="Times New Roman" w:hAnsi="Times New Roman" w:cs="Times New Roman"/>
-          <w:color w:val="auto"/>
-          <w:sz w:val="24"/>
-          <w:szCs w:val="24"/>
-        </w:rPr>
-        <w:t>\Scripts\python.exe src/publisher.py --count 20 --interval 2</w:t>
+        <w:t>.venv\Scripts\python.exe src/publisher.py --count 20 --interval 2</w:t>
       </w:r>
       <w:r>
         <w:rPr>
@@ -6919,27 +5948,7 @@
           <w:szCs w:val="24"/>
         </w:rPr>
         <w:br/>
-        <w:t>.</w:t>
-      </w:r>
-      <w:proofErr w:type="spellStart"/>
-      <w:r>
-        <w:rPr>
-          <w:rFonts w:ascii="Times New Roman" w:hAnsi="Times New Roman" w:cs="Times New Roman"/>
-          <w:color w:val="auto"/>
-          <w:sz w:val="24"/>
-          <w:szCs w:val="24"/>
-        </w:rPr>
-        <w:t>venv</w:t>
-      </w:r>
-      <w:proofErr w:type="spellEnd"/>
-      <w:r>
-        <w:rPr>
-          <w:rFonts w:ascii="Times New Roman" w:hAnsi="Times New Roman" w:cs="Times New Roman"/>
-          <w:color w:val="auto"/>
-          <w:sz w:val="24"/>
-          <w:szCs w:val="24"/>
-        </w:rPr>
-        <w:t>\Scripts\python.exe src/db.py</w:t>
+        <w:t>.venv\Scripts\python.exe src/db.py</w:t>
       </w:r>
       <w:r>
         <w:rPr>
@@ -6949,27 +5958,7 @@
           <w:szCs w:val="24"/>
         </w:rPr>
         <w:br/>
-        <w:t>.</w:t>
-      </w:r>
-      <w:proofErr w:type="spellStart"/>
-      <w:r>
-        <w:rPr>
-          <w:rFonts w:ascii="Times New Roman" w:hAnsi="Times New Roman" w:cs="Times New Roman"/>
-          <w:color w:val="auto"/>
-          <w:sz w:val="24"/>
-          <w:szCs w:val="24"/>
-        </w:rPr>
-        <w:t>venv</w:t>
-      </w:r>
-      <w:proofErr w:type="spellEnd"/>
-      <w:r>
-        <w:rPr>
-          <w:rFonts w:ascii="Times New Roman" w:hAnsi="Times New Roman" w:cs="Times New Roman"/>
-          <w:color w:val="auto"/>
-          <w:sz w:val="24"/>
-          <w:szCs w:val="24"/>
-        </w:rPr>
-        <w:t>\Scripts\python.exe src/export_csv.py</w:t>
+        <w:t>.venv\Scripts\python.exe src/export_csv.py</w:t>
       </w:r>
       <w:r>
         <w:rPr>
@@ -6979,27 +5968,7 @@
           <w:szCs w:val="24"/>
         </w:rPr>
         <w:br/>
-        <w:t>.</w:t>
-      </w:r>
-      <w:proofErr w:type="spellStart"/>
-      <w:r>
-        <w:rPr>
-          <w:rFonts w:ascii="Times New Roman" w:hAnsi="Times New Roman" w:cs="Times New Roman"/>
-          <w:color w:val="auto"/>
-          <w:sz w:val="24"/>
-          <w:szCs w:val="24"/>
-        </w:rPr>
-        <w:t>venv</w:t>
-      </w:r>
-      <w:proofErr w:type="spellEnd"/>
-      <w:r>
-        <w:rPr>
-          <w:rFonts w:ascii="Times New Roman" w:hAnsi="Times New Roman" w:cs="Times New Roman"/>
-          <w:color w:val="auto"/>
-          <w:sz w:val="24"/>
-          <w:szCs w:val="24"/>
-        </w:rPr>
-        <w:t>\Scripts\python.exe src/visualize.py</w:t>
+        <w:t>.venv\Scripts\python.exe src/visualize.py</w:t>
       </w:r>
       <w:r>
         <w:rPr>
@@ -7009,47 +5978,7 @@
           <w:szCs w:val="24"/>
         </w:rPr>
         <w:br/>
-        <w:t>.</w:t>
-      </w:r>
-      <w:proofErr w:type="spellStart"/>
-      <w:r>
-        <w:rPr>
-          <w:rFonts w:ascii="Times New Roman" w:hAnsi="Times New Roman" w:cs="Times New Roman"/>
-          <w:color w:val="auto"/>
-          <w:sz w:val="24"/>
-          <w:szCs w:val="24"/>
-        </w:rPr>
-        <w:t>venv</w:t>
-      </w:r>
-      <w:proofErr w:type="spellEnd"/>
-      <w:r>
-        <w:rPr>
-          <w:rFonts w:ascii="Times New Roman" w:hAnsi="Times New Roman" w:cs="Times New Roman"/>
-          <w:color w:val="auto"/>
-          <w:sz w:val="24"/>
-          <w:szCs w:val="24"/>
-        </w:rPr>
-        <w:t xml:space="preserve">\Scripts\python.exe -m </w:t>
-      </w:r>
-      <w:proofErr w:type="spellStart"/>
-      <w:r>
-        <w:rPr>
-          <w:rFonts w:ascii="Times New Roman" w:hAnsi="Times New Roman" w:cs="Times New Roman"/>
-          <w:color w:val="auto"/>
-          <w:sz w:val="24"/>
-          <w:szCs w:val="24"/>
-        </w:rPr>
-        <w:t>streamlit</w:t>
-      </w:r>
-      <w:proofErr w:type="spellEnd"/>
-      <w:r>
-        <w:rPr>
-          <w:rFonts w:ascii="Times New Roman" w:hAnsi="Times New Roman" w:cs="Times New Roman"/>
-          <w:color w:val="auto"/>
-          <w:sz w:val="24"/>
-          <w:szCs w:val="24"/>
-        </w:rPr>
-        <w:t xml:space="preserve"> run src/dashboard.py</w:t>
+        <w:t>.venv\Scripts\python.exe -m streamlit run src/dashboard.py</w:t>
       </w:r>
     </w:p>
     <w:p>
@@ -7092,6 +6021,7 @@
           <w:sz w:val="24"/>
           <w:szCs w:val="24"/>
         </w:rPr>
+        <w:lastRenderedPageBreak/>
         <w:t>Conclusion</w:t>
       </w:r>
     </w:p>
@@ -7106,7 +6036,6 @@
           <w:szCs w:val="24"/>
         </w:rPr>
       </w:pPr>
-      <w:proofErr w:type="spellStart"/>
       <w:r>
         <w:rPr>
           <w:rFonts w:ascii="Times New Roman" w:hAnsi="Times New Roman" w:cs="Times New Roman"/>
@@ -7114,27 +6043,7 @@
           <w:sz w:val="24"/>
           <w:szCs w:val="24"/>
         </w:rPr>
-        <w:t>GreenHouseWatch</w:t>
-      </w:r>
-      <w:proofErr w:type="spellEnd"/>
-      <w:r>
-        <w:rPr>
-          <w:rFonts w:ascii="Times New Roman" w:hAnsi="Times New Roman" w:cs="Times New Roman"/>
-          <w:color w:val="auto"/>
-          <w:sz w:val="24"/>
-          <w:szCs w:val="24"/>
-        </w:rPr>
-        <w:t xml:space="preserve"> satisfies the central educational design: simulated sensor data can be transmitted, stored locally and visualized with free tools. The first-delivery artifacts are present, and the current dataset is internally consistent. The project should be described as implemented </w:t>
-      </w:r>
-      <w:r>
-        <w:rPr>
-          <w:rFonts w:ascii="Times New Roman" w:hAnsi="Times New Roman" w:cs="Times New Roman"/>
-          <w:color w:val="auto"/>
-          <w:sz w:val="24"/>
-          <w:szCs w:val="24"/>
-        </w:rPr>
-        <w:lastRenderedPageBreak/>
-        <w:t>with outstanding validation and submission corrections, rather than fully complete or error-free. This report records the checks and remaining work; it does not certify an instructor grade, submission timing or completion of the final presentation.</w:t>
+        <w:t>GreenHouseWatch satisfies the central educational design: simulated sensor data can be transmitted, stored locally and visualized with free tools. The first-delivery artifacts are present, and the current dataset is internally consistent. The project should be described as implemented with outstanding validation and submission corrections, rather than fully complete or error-free. This report records the checks and remaining work; it does not certify an instructor grade, submission timing or completion of the final presentation.</w:t>
       </w:r>
     </w:p>
     <w:p>
@@ -7156,27 +6065,7 @@
           <w:sz w:val="24"/>
           <w:szCs w:val="24"/>
         </w:rPr>
-        <w:t xml:space="preserve">Verification logs and structured results are retained under </w:t>
-      </w:r>
-      <w:proofErr w:type="spellStart"/>
-      <w:r>
-        <w:rPr>
-          <w:rFonts w:ascii="Times New Roman" w:hAnsi="Times New Roman" w:cs="Times New Roman"/>
-          <w:color w:val="auto"/>
-          <w:sz w:val="24"/>
-          <w:szCs w:val="24"/>
-        </w:rPr>
-        <w:t>tmp</w:t>
-      </w:r>
-      <w:proofErr w:type="spellEnd"/>
-      <w:r>
-        <w:rPr>
-          <w:rFonts w:ascii="Times New Roman" w:hAnsi="Times New Roman" w:cs="Times New Roman"/>
-          <w:color w:val="auto"/>
-          <w:sz w:val="24"/>
-          <w:szCs w:val="24"/>
-        </w:rPr>
-        <w:t xml:space="preserve">/delivery. </w:t>
+        <w:t xml:space="preserve">Verification logs and structured results are retained under tmp/delivery. </w:t>
       </w:r>
     </w:p>
     <w:p>
@@ -7303,27 +6192,7 @@
           <w:sz w:val="24"/>
           <w:szCs w:val="24"/>
         </w:rPr>
-        <w:t xml:space="preserve">Gaps and missing values: gaps longer than 20 minutes remain disconnected, including after display sampling. Missing values in one metric no longer </w:t>
-      </w:r>
-      <w:proofErr w:type="gramStart"/>
-      <w:r>
-        <w:rPr>
-          <w:rFonts w:ascii="Times New Roman" w:hAnsi="Times New Roman" w:cs="Times New Roman"/>
-          <w:color w:val="auto"/>
-          <w:sz w:val="24"/>
-          <w:szCs w:val="24"/>
-        </w:rPr>
-        <w:t>suppress</w:t>
-      </w:r>
-      <w:proofErr w:type="gramEnd"/>
-      <w:r>
-        <w:rPr>
-          <w:rFonts w:ascii="Times New Roman" w:hAnsi="Times New Roman" w:cs="Times New Roman"/>
-          <w:color w:val="auto"/>
-          <w:sz w:val="24"/>
-          <w:szCs w:val="24"/>
-        </w:rPr>
-        <w:t xml:space="preserve"> valid values in another.</w:t>
+        <w:t>Gaps and missing values: gaps longer than 20 minutes remain disconnected, including after display sampling. Missing values in one metric no longer suppress valid values in another.</w:t>
       </w:r>
     </w:p>
     <w:p>
@@ -7447,27 +6316,7 @@
           <w:sz w:val="24"/>
           <w:szCs w:val="24"/>
         </w:rPr>
-        <w:t xml:space="preserve">Remaining interpretation limits: aggregate target bands show the intersection of configured zone ranges and cannot certify each zone as healthy. Overview may display last-known values when sources are stale. Analytics summary averages weight records, while </w:t>
-      </w:r>
-      <w:proofErr w:type="gramStart"/>
-      <w:r>
-        <w:rPr>
-          <w:rFonts w:ascii="Times New Roman" w:hAnsi="Times New Roman" w:cs="Times New Roman"/>
-          <w:color w:val="auto"/>
-          <w:sz w:val="24"/>
-          <w:szCs w:val="24"/>
-        </w:rPr>
-        <w:t>Overall</w:t>
-      </w:r>
-      <w:proofErr w:type="gramEnd"/>
-      <w:r>
-        <w:rPr>
-          <w:rFonts w:ascii="Times New Roman" w:hAnsi="Times New Roman" w:cs="Times New Roman"/>
-          <w:color w:val="auto"/>
-          <w:sz w:val="24"/>
-          <w:szCs w:val="24"/>
-        </w:rPr>
-        <w:t xml:space="preserve"> average charts weight reporting zones within five-minute bins. The five-day outdoor forecast is separate from indoor telemetry.</w:t>
+        <w:t>Remaining interpretation limits: aggregate target bands show the intersection of configured zone ranges and cannot certify each zone as healthy. Overview may display last-known values when sources are stale. Analytics summary averages weight records, while Overall average charts weight reporting zones within five-minute bins. The five-day outdoor forecast is separate from indoor telemetry.</w:t>
       </w:r>
     </w:p>
     <w:p>
@@ -7529,7 +6378,7 @@
                     <pic:cNvPicPr/>
                   </pic:nvPicPr>
                   <pic:blipFill>
-                    <a:blip r:embed="rId11"/>
+                    <a:blip r:embed="rId14"/>
                     <a:stretch>
                       <a:fillRect/>
                     </a:stretch>
@@ -7652,7 +6501,7 @@
                     <pic:cNvPicPr/>
                   </pic:nvPicPr>
                   <pic:blipFill>
-                    <a:blip r:embed="rId12"/>
+                    <a:blip r:embed="rId15"/>
                     <a:stretch>
                       <a:fillRect/>
                     </a:stretch>
@@ -7795,7 +6644,7 @@
                     <pic:cNvPicPr/>
                   </pic:nvPicPr>
                   <pic:blipFill>
-                    <a:blip r:embed="rId13"/>
+                    <a:blip r:embed="rId16"/>
                     <a:stretch>
                       <a:fillRect/>
                     </a:stretch>
@@ -7938,7 +6787,7 @@
                     <pic:cNvPicPr/>
                   </pic:nvPicPr>
                   <pic:blipFill>
-                    <a:blip r:embed="rId14"/>
+                    <a:blip r:embed="rId17"/>
                     <a:stretch>
                       <a:fillRect/>
                     </a:stretch>
@@ -7999,27 +6848,7 @@
           <w:sz w:val="24"/>
           <w:szCs w:val="24"/>
         </w:rPr>
-        <w:t xml:space="preserve">The directory includes Tomato, Lettuce, Cucumber, Carrot, Corn, Onion, Watermelon and Seedling zones. Stale readings remain historical evidence. Optional </w:t>
-      </w:r>
-      <w:proofErr w:type="gramStart"/>
-      <w:r>
-        <w:rPr>
-          <w:rFonts w:ascii="Times New Roman" w:hAnsi="Times New Roman" w:cs="Times New Roman"/>
-          <w:color w:val="auto"/>
-          <w:sz w:val="24"/>
-          <w:szCs w:val="24"/>
-        </w:rPr>
-        <w:t>nutrient</w:t>
-      </w:r>
-      <w:proofErr w:type="gramEnd"/>
-      <w:r>
-        <w:rPr>
-          <w:rFonts w:ascii="Times New Roman" w:hAnsi="Times New Roman" w:cs="Times New Roman"/>
-          <w:color w:val="auto"/>
-          <w:sz w:val="24"/>
-          <w:szCs w:val="24"/>
-        </w:rPr>
-        <w:t xml:space="preserve"> and pH values are not available in every stored message.</w:t>
+        <w:t>The directory includes Tomato, Lettuce, Cucumber, Carrot, Corn, Onion, Watermelon and Seedling zones. Stale readings remain historical evidence. Optional nutrient and pH values are not available in every stored message.</w:t>
       </w:r>
     </w:p>
     <w:p>
@@ -8081,7 +6910,7 @@
                     <pic:cNvPicPr/>
                   </pic:nvPicPr>
                   <pic:blipFill>
-                    <a:blip r:embed="rId15"/>
+                    <a:blip r:embed="rId18"/>
                     <a:stretch>
                       <a:fillRect/>
                     </a:stretch>
@@ -8142,27 +6971,7 @@
           <w:sz w:val="24"/>
           <w:szCs w:val="24"/>
         </w:rPr>
-        <w:t xml:space="preserve">Outdoor weather is provided by </w:t>
-      </w:r>
-      <w:proofErr w:type="spellStart"/>
-      <w:r>
-        <w:rPr>
-          <w:rFonts w:ascii="Times New Roman" w:hAnsi="Times New Roman" w:cs="Times New Roman"/>
-          <w:color w:val="auto"/>
-          <w:sz w:val="24"/>
-          <w:szCs w:val="24"/>
-        </w:rPr>
-        <w:t>OpenWeatherMap</w:t>
-      </w:r>
-      <w:proofErr w:type="spellEnd"/>
-      <w:r>
-        <w:rPr>
-          <w:rFonts w:ascii="Times New Roman" w:hAnsi="Times New Roman" w:cs="Times New Roman"/>
-          <w:color w:val="auto"/>
-          <w:sz w:val="24"/>
-          <w:szCs w:val="24"/>
-        </w:rPr>
-        <w:t>. Indoor values elsewhere in this application originate from the repository and were simulated in this review. Forecast recommendations do not actuate hardware.</w:t>
+        <w:t>Outdoor weather is provided by OpenWeatherMap. Indoor values elsewhere in this application originate from the repository and were simulated in this review. Forecast recommendations do not actuate hardware.</w:t>
       </w:r>
     </w:p>
     <w:p>
@@ -8224,7 +7033,7 @@
                     <pic:cNvPicPr/>
                   </pic:nvPicPr>
                   <pic:blipFill>
-                    <a:blip r:embed="rId16"/>
+                    <a:blip r:embed="rId19"/>
                     <a:stretch>
                       <a:fillRect/>
                     </a:stretch>
@@ -8264,27 +7073,7 @@
           <w:sz w:val="24"/>
           <w:szCs w:val="24"/>
         </w:rPr>
-        <w:t xml:space="preserve">Figure 12. </w:t>
-      </w:r>
-      <w:proofErr w:type="gramStart"/>
-      <w:r>
-        <w:rPr>
-          <w:rFonts w:ascii="Times New Roman" w:hAnsi="Times New Roman" w:cs="Times New Roman"/>
-          <w:color w:val="auto"/>
-          <w:sz w:val="24"/>
-          <w:szCs w:val="24"/>
-        </w:rPr>
-        <w:t>Controls page</w:t>
-      </w:r>
-      <w:proofErr w:type="gramEnd"/>
-      <w:r>
-        <w:rPr>
-          <w:rFonts w:ascii="Times New Roman" w:hAnsi="Times New Roman" w:cs="Times New Roman"/>
-          <w:color w:val="auto"/>
-          <w:sz w:val="24"/>
-          <w:szCs w:val="24"/>
-        </w:rPr>
-        <w:t xml:space="preserve"> explicitly identifies the absence of a physical controller. No request was submitted during review.</w:t>
+        <w:t>Figure 12. Controls page explicitly identifies the absence of a physical controller. No request was submitted during review.</w:t>
       </w:r>
     </w:p>
     <w:p>
@@ -8323,7 +7112,7 @@
                     <pic:cNvPicPr/>
                   </pic:nvPicPr>
                   <pic:blipFill>
-                    <a:blip r:embed="rId17"/>
+                    <a:blip r:embed="rId20"/>
                     <a:stretch>
                       <a:fillRect/>
                     </a:stretch>
@@ -8384,32 +7173,12 @@
           <w:sz w:val="24"/>
           <w:szCs w:val="24"/>
         </w:rPr>
-        <w:t xml:space="preserve">Evidence files: outputs/current-application/. Verification: tests/test_chart_review.py and the complete 26-test suite. The pre-edit report is preserved under </w:t>
-      </w:r>
-      <w:proofErr w:type="spellStart"/>
-      <w:r>
-        <w:rPr>
-          <w:rFonts w:ascii="Times New Roman" w:hAnsi="Times New Roman" w:cs="Times New Roman"/>
-          <w:color w:val="auto"/>
-          <w:sz w:val="24"/>
-          <w:szCs w:val="24"/>
-        </w:rPr>
-        <w:t>tmp</w:t>
-      </w:r>
-      <w:proofErr w:type="spellEnd"/>
-      <w:r>
-        <w:rPr>
-          <w:rFonts w:ascii="Times New Roman" w:hAnsi="Times New Roman" w:cs="Times New Roman"/>
-          <w:color w:val="auto"/>
-          <w:sz w:val="24"/>
-          <w:szCs w:val="24"/>
-        </w:rPr>
-        <w:t>/finalProject-before-chart-review-20260922.docx.</w:t>
+        <w:t>Evidence files: outputs/current-application/. Verification: tests/test_chart_review.py and the complete 26-test suite. The pre-edit report is preserved under tmp/finalProject-before-chart-review-20260922.docx.</w:t>
       </w:r>
     </w:p>
     <w:sectPr>
-      <w:headerReference w:type="default" r:id="rId18"/>
-      <w:footerReference w:type="default" r:id="rId19"/>
+      <w:headerReference w:type="default" r:id="rId21"/>
+      <w:footerReference w:type="default" r:id="rId22"/>
       <w:pgSz w:w="12240" w:h="15840"/>
       <w:pgMar w:top="1440" w:right="1440" w:bottom="1440" w:left="1440" w:header="708" w:footer="708" w:gutter="0"/>
       <w:pgNumType w:start="0"/>
@@ -8454,15 +7223,7 @@
       <w:jc w:val="right"/>
     </w:pPr>
     <w:r>
-      <w:t xml:space="preserve">Review: 22 September </w:t>
-    </w:r>
-    <w:proofErr w:type="gramStart"/>
-    <w:r>
-      <w:t>2026  |</w:t>
-    </w:r>
-    <w:proofErr w:type="gramEnd"/>
-    <w:r>
-      <w:t xml:space="preserve">  </w:t>
+      <w:t xml:space="preserve">Review: 22 September 2026  |  </w:t>
     </w:r>
     <w:r>
       <w:rPr>
@@ -8509,37 +7270,12 @@
         <w:szCs w:val="18"/>
       </w:rPr>
     </w:pPr>
-    <w:proofErr w:type="gramStart"/>
     <w:r>
       <w:rPr>
         <w:rFonts w:ascii="Times New Roman" w:hAnsi="Times New Roman" w:cs="Times New Roman"/>
         <w:szCs w:val="18"/>
       </w:rPr>
-      <w:t>GREENHOUSEWATCH  |</w:t>
-    </w:r>
-    <w:proofErr w:type="gramEnd"/>
-    <w:r>
-      <w:rPr>
-        <w:rFonts w:ascii="Times New Roman" w:hAnsi="Times New Roman" w:cs="Times New Roman"/>
-        <w:szCs w:val="18"/>
-      </w:rPr>
-      <w:t xml:space="preserve">  CTEC </w:t>
-    </w:r>
-    <w:proofErr w:type="gramStart"/>
-    <w:r>
-      <w:rPr>
-        <w:rFonts w:ascii="Times New Roman" w:hAnsi="Times New Roman" w:cs="Times New Roman"/>
-        <w:szCs w:val="18"/>
-      </w:rPr>
-      <w:t>651  |</w:t>
-    </w:r>
-    <w:proofErr w:type="gramEnd"/>
-    <w:r>
-      <w:rPr>
-        <w:rFonts w:ascii="Times New Roman" w:hAnsi="Times New Roman" w:cs="Times New Roman"/>
-        <w:szCs w:val="18"/>
-      </w:rPr>
-      <w:t xml:space="preserve">  PROJECT DELIVERY</w:t>
+      <w:t>GREENHOUSEWATCH  |  CTEC 651  |  PROJECT DELIVERY</w:t>
     </w:r>
   </w:p>
 </w:hdr>

</xml_diff>